<commit_message>
Inclusão de toogle para cpf e cnpj com máscaras
</commit_message>
<xml_diff>
--- a/planejamento/planejamento.docx
+++ b/planejamento/planejamento.docx
@@ -981,12 +981,21 @@
       <w:r>
         <w:t xml:space="preserve"> No contrato de compra e venda, adicione um "Checklist de Estado": </w:t>
       </w:r>
+      <w:proofErr w:type="gramStart"/>
       <w:r>
         <w:rPr>
           <w:i/>
           <w:iCs/>
         </w:rPr>
-        <w:t>( ) Motor funcionando, ( ) Pintura com riscos, ( ) Sem garantia.</w:t>
+        <w:t>( )</w:t>
+      </w:r>
+      <w:proofErr w:type="gramEnd"/>
+      <w:r>
+        <w:rPr>
+          <w:i/>
+          <w:iCs/>
+        </w:rPr>
+        <w:t xml:space="preserve"> Motor funcionando, ( ) Pintura com riscos, ( ) Sem garantia.</w:t>
       </w:r>
     </w:p>
     <w:p>
@@ -1292,7 +1301,23 @@
                 <w:b/>
                 <w:bCs/>
               </w:rPr>
-              <w:t>Domínio (.com.br)</w:t>
+              <w:t xml:space="preserve">Domínio </w:t>
+            </w:r>
+            <w:proofErr w:type="gramStart"/>
+            <w:r>
+              <w:rPr>
+                <w:b/>
+                <w:bCs/>
+              </w:rPr>
+              <w:t>(.com.br</w:t>
+            </w:r>
+            <w:proofErr w:type="gramEnd"/>
+            <w:r>
+              <w:rPr>
+                <w:b/>
+                <w:bCs/>
+              </w:rPr>
+              <w:t>)</w:t>
             </w:r>
           </w:p>
         </w:tc>
@@ -3118,7 +3143,7 @@
           <w14:ligatures w14:val="none"/>
         </w:rPr>
         <w:pict w14:anchorId="5479E0CF">
-          <v:rect id="_x0000_i1029" style="width:0;height:1.5pt" o:hralign="center" o:hrstd="t" o:hr="t" fillcolor="#a0a0a0" stroked="f"/>
+          <v:rect id="_x0000_i1027" style="width:0;height:1.5pt" o:hralign="center" o:hrstd="t" o:hr="t" fillcolor="#a0a0a0" stroked="f"/>
         </w:pict>
       </w:r>
     </w:p>
@@ -3323,7 +3348,7 @@
           <w14:ligatures w14:val="none"/>
         </w:rPr>
         <w:pict w14:anchorId="62B25823">
-          <v:rect id="_x0000_i1030" style="width:0;height:1.5pt" o:hralign="center" o:hrstd="t" o:hr="t" fillcolor="#a0a0a0" stroked="f"/>
+          <v:rect id="_x0000_i1028" style="width:0;height:1.5pt" o:hralign="center" o:hrstd="t" o:hr="t" fillcolor="#a0a0a0" stroked="f"/>
         </w:pict>
       </w:r>
     </w:p>
@@ -3597,7 +3622,7 @@
           <w14:ligatures w14:val="none"/>
         </w:rPr>
         <w:pict w14:anchorId="6EEC28FA">
-          <v:rect id="_x0000_i1031" style="width:0;height:1.5pt" o:hralign="center" o:hrstd="t" o:hr="t" fillcolor="#a0a0a0" stroked="f"/>
+          <v:rect id="_x0000_i1029" style="width:0;height:1.5pt" o:hralign="center" o:hrstd="t" o:hr="t" fillcolor="#a0a0a0" stroked="f"/>
         </w:pict>
       </w:r>
     </w:p>
@@ -3872,7 +3897,7 @@
           <w14:ligatures w14:val="none"/>
         </w:rPr>
         <w:pict w14:anchorId="74ECFF18">
-          <v:rect id="_x0000_i1032" style="width:0;height:1.5pt" o:hralign="center" o:hrstd="t" o:hr="t" fillcolor="#a0a0a0" stroked="f"/>
+          <v:rect id="_x0000_i1030" style="width:0;height:1.5pt" o:hralign="center" o:hrstd="t" o:hr="t" fillcolor="#a0a0a0" stroked="f"/>
         </w:pict>
       </w:r>
     </w:p>
@@ -4239,7 +4264,7 @@
           <w14:ligatures w14:val="none"/>
         </w:rPr>
         <w:pict w14:anchorId="5A441670">
-          <v:rect id="_x0000_i1037" style="width:0;height:1.5pt" o:hralign="center" o:hrstd="t" o:hr="t" fillcolor="#a0a0a0" stroked="f"/>
+          <v:rect id="_x0000_i1031" style="width:0;height:1.5pt" o:hralign="center" o:hrstd="t" o:hr="t" fillcolor="#a0a0a0" stroked="f"/>
         </w:pict>
       </w:r>
     </w:p>
@@ -4601,7 +4626,7 @@
           <w14:ligatures w14:val="none"/>
         </w:rPr>
         <w:pict w14:anchorId="011DAC85">
-          <v:rect id="_x0000_i1038" style="width:0;height:1.5pt" o:hralign="center" o:hrstd="t" o:hr="t" fillcolor="#a0a0a0" stroked="f"/>
+          <v:rect id="_x0000_i1032" style="width:0;height:1.5pt" o:hralign="center" o:hrstd="t" o:hr="t" fillcolor="#a0a0a0" stroked="f"/>
         </w:pict>
       </w:r>
     </w:p>
@@ -5134,7 +5159,31 @@
           <w:lang w:eastAsia="pt-BR"/>
           <w14:ligatures w14:val="none"/>
         </w:rPr>
-        <w:t>), Pagamento por aproximação (quem usa maquininha de cartão), Pequenos empresários.</w:t>
+        <w:t xml:space="preserve">), Pagamento por aproximação (quem usa maquininha de cartão), </w:t>
+      </w:r>
+      <w:proofErr w:type="gramStart"/>
+      <w:r>
+        <w:rPr>
+          <w:rFonts w:ascii="Times New Roman" w:eastAsia="Times New Roman" w:hAnsi="Times New Roman" w:cs="Times New Roman"/>
+          <w:kern w:val="0"/>
+          <w:sz w:val="24"/>
+          <w:szCs w:val="24"/>
+          <w:lang w:eastAsia="pt-BR"/>
+          <w14:ligatures w14:val="none"/>
+        </w:rPr>
+        <w:t>Pequenos</w:t>
+      </w:r>
+      <w:proofErr w:type="gramEnd"/>
+      <w:r>
+        <w:rPr>
+          <w:rFonts w:ascii="Times New Roman" w:eastAsia="Times New Roman" w:hAnsi="Times New Roman" w:cs="Times New Roman"/>
+          <w:kern w:val="0"/>
+          <w:sz w:val="24"/>
+          <w:szCs w:val="24"/>
+          <w:lang w:eastAsia="pt-BR"/>
+          <w14:ligatures w14:val="none"/>
+        </w:rPr>
+        <w:t xml:space="preserve"> empresários.</w:t>
       </w:r>
     </w:p>
     <w:p>
@@ -5159,7 +5208,7 @@
           <w14:ligatures w14:val="none"/>
         </w:rPr>
         <w:pict w14:anchorId="6A701805">
-          <v:rect id="_x0000_i1039" style="width:0;height:1.5pt" o:hralign="center" o:hrstd="t" o:hr="t" fillcolor="#a0a0a0" stroked="f"/>
+          <v:rect id="_x0000_i1033" style="width:0;height:1.5pt" o:hralign="center" o:hrstd="t" o:hr="t" fillcolor="#a0a0a0" stroked="f"/>
         </w:pict>
       </w:r>
     </w:p>
@@ -5368,7 +5417,7 @@
           <w14:ligatures w14:val="none"/>
         </w:rPr>
         <w:pict w14:anchorId="69567060">
-          <v:rect id="_x0000_i1040" style="width:0;height:1.5pt" o:hralign="center" o:hrstd="t" o:hr="t" fillcolor="#a0a0a0" stroked="f"/>
+          <v:rect id="_x0000_i1034" style="width:0;height:1.5pt" o:hralign="center" o:hrstd="t" o:hr="t" fillcolor="#a0a0a0" stroked="f"/>
         </w:pict>
       </w:r>
     </w:p>
@@ -5734,7 +5783,7 @@
           <w14:ligatures w14:val="none"/>
         </w:rPr>
         <w:pict w14:anchorId="3A81B58B">
-          <v:rect id="_x0000_i1045" style="width:0;height:1.5pt" o:hralign="center" o:hrstd="t" o:hr="t" fillcolor="#a0a0a0" stroked="f"/>
+          <v:rect id="_x0000_i1035" style="width:0;height:1.5pt" o:hralign="center" o:hrstd="t" o:hr="t" fillcolor="#a0a0a0" stroked="f"/>
         </w:pict>
       </w:r>
     </w:p>
@@ -5946,6 +5995,1118 @@
     <w:p>
       <w:pPr>
         <w:pStyle w:val="PargrafodaLista"/>
+        <w:rPr>
+          <w:sz w:val="72"/>
+          <w:szCs w:val="72"/>
+        </w:rPr>
+      </w:pPr>
+      <w:r>
+        <w:rPr>
+          <w:sz w:val="72"/>
+          <w:szCs w:val="72"/>
+        </w:rPr>
+        <w:t xml:space="preserve">Entrada do </w:t>
+      </w:r>
+      <w:proofErr w:type="spellStart"/>
+      <w:r>
+        <w:rPr>
+          <w:sz w:val="72"/>
+          <w:szCs w:val="72"/>
+        </w:rPr>
+        <w:t>claude</w:t>
+      </w:r>
+      <w:proofErr w:type="spellEnd"/>
+    </w:p>
+    <w:p>
+      <w:pPr>
+        <w:pStyle w:val="PargrafodaLista"/>
+        <w:rPr>
+          <w:sz w:val="32"/>
+          <w:szCs w:val="32"/>
+        </w:rPr>
+      </w:pPr>
+    </w:p>
+    <w:p>
+      <w:pPr>
+        <w:pStyle w:val="PargrafodaLista"/>
+        <w:rPr>
+          <w:sz w:val="32"/>
+          <w:szCs w:val="32"/>
+        </w:rPr>
+      </w:pPr>
+    </w:p>
+    <w:p>
+      <w:pPr>
+        <w:pStyle w:val="Ttulo3"/>
+        <w:rPr>
+          <w:sz w:val="36"/>
+          <w:szCs w:val="36"/>
+        </w:rPr>
+      </w:pPr>
+      <w:r>
+        <w:rPr>
+          <w:rStyle w:val="font-semibold"/>
+          <w:sz w:val="36"/>
+          <w:szCs w:val="36"/>
+        </w:rPr>
+        <w:t>FASE 1: O Núcleo Perfeito (Onde estamos agora)</w:t>
+      </w:r>
+    </w:p>
+    <w:p>
+      <w:pPr>
+        <w:pStyle w:val="NormalWeb"/>
+        <w:rPr>
+          <w:sz w:val="36"/>
+          <w:szCs w:val="36"/>
+        </w:rPr>
+      </w:pPr>
+      <w:r>
+        <w:rPr>
+          <w:rStyle w:val="nfase"/>
+          <w:sz w:val="36"/>
+          <w:szCs w:val="36"/>
+        </w:rPr>
+        <w:t>Objetivo: Ter a ferramenta de geração funcionando impecavelmente 100% offline.</w:t>
+      </w:r>
+    </w:p>
+    <w:p>
+      <w:pPr>
+        <w:pStyle w:val="py-0"/>
+        <w:numPr>
+          <w:ilvl w:val="0"/>
+          <w:numId w:val="23"/>
+        </w:numPr>
+        <w:rPr>
+          <w:sz w:val="36"/>
+          <w:szCs w:val="36"/>
+        </w:rPr>
+      </w:pPr>
+      <w:r>
+        <w:rPr>
+          <w:rFonts w:ascii="Segoe UI Emoji" w:hAnsi="Segoe UI Emoji" w:cs="Segoe UI Emoji"/>
+          <w:sz w:val="36"/>
+          <w:szCs w:val="36"/>
+        </w:rPr>
+        <w:t>✅</w:t>
+      </w:r>
+      <w:r>
+        <w:rPr>
+          <w:sz w:val="36"/>
+          <w:szCs w:val="36"/>
+        </w:rPr>
+        <w:t xml:space="preserve"> Layout e estrutura base (Feito)</w:t>
+      </w:r>
+    </w:p>
+    <w:p>
+      <w:pPr>
+        <w:pStyle w:val="py-0"/>
+        <w:numPr>
+          <w:ilvl w:val="0"/>
+          <w:numId w:val="23"/>
+        </w:numPr>
+        <w:rPr>
+          <w:sz w:val="36"/>
+          <w:szCs w:val="36"/>
+        </w:rPr>
+      </w:pPr>
+      <w:r>
+        <w:rPr>
+          <w:rFonts w:ascii="Segoe UI Emoji" w:hAnsi="Segoe UI Emoji" w:cs="Segoe UI Emoji"/>
+          <w:sz w:val="36"/>
+          <w:szCs w:val="36"/>
+        </w:rPr>
+        <w:t>✅</w:t>
+      </w:r>
+      <w:r>
+        <w:rPr>
+          <w:sz w:val="36"/>
+          <w:szCs w:val="36"/>
+        </w:rPr>
+        <w:t xml:space="preserve"> PWA instalável e offline-</w:t>
+      </w:r>
+      <w:proofErr w:type="spellStart"/>
+      <w:r>
+        <w:rPr>
+          <w:sz w:val="36"/>
+          <w:szCs w:val="36"/>
+        </w:rPr>
+        <w:t>first</w:t>
+      </w:r>
+      <w:proofErr w:type="spellEnd"/>
+      <w:r>
+        <w:rPr>
+          <w:sz w:val="36"/>
+          <w:szCs w:val="36"/>
+        </w:rPr>
+        <w:t xml:space="preserve"> (Feito: </w:t>
+      </w:r>
+      <w:r>
+        <w:rPr>
+          <w:rStyle w:val="CdigoHTML"/>
+          <w:sz w:val="36"/>
+          <w:szCs w:val="36"/>
+        </w:rPr>
+        <w:t>sw.js</w:t>
+      </w:r>
+      <w:r>
+        <w:rPr>
+          <w:sz w:val="36"/>
+          <w:szCs w:val="36"/>
+        </w:rPr>
+        <w:t xml:space="preserve"> e </w:t>
+      </w:r>
+      <w:proofErr w:type="spellStart"/>
+      <w:proofErr w:type="gramStart"/>
+      <w:r>
+        <w:rPr>
+          <w:rStyle w:val="CdigoHTML"/>
+          <w:sz w:val="36"/>
+          <w:szCs w:val="36"/>
+        </w:rPr>
+        <w:t>manifest.json</w:t>
+      </w:r>
+      <w:proofErr w:type="spellEnd"/>
+      <w:proofErr w:type="gramEnd"/>
+      <w:r>
+        <w:rPr>
+          <w:sz w:val="36"/>
+          <w:szCs w:val="36"/>
+        </w:rPr>
+        <w:t>)</w:t>
+      </w:r>
+    </w:p>
+    <w:p>
+      <w:pPr>
+        <w:pStyle w:val="py-0"/>
+        <w:numPr>
+          <w:ilvl w:val="0"/>
+          <w:numId w:val="23"/>
+        </w:numPr>
+        <w:rPr>
+          <w:sz w:val="36"/>
+          <w:szCs w:val="36"/>
+        </w:rPr>
+      </w:pPr>
+      <w:r>
+        <w:rPr>
+          <w:rFonts w:ascii="Segoe UI Emoji" w:hAnsi="Segoe UI Emoji" w:cs="Segoe UI Emoji"/>
+          <w:sz w:val="36"/>
+          <w:szCs w:val="36"/>
+        </w:rPr>
+        <w:t>✅</w:t>
+      </w:r>
+      <w:r>
+        <w:rPr>
+          <w:sz w:val="36"/>
+          <w:szCs w:val="36"/>
+        </w:rPr>
+        <w:t xml:space="preserve"> Validações vitais como CPF (Feito)</w:t>
+      </w:r>
+    </w:p>
+    <w:p>
+      <w:pPr>
+        <w:pStyle w:val="py-0"/>
+        <w:numPr>
+          <w:ilvl w:val="0"/>
+          <w:numId w:val="23"/>
+        </w:numPr>
+        <w:rPr>
+          <w:sz w:val="36"/>
+          <w:szCs w:val="36"/>
+        </w:rPr>
+      </w:pPr>
+      <w:r>
+        <w:rPr>
+          <w:rFonts w:ascii="Segoe UI Emoji" w:hAnsi="Segoe UI Emoji" w:cs="Segoe UI Emoji"/>
+          <w:sz w:val="36"/>
+          <w:szCs w:val="36"/>
+        </w:rPr>
+        <w:t>🔲</w:t>
+      </w:r>
+      <w:r>
+        <w:rPr>
+          <w:sz w:val="36"/>
+          <w:szCs w:val="36"/>
+        </w:rPr>
+        <w:t xml:space="preserve"> </w:t>
+      </w:r>
+      <w:r>
+        <w:rPr>
+          <w:rStyle w:val="font-semibold"/>
+          <w:sz w:val="36"/>
+          <w:szCs w:val="36"/>
+        </w:rPr>
+        <w:t>(PRÓXIMO PASSO</w:t>
+      </w:r>
+      <w:proofErr w:type="gramStart"/>
+      <w:r>
+        <w:rPr>
+          <w:rStyle w:val="font-semibold"/>
+          <w:sz w:val="36"/>
+          <w:szCs w:val="36"/>
+        </w:rPr>
+        <w:t>)</w:t>
+      </w:r>
+      <w:r>
+        <w:rPr>
+          <w:sz w:val="36"/>
+          <w:szCs w:val="36"/>
+        </w:rPr>
+        <w:t xml:space="preserve"> Salvar</w:t>
+      </w:r>
+      <w:proofErr w:type="gramEnd"/>
+      <w:r>
+        <w:rPr>
+          <w:sz w:val="36"/>
+          <w:szCs w:val="36"/>
+        </w:rPr>
+        <w:t xml:space="preserve"> os dados no dispositivo (</w:t>
+      </w:r>
+      <w:proofErr w:type="spellStart"/>
+      <w:r>
+        <w:rPr>
+          <w:sz w:val="36"/>
+          <w:szCs w:val="36"/>
+        </w:rPr>
+        <w:t>LocalStorage</w:t>
+      </w:r>
+      <w:proofErr w:type="spellEnd"/>
+      <w:r>
+        <w:rPr>
+          <w:sz w:val="36"/>
+          <w:szCs w:val="36"/>
+        </w:rPr>
+        <w:t>): Para o usuário não perder os dados se fechar a aba e para preencher automaticamente os próprios dados na próxima vez.</w:t>
+      </w:r>
+    </w:p>
+    <w:p>
+      <w:pPr>
+        <w:pStyle w:val="py-0"/>
+        <w:numPr>
+          <w:ilvl w:val="0"/>
+          <w:numId w:val="23"/>
+        </w:numPr>
+        <w:rPr>
+          <w:sz w:val="36"/>
+          <w:szCs w:val="36"/>
+        </w:rPr>
+      </w:pPr>
+      <w:r>
+        <w:rPr>
+          <w:rFonts w:ascii="Segoe UI Emoji" w:hAnsi="Segoe UI Emoji" w:cs="Segoe UI Emoji"/>
+          <w:sz w:val="36"/>
+          <w:szCs w:val="36"/>
+        </w:rPr>
+        <w:t>🔲</w:t>
+      </w:r>
+      <w:r>
+        <w:rPr>
+          <w:sz w:val="36"/>
+          <w:szCs w:val="36"/>
+        </w:rPr>
+        <w:t xml:space="preserve"> Exportação e Compartilhamento: Botões para PDF, </w:t>
+      </w:r>
+      <w:proofErr w:type="gramStart"/>
+      <w:r>
+        <w:rPr>
+          <w:sz w:val="36"/>
+          <w:szCs w:val="36"/>
+        </w:rPr>
+        <w:t>Imprimir e enviar</w:t>
+      </w:r>
+      <w:proofErr w:type="gramEnd"/>
+      <w:r>
+        <w:rPr>
+          <w:sz w:val="36"/>
+          <w:szCs w:val="36"/>
+        </w:rPr>
+        <w:t xml:space="preserve"> direto pro WhatsApp.</w:t>
+      </w:r>
+    </w:p>
+    <w:p>
+      <w:pPr>
+        <w:pStyle w:val="Ttulo3"/>
+        <w:rPr>
+          <w:sz w:val="36"/>
+          <w:szCs w:val="36"/>
+        </w:rPr>
+      </w:pPr>
+      <w:r>
+        <w:rPr>
+          <w:rStyle w:val="font-semibold"/>
+          <w:sz w:val="36"/>
+          <w:szCs w:val="36"/>
+        </w:rPr>
+        <w:t>FASE 2: Experiência do Usuário (UX) e Retenção</w:t>
+      </w:r>
+    </w:p>
+    <w:p>
+      <w:pPr>
+        <w:pStyle w:val="NormalWeb"/>
+        <w:rPr>
+          <w:sz w:val="36"/>
+          <w:szCs w:val="36"/>
+        </w:rPr>
+      </w:pPr>
+      <w:r>
+        <w:rPr>
+          <w:rStyle w:val="nfase"/>
+          <w:sz w:val="36"/>
+          <w:szCs w:val="36"/>
+        </w:rPr>
+        <w:t>Objetivo: Deixar o app com "cara de app profissional" e preparar o terreno para cobrar.</w:t>
+      </w:r>
+    </w:p>
+    <w:p>
+      <w:pPr>
+        <w:pStyle w:val="py-0"/>
+        <w:numPr>
+          <w:ilvl w:val="0"/>
+          <w:numId w:val="24"/>
+        </w:numPr>
+        <w:rPr>
+          <w:sz w:val="36"/>
+          <w:szCs w:val="36"/>
+        </w:rPr>
+      </w:pPr>
+      <w:r>
+        <w:rPr>
+          <w:rFonts w:ascii="Segoe UI Emoji" w:hAnsi="Segoe UI Emoji" w:cs="Segoe UI Emoji"/>
+          <w:sz w:val="36"/>
+          <w:szCs w:val="36"/>
+        </w:rPr>
+        <w:t>🔲</w:t>
+      </w:r>
+      <w:r>
+        <w:rPr>
+          <w:sz w:val="36"/>
+          <w:szCs w:val="36"/>
+        </w:rPr>
+        <w:t xml:space="preserve"> </w:t>
+      </w:r>
+      <w:r>
+        <w:rPr>
+          <w:rStyle w:val="font-semibold"/>
+          <w:sz w:val="36"/>
+          <w:szCs w:val="36"/>
+        </w:rPr>
+        <w:t>Tela Inicial (Home/Dashboard):</w:t>
+      </w:r>
+      <w:r>
+        <w:rPr>
+          <w:sz w:val="36"/>
+          <w:szCs w:val="36"/>
+        </w:rPr>
+        <w:t xml:space="preserve"> Quando abre o app, ele não vai direto pro formulário. Ele vê um </w:t>
+      </w:r>
+      <w:r>
+        <w:rPr>
+          <w:sz w:val="36"/>
+          <w:szCs w:val="36"/>
+        </w:rPr>
+        <w:lastRenderedPageBreak/>
+        <w:t>painel: "Bem-vindo! Você gerou X contratos. [Novo Contrato] [Meus Contratos]".</w:t>
+      </w:r>
+    </w:p>
+    <w:p>
+      <w:pPr>
+        <w:pStyle w:val="py-0"/>
+        <w:numPr>
+          <w:ilvl w:val="0"/>
+          <w:numId w:val="24"/>
+        </w:numPr>
+        <w:rPr>
+          <w:sz w:val="36"/>
+          <w:szCs w:val="36"/>
+        </w:rPr>
+      </w:pPr>
+      <w:r>
+        <w:rPr>
+          <w:rFonts w:ascii="Segoe UI Emoji" w:hAnsi="Segoe UI Emoji" w:cs="Segoe UI Emoji"/>
+          <w:sz w:val="36"/>
+          <w:szCs w:val="36"/>
+        </w:rPr>
+        <w:t>🔲</w:t>
+      </w:r>
+      <w:r>
+        <w:rPr>
+          <w:sz w:val="36"/>
+          <w:szCs w:val="36"/>
+        </w:rPr>
+        <w:t xml:space="preserve"> </w:t>
+      </w:r>
+      <w:r>
+        <w:rPr>
+          <w:rStyle w:val="font-semibold"/>
+          <w:sz w:val="36"/>
+          <w:szCs w:val="36"/>
+        </w:rPr>
+        <w:t>Histórico Local:</w:t>
+      </w:r>
+      <w:r>
+        <w:rPr>
+          <w:sz w:val="36"/>
+          <w:szCs w:val="36"/>
+        </w:rPr>
+        <w:t xml:space="preserve"> Uma lista dos contratos já gerados (salvos no celular via </w:t>
+      </w:r>
+      <w:proofErr w:type="spellStart"/>
+      <w:r>
+        <w:rPr>
+          <w:sz w:val="36"/>
+          <w:szCs w:val="36"/>
+        </w:rPr>
+        <w:t>IndexedDB</w:t>
+      </w:r>
+      <w:proofErr w:type="spellEnd"/>
+      <w:r>
+        <w:rPr>
+          <w:sz w:val="36"/>
+          <w:szCs w:val="36"/>
+        </w:rPr>
+        <w:t>/</w:t>
+      </w:r>
+      <w:proofErr w:type="spellStart"/>
+      <w:r>
+        <w:rPr>
+          <w:sz w:val="36"/>
+          <w:szCs w:val="36"/>
+        </w:rPr>
+        <w:t>LocalStorage</w:t>
+      </w:r>
+      <w:proofErr w:type="spellEnd"/>
+      <w:r>
+        <w:rPr>
+          <w:sz w:val="36"/>
+          <w:szCs w:val="36"/>
+        </w:rPr>
+        <w:t>) para ele consultar ou baixar de novo.</w:t>
+      </w:r>
+    </w:p>
+    <w:p>
+      <w:pPr>
+        <w:pStyle w:val="py-0"/>
+        <w:numPr>
+          <w:ilvl w:val="0"/>
+          <w:numId w:val="24"/>
+        </w:numPr>
+        <w:rPr>
+          <w:sz w:val="36"/>
+          <w:szCs w:val="36"/>
+        </w:rPr>
+      </w:pPr>
+      <w:r>
+        <w:rPr>
+          <w:rFonts w:ascii="Segoe UI Emoji" w:hAnsi="Segoe UI Emoji" w:cs="Segoe UI Emoji"/>
+          <w:sz w:val="36"/>
+          <w:szCs w:val="36"/>
+        </w:rPr>
+        <w:t>🔲</w:t>
+      </w:r>
+      <w:r>
+        <w:rPr>
+          <w:sz w:val="36"/>
+          <w:szCs w:val="36"/>
+        </w:rPr>
+        <w:t xml:space="preserve"> </w:t>
+      </w:r>
+      <w:r>
+        <w:rPr>
+          <w:rStyle w:val="font-semibold"/>
+          <w:sz w:val="36"/>
+          <w:szCs w:val="36"/>
+        </w:rPr>
+        <w:t>Meus Dados:</w:t>
+      </w:r>
+      <w:r>
+        <w:rPr>
+          <w:sz w:val="36"/>
+          <w:szCs w:val="36"/>
+        </w:rPr>
+        <w:t xml:space="preserve"> Uma tela onde o profissional salva os dados DELE (Nome, CPF/CNPJ, Endereço). Assim, quando for gerar um contrato, a parte do "Contratado" já vem 100% preenchida.</w:t>
+      </w:r>
+    </w:p>
+    <w:p>
+      <w:pPr>
+        <w:pStyle w:val="Ttulo3"/>
+        <w:rPr>
+          <w:sz w:val="36"/>
+          <w:szCs w:val="36"/>
+        </w:rPr>
+      </w:pPr>
+      <w:r>
+        <w:rPr>
+          <w:rStyle w:val="font-semibold"/>
+          <w:sz w:val="36"/>
+          <w:szCs w:val="36"/>
+        </w:rPr>
+        <w:t>FASE 3: A Nuvem e a Autenticação (A transição para Híbrido)</w:t>
+      </w:r>
+    </w:p>
+    <w:p>
+      <w:pPr>
+        <w:pStyle w:val="NormalWeb"/>
+        <w:rPr>
+          <w:sz w:val="36"/>
+          <w:szCs w:val="36"/>
+        </w:rPr>
+      </w:pPr>
+      <w:r>
+        <w:rPr>
+          <w:rStyle w:val="nfase"/>
+          <w:sz w:val="36"/>
+          <w:szCs w:val="36"/>
+        </w:rPr>
+        <w:t>Objetivo: Conectar à internet para sincronizar e identificar quem é quem.</w:t>
+      </w:r>
+    </w:p>
+    <w:p>
+      <w:pPr>
+        <w:pStyle w:val="py-0"/>
+        <w:numPr>
+          <w:ilvl w:val="0"/>
+          <w:numId w:val="25"/>
+        </w:numPr>
+        <w:rPr>
+          <w:sz w:val="36"/>
+          <w:szCs w:val="36"/>
+        </w:rPr>
+      </w:pPr>
+      <w:r>
+        <w:rPr>
+          <w:rFonts w:ascii="Segoe UI Emoji" w:hAnsi="Segoe UI Emoji" w:cs="Segoe UI Emoji"/>
+          <w:sz w:val="36"/>
+          <w:szCs w:val="36"/>
+        </w:rPr>
+        <w:t>🔲</w:t>
+      </w:r>
+      <w:r>
+        <w:rPr>
+          <w:sz w:val="36"/>
+          <w:szCs w:val="36"/>
+        </w:rPr>
+        <w:t xml:space="preserve"> </w:t>
+      </w:r>
+      <w:r>
+        <w:rPr>
+          <w:rStyle w:val="font-semibold"/>
+          <w:sz w:val="36"/>
+          <w:szCs w:val="36"/>
+        </w:rPr>
+        <w:t>Sistema de Login:</w:t>
+      </w:r>
+      <w:r>
+        <w:rPr>
+          <w:sz w:val="36"/>
+          <w:szCs w:val="36"/>
+        </w:rPr>
+        <w:t xml:space="preserve"> Login simples (</w:t>
+      </w:r>
+      <w:proofErr w:type="spellStart"/>
+      <w:r>
+        <w:rPr>
+          <w:sz w:val="36"/>
+          <w:szCs w:val="36"/>
+        </w:rPr>
+        <w:t>Email</w:t>
+      </w:r>
+      <w:proofErr w:type="spellEnd"/>
+      <w:r>
+        <w:rPr>
+          <w:sz w:val="36"/>
+          <w:szCs w:val="36"/>
+        </w:rPr>
+        <w:t xml:space="preserve">/Senha ou Google). Podemos usar o </w:t>
+      </w:r>
+      <w:proofErr w:type="spellStart"/>
+      <w:r>
+        <w:rPr>
+          <w:sz w:val="36"/>
+          <w:szCs w:val="36"/>
+        </w:rPr>
+        <w:t>Firebase</w:t>
+      </w:r>
+      <w:proofErr w:type="spellEnd"/>
+      <w:r>
+        <w:rPr>
+          <w:sz w:val="36"/>
+          <w:szCs w:val="36"/>
+        </w:rPr>
+        <w:t xml:space="preserve"> (gratuito e excelente para </w:t>
+      </w:r>
+      <w:proofErr w:type="spellStart"/>
+      <w:r>
+        <w:rPr>
+          <w:sz w:val="36"/>
+          <w:szCs w:val="36"/>
+        </w:rPr>
+        <w:t>PWAs</w:t>
+      </w:r>
+      <w:proofErr w:type="spellEnd"/>
+      <w:r>
+        <w:rPr>
+          <w:sz w:val="36"/>
+          <w:szCs w:val="36"/>
+        </w:rPr>
+        <w:t xml:space="preserve"> híbridos).</w:t>
+      </w:r>
+    </w:p>
+    <w:p>
+      <w:pPr>
+        <w:pStyle w:val="py-0"/>
+        <w:numPr>
+          <w:ilvl w:val="0"/>
+          <w:numId w:val="25"/>
+        </w:numPr>
+        <w:rPr>
+          <w:sz w:val="36"/>
+          <w:szCs w:val="36"/>
+        </w:rPr>
+      </w:pPr>
+      <w:r>
+        <w:rPr>
+          <w:rFonts w:ascii="Segoe UI Emoji" w:hAnsi="Segoe UI Emoji" w:cs="Segoe UI Emoji"/>
+          <w:sz w:val="36"/>
+          <w:szCs w:val="36"/>
+        </w:rPr>
+        <w:t>🔲</w:t>
+      </w:r>
+      <w:r>
+        <w:rPr>
+          <w:sz w:val="36"/>
+          <w:szCs w:val="36"/>
+        </w:rPr>
+        <w:t xml:space="preserve"> </w:t>
+      </w:r>
+      <w:r>
+        <w:rPr>
+          <w:rStyle w:val="font-semibold"/>
+          <w:sz w:val="36"/>
+          <w:szCs w:val="36"/>
+        </w:rPr>
+        <w:t>Sincronização:</w:t>
+      </w:r>
+      <w:r>
+        <w:rPr>
+          <w:sz w:val="36"/>
+          <w:szCs w:val="36"/>
+        </w:rPr>
+        <w:t xml:space="preserve"> O app pega o histórico que estava só no celular e joga pra nuvem associado àquela conta. Se ele </w:t>
+      </w:r>
+      <w:proofErr w:type="spellStart"/>
+      <w:r>
+        <w:rPr>
+          <w:sz w:val="36"/>
+          <w:szCs w:val="36"/>
+        </w:rPr>
+        <w:t>logar</w:t>
+      </w:r>
+      <w:proofErr w:type="spellEnd"/>
+      <w:r>
+        <w:rPr>
+          <w:sz w:val="36"/>
+          <w:szCs w:val="36"/>
+        </w:rPr>
+        <w:t xml:space="preserve"> no computador, os contratos estão lá.</w:t>
+      </w:r>
+    </w:p>
+    <w:p>
+      <w:pPr>
+        <w:pStyle w:val="Ttulo3"/>
+        <w:rPr>
+          <w:sz w:val="36"/>
+          <w:szCs w:val="36"/>
+        </w:rPr>
+      </w:pPr>
+      <w:r>
+        <w:rPr>
+          <w:rStyle w:val="font-semibold"/>
+          <w:sz w:val="36"/>
+          <w:szCs w:val="36"/>
+        </w:rPr>
+        <w:t>FASE 4: Monetização (O Dinheiro)</w:t>
+      </w:r>
+    </w:p>
+    <w:p>
+      <w:pPr>
+        <w:pStyle w:val="NormalWeb"/>
+        <w:rPr>
+          <w:sz w:val="36"/>
+          <w:szCs w:val="36"/>
+        </w:rPr>
+      </w:pPr>
+      <w:r>
+        <w:rPr>
+          <w:rStyle w:val="nfase"/>
+          <w:sz w:val="36"/>
+          <w:szCs w:val="36"/>
+        </w:rPr>
+        <w:t>Objetivo: Limitar o uso gratuito e cobrar pelo Premium.</w:t>
+      </w:r>
+    </w:p>
+    <w:p>
+      <w:pPr>
+        <w:pStyle w:val="py-0"/>
+        <w:numPr>
+          <w:ilvl w:val="0"/>
+          <w:numId w:val="26"/>
+        </w:numPr>
+        <w:rPr>
+          <w:sz w:val="36"/>
+          <w:szCs w:val="36"/>
+        </w:rPr>
+      </w:pPr>
+      <w:r>
+        <w:rPr>
+          <w:rFonts w:ascii="Segoe UI Emoji" w:hAnsi="Segoe UI Emoji" w:cs="Segoe UI Emoji"/>
+          <w:sz w:val="36"/>
+          <w:szCs w:val="36"/>
+        </w:rPr>
+        <w:t>🔲</w:t>
+      </w:r>
+      <w:r>
+        <w:rPr>
+          <w:sz w:val="36"/>
+          <w:szCs w:val="36"/>
+        </w:rPr>
+        <w:t xml:space="preserve"> </w:t>
+      </w:r>
+      <w:r>
+        <w:rPr>
+          <w:rStyle w:val="font-semibold"/>
+          <w:sz w:val="36"/>
+          <w:szCs w:val="36"/>
+        </w:rPr>
+        <w:t>Contador de Uso (</w:t>
+      </w:r>
+      <w:proofErr w:type="spellStart"/>
+      <w:r>
+        <w:rPr>
+          <w:rStyle w:val="font-semibold"/>
+          <w:sz w:val="36"/>
+          <w:szCs w:val="36"/>
+        </w:rPr>
+        <w:t>Paywall</w:t>
+      </w:r>
+      <w:proofErr w:type="spellEnd"/>
+      <w:r>
+        <w:rPr>
+          <w:rStyle w:val="font-semibold"/>
+          <w:sz w:val="36"/>
+          <w:szCs w:val="36"/>
+        </w:rPr>
+        <w:t>):</w:t>
+      </w:r>
+      <w:r>
+        <w:rPr>
+          <w:sz w:val="36"/>
+          <w:szCs w:val="36"/>
+        </w:rPr>
+        <w:t xml:space="preserve"> O banco de dados controla: "Usuário X gerou 3 contratos este mês". No 4º contrato, sobe a tela de bloqueio.</w:t>
+      </w:r>
+    </w:p>
+    <w:p>
+      <w:pPr>
+        <w:pStyle w:val="py-0"/>
+        <w:numPr>
+          <w:ilvl w:val="0"/>
+          <w:numId w:val="26"/>
+        </w:numPr>
+        <w:rPr>
+          <w:sz w:val="36"/>
+          <w:szCs w:val="36"/>
+        </w:rPr>
+      </w:pPr>
+      <w:r>
+        <w:rPr>
+          <w:rFonts w:ascii="Segoe UI Emoji" w:hAnsi="Segoe UI Emoji" w:cs="Segoe UI Emoji"/>
+          <w:sz w:val="36"/>
+          <w:szCs w:val="36"/>
+        </w:rPr>
+        <w:lastRenderedPageBreak/>
+        <w:t>🔲</w:t>
+      </w:r>
+      <w:r>
+        <w:rPr>
+          <w:sz w:val="36"/>
+          <w:szCs w:val="36"/>
+        </w:rPr>
+        <w:t xml:space="preserve"> </w:t>
+      </w:r>
+      <w:r>
+        <w:rPr>
+          <w:rStyle w:val="font-semibold"/>
+          <w:sz w:val="36"/>
+          <w:szCs w:val="36"/>
+        </w:rPr>
+        <w:t>Integração de Pagamento:</w:t>
+      </w:r>
+      <w:r>
+        <w:rPr>
+          <w:sz w:val="36"/>
+          <w:szCs w:val="36"/>
+        </w:rPr>
+        <w:t xml:space="preserve"> Conectar com </w:t>
+      </w:r>
+      <w:proofErr w:type="spellStart"/>
+      <w:r>
+        <w:rPr>
+          <w:sz w:val="36"/>
+          <w:szCs w:val="36"/>
+        </w:rPr>
+        <w:t>Stripe</w:t>
+      </w:r>
+      <w:proofErr w:type="spellEnd"/>
+      <w:r>
+        <w:rPr>
+          <w:sz w:val="36"/>
+          <w:szCs w:val="36"/>
+        </w:rPr>
+        <w:t xml:space="preserve">, Mercado Pago ou </w:t>
+      </w:r>
+      <w:proofErr w:type="spellStart"/>
+      <w:r>
+        <w:rPr>
+          <w:sz w:val="36"/>
+          <w:szCs w:val="36"/>
+        </w:rPr>
+        <w:t>Asaas</w:t>
+      </w:r>
+      <w:proofErr w:type="spellEnd"/>
+      <w:r>
+        <w:rPr>
+          <w:sz w:val="36"/>
+          <w:szCs w:val="36"/>
+        </w:rPr>
+        <w:t xml:space="preserve"> para cobrar a assinatura (mensal/anual).</w:t>
+      </w:r>
+    </w:p>
+    <w:p>
+      <w:pPr>
+        <w:pStyle w:val="py-0"/>
+        <w:numPr>
+          <w:ilvl w:val="0"/>
+          <w:numId w:val="26"/>
+        </w:numPr>
+        <w:rPr>
+          <w:sz w:val="36"/>
+          <w:szCs w:val="36"/>
+        </w:rPr>
+      </w:pPr>
+      <w:r>
+        <w:rPr>
+          <w:rFonts w:ascii="Segoe UI Emoji" w:hAnsi="Segoe UI Emoji" w:cs="Segoe UI Emoji"/>
+          <w:sz w:val="36"/>
+          <w:szCs w:val="36"/>
+        </w:rPr>
+        <w:t>🔲</w:t>
+      </w:r>
+      <w:r>
+        <w:rPr>
+          <w:sz w:val="36"/>
+          <w:szCs w:val="36"/>
+        </w:rPr>
+        <w:t xml:space="preserve"> </w:t>
+      </w:r>
+      <w:r>
+        <w:rPr>
+          <w:rStyle w:val="font-semibold"/>
+          <w:sz w:val="36"/>
+          <w:szCs w:val="36"/>
+        </w:rPr>
+        <w:t>Recursos Premium:</w:t>
+      </w:r>
+      <w:r>
+        <w:rPr>
+          <w:sz w:val="36"/>
+          <w:szCs w:val="36"/>
+        </w:rPr>
+        <w:t xml:space="preserve"> Desbloquear coisas como: remover marca d'água, logo da empresa do cliente no contrato, envio de link para assinatura digital, etc.</w:t>
+      </w:r>
+    </w:p>
+    <w:p>
+      <w:pPr>
+        <w:rPr>
+          <w:sz w:val="36"/>
+          <w:szCs w:val="36"/>
+        </w:rPr>
+      </w:pPr>
+      <w:r>
+        <w:rPr>
+          <w:sz w:val="36"/>
+          <w:szCs w:val="36"/>
+        </w:rPr>
+        <w:pict w14:anchorId="2B2903EA">
+          <v:rect id="_x0000_i1036" style="width:0;height:1.5pt" o:hralign="center" o:hrstd="t" o:hr="t" fillcolor="#a0a0a0" stroked="f"/>
+        </w:pict>
+      </w:r>
+    </w:p>
+    <w:p>
+      <w:pPr>
+        <w:pStyle w:val="Ttulo2"/>
+        <w:rPr>
+          <w:sz w:val="36"/>
+          <w:szCs w:val="36"/>
+        </w:rPr>
+      </w:pPr>
+      <w:r>
+        <w:rPr>
+          <w:rFonts w:ascii="Segoe UI Emoji" w:hAnsi="Segoe UI Emoji" w:cs="Segoe UI Emoji"/>
+          <w:sz w:val="36"/>
+          <w:szCs w:val="36"/>
+        </w:rPr>
+        <w:t>🎯</w:t>
+      </w:r>
+      <w:r>
+        <w:rPr>
+          <w:sz w:val="36"/>
+          <w:szCs w:val="36"/>
+        </w:rPr>
+        <w:t xml:space="preserve"> </w:t>
+      </w:r>
+      <w:r>
+        <w:rPr>
+          <w:rStyle w:val="font-semibold"/>
+          <w:sz w:val="36"/>
+          <w:szCs w:val="36"/>
+        </w:rPr>
+        <w:t>POR ONDE COMEÇAMOS HOJE? (Fase 1)</w:t>
+      </w:r>
+    </w:p>
+    <w:p>
+      <w:pPr>
+        <w:pStyle w:val="NormalWeb"/>
+        <w:rPr>
+          <w:sz w:val="36"/>
+          <w:szCs w:val="36"/>
+        </w:rPr>
+      </w:pPr>
+      <w:r>
+        <w:rPr>
+          <w:sz w:val="36"/>
+          <w:szCs w:val="36"/>
+        </w:rPr>
+        <w:t>Nós não podemos pular para a tela de login (Fase 3) se a ferramenta de gerar o PDF/WhatsApp (Fase 1) ainda não existe. A fundação precisa ser sólida.</w:t>
+      </w:r>
+    </w:p>
+    <w:p>
+      <w:pPr>
+        <w:pStyle w:val="NormalWeb"/>
+        <w:rPr>
+          <w:sz w:val="36"/>
+          <w:szCs w:val="36"/>
+        </w:rPr>
+      </w:pPr>
+      <w:r>
+        <w:rPr>
+          <w:rStyle w:val="font-semibold"/>
+          <w:sz w:val="36"/>
+          <w:szCs w:val="36"/>
+        </w:rPr>
+        <w:t>Minha sugestão para os 3 próximos passos técnicos (nessa exata ordem):</w:t>
+      </w:r>
+    </w:p>
+    <w:p>
+      <w:pPr>
+        <w:pStyle w:val="py-0"/>
+        <w:numPr>
+          <w:ilvl w:val="0"/>
+          <w:numId w:val="27"/>
+        </w:numPr>
+        <w:rPr>
+          <w:sz w:val="36"/>
+          <w:szCs w:val="36"/>
+        </w:rPr>
+      </w:pPr>
+      <w:r>
+        <w:rPr>
+          <w:rStyle w:val="font-semibold"/>
+          <w:sz w:val="36"/>
+          <w:szCs w:val="36"/>
+        </w:rPr>
+        <w:t>Botões Mágicos (PDF, Imprimir, WhatsApp):</w:t>
+      </w:r>
+      <w:r>
+        <w:rPr>
+          <w:sz w:val="36"/>
+          <w:szCs w:val="36"/>
+        </w:rPr>
+        <w:t xml:space="preserve"> Fazer o contrato sair do aplicativo para as mãos do cliente.</w:t>
+      </w:r>
+    </w:p>
+    <w:p>
+      <w:pPr>
+        <w:pStyle w:val="py-0"/>
+        <w:numPr>
+          <w:ilvl w:val="0"/>
+          <w:numId w:val="27"/>
+        </w:numPr>
+        <w:rPr>
+          <w:sz w:val="36"/>
+          <w:szCs w:val="36"/>
+        </w:rPr>
+      </w:pPr>
+      <w:proofErr w:type="spellStart"/>
+      <w:r>
+        <w:rPr>
+          <w:rStyle w:val="font-semibold"/>
+          <w:sz w:val="36"/>
+          <w:szCs w:val="36"/>
+        </w:rPr>
+        <w:t>LocalStorage</w:t>
+      </w:r>
+      <w:proofErr w:type="spellEnd"/>
+      <w:r>
+        <w:rPr>
+          <w:rStyle w:val="font-semibold"/>
+          <w:sz w:val="36"/>
+          <w:szCs w:val="36"/>
+        </w:rPr>
+        <w:t xml:space="preserve"> (Salvar Dados):</w:t>
+      </w:r>
+      <w:r>
+        <w:rPr>
+          <w:sz w:val="36"/>
+          <w:szCs w:val="36"/>
+        </w:rPr>
+        <w:t xml:space="preserve"> Fazer os campos guardarem o que foi digitado para o empresário não ficar com raiva se a página recarregar sem querer.</w:t>
+      </w:r>
+    </w:p>
+    <w:p>
+      <w:pPr>
+        <w:pStyle w:val="py-0"/>
+        <w:numPr>
+          <w:ilvl w:val="0"/>
+          <w:numId w:val="27"/>
+        </w:numPr>
+        <w:rPr>
+          <w:sz w:val="36"/>
+          <w:szCs w:val="36"/>
+        </w:rPr>
+      </w:pPr>
+      <w:r>
+        <w:rPr>
+          <w:rStyle w:val="font-semibold"/>
+          <w:sz w:val="36"/>
+          <w:szCs w:val="36"/>
+        </w:rPr>
+        <w:t>Página Inicial (Home):</w:t>
+      </w:r>
+      <w:r>
+        <w:rPr>
+          <w:sz w:val="36"/>
+          <w:szCs w:val="36"/>
+        </w:rPr>
+        <w:t xml:space="preserve"> Criar a primeira versão da tela de boas-vindas que "esconde" o gerador até ele clicar em "Novo Contrato".</w:t>
+      </w:r>
+    </w:p>
+    <w:p>
+      <w:pPr>
+        <w:pStyle w:val="PargrafodaLista"/>
+        <w:rPr>
+          <w:sz w:val="32"/>
+          <w:szCs w:val="32"/>
+        </w:rPr>
       </w:pPr>
     </w:p>
     <w:sectPr>
@@ -6746,6 +7907,155 @@
     </w:lvl>
   </w:abstractNum>
   <w:abstractNum w:abstractNumId="6" w15:restartNumberingAfterBreak="0">
+    <w:nsid w:val="1FA8367B"/>
+    <w:multiLevelType w:val="multilevel"/>
+    <w:tmpl w:val="9F5629B0"/>
+    <w:lvl w:ilvl="0">
+      <w:start w:val="1"/>
+      <w:numFmt w:val="bullet"/>
+      <w:lvlText w:val=""/>
+      <w:lvlJc w:val="left"/>
+      <w:pPr>
+        <w:tabs>
+          <w:tab w:val="num" w:pos="720"/>
+        </w:tabs>
+        <w:ind w:left="720" w:hanging="360"/>
+      </w:pPr>
+      <w:rPr>
+        <w:rFonts w:ascii="Symbol" w:hAnsi="Symbol" w:hint="default"/>
+        <w:sz w:val="20"/>
+      </w:rPr>
+    </w:lvl>
+    <w:lvl w:ilvl="1" w:tentative="1">
+      <w:start w:val="1"/>
+      <w:numFmt w:val="bullet"/>
+      <w:lvlText w:val="o"/>
+      <w:lvlJc w:val="left"/>
+      <w:pPr>
+        <w:tabs>
+          <w:tab w:val="num" w:pos="1440"/>
+        </w:tabs>
+        <w:ind w:left="1440" w:hanging="360"/>
+      </w:pPr>
+      <w:rPr>
+        <w:rFonts w:ascii="Courier New" w:hAnsi="Courier New" w:hint="default"/>
+        <w:sz w:val="20"/>
+      </w:rPr>
+    </w:lvl>
+    <w:lvl w:ilvl="2" w:tentative="1">
+      <w:start w:val="1"/>
+      <w:numFmt w:val="bullet"/>
+      <w:lvlText w:val=""/>
+      <w:lvlJc w:val="left"/>
+      <w:pPr>
+        <w:tabs>
+          <w:tab w:val="num" w:pos="2160"/>
+        </w:tabs>
+        <w:ind w:left="2160" w:hanging="360"/>
+      </w:pPr>
+      <w:rPr>
+        <w:rFonts w:ascii="Wingdings" w:hAnsi="Wingdings" w:hint="default"/>
+        <w:sz w:val="20"/>
+      </w:rPr>
+    </w:lvl>
+    <w:lvl w:ilvl="3" w:tentative="1">
+      <w:start w:val="1"/>
+      <w:numFmt w:val="bullet"/>
+      <w:lvlText w:val=""/>
+      <w:lvlJc w:val="left"/>
+      <w:pPr>
+        <w:tabs>
+          <w:tab w:val="num" w:pos="2880"/>
+        </w:tabs>
+        <w:ind w:left="2880" w:hanging="360"/>
+      </w:pPr>
+      <w:rPr>
+        <w:rFonts w:ascii="Wingdings" w:hAnsi="Wingdings" w:hint="default"/>
+        <w:sz w:val="20"/>
+      </w:rPr>
+    </w:lvl>
+    <w:lvl w:ilvl="4" w:tentative="1">
+      <w:start w:val="1"/>
+      <w:numFmt w:val="bullet"/>
+      <w:lvlText w:val=""/>
+      <w:lvlJc w:val="left"/>
+      <w:pPr>
+        <w:tabs>
+          <w:tab w:val="num" w:pos="3600"/>
+        </w:tabs>
+        <w:ind w:left="3600" w:hanging="360"/>
+      </w:pPr>
+      <w:rPr>
+        <w:rFonts w:ascii="Wingdings" w:hAnsi="Wingdings" w:hint="default"/>
+        <w:sz w:val="20"/>
+      </w:rPr>
+    </w:lvl>
+    <w:lvl w:ilvl="5" w:tentative="1">
+      <w:start w:val="1"/>
+      <w:numFmt w:val="bullet"/>
+      <w:lvlText w:val=""/>
+      <w:lvlJc w:val="left"/>
+      <w:pPr>
+        <w:tabs>
+          <w:tab w:val="num" w:pos="4320"/>
+        </w:tabs>
+        <w:ind w:left="4320" w:hanging="360"/>
+      </w:pPr>
+      <w:rPr>
+        <w:rFonts w:ascii="Wingdings" w:hAnsi="Wingdings" w:hint="default"/>
+        <w:sz w:val="20"/>
+      </w:rPr>
+    </w:lvl>
+    <w:lvl w:ilvl="6" w:tentative="1">
+      <w:start w:val="1"/>
+      <w:numFmt w:val="bullet"/>
+      <w:lvlText w:val=""/>
+      <w:lvlJc w:val="left"/>
+      <w:pPr>
+        <w:tabs>
+          <w:tab w:val="num" w:pos="5040"/>
+        </w:tabs>
+        <w:ind w:left="5040" w:hanging="360"/>
+      </w:pPr>
+      <w:rPr>
+        <w:rFonts w:ascii="Wingdings" w:hAnsi="Wingdings" w:hint="default"/>
+        <w:sz w:val="20"/>
+      </w:rPr>
+    </w:lvl>
+    <w:lvl w:ilvl="7" w:tentative="1">
+      <w:start w:val="1"/>
+      <w:numFmt w:val="bullet"/>
+      <w:lvlText w:val=""/>
+      <w:lvlJc w:val="left"/>
+      <w:pPr>
+        <w:tabs>
+          <w:tab w:val="num" w:pos="5760"/>
+        </w:tabs>
+        <w:ind w:left="5760" w:hanging="360"/>
+      </w:pPr>
+      <w:rPr>
+        <w:rFonts w:ascii="Wingdings" w:hAnsi="Wingdings" w:hint="default"/>
+        <w:sz w:val="20"/>
+      </w:rPr>
+    </w:lvl>
+    <w:lvl w:ilvl="8" w:tentative="1">
+      <w:start w:val="1"/>
+      <w:numFmt w:val="bullet"/>
+      <w:lvlText w:val=""/>
+      <w:lvlJc w:val="left"/>
+      <w:pPr>
+        <w:tabs>
+          <w:tab w:val="num" w:pos="6480"/>
+        </w:tabs>
+        <w:ind w:left="6480" w:hanging="360"/>
+      </w:pPr>
+      <w:rPr>
+        <w:rFonts w:ascii="Wingdings" w:hAnsi="Wingdings" w:hint="default"/>
+        <w:sz w:val="20"/>
+      </w:rPr>
+    </w:lvl>
+  </w:abstractNum>
+  <w:abstractNum w:abstractNumId="7" w15:restartNumberingAfterBreak="0">
     <w:nsid w:val="1FC16570"/>
     <w:multiLevelType w:val="multilevel"/>
     <w:tmpl w:val="8F8EE6FE"/>
@@ -6894,7 +8204,156 @@
       </w:rPr>
     </w:lvl>
   </w:abstractNum>
-  <w:abstractNum w:abstractNumId="7" w15:restartNumberingAfterBreak="0">
+  <w:abstractNum w:abstractNumId="8" w15:restartNumberingAfterBreak="0">
+    <w:nsid w:val="1FEB33DB"/>
+    <w:multiLevelType w:val="multilevel"/>
+    <w:tmpl w:val="278A3A4E"/>
+    <w:lvl w:ilvl="0">
+      <w:start w:val="1"/>
+      <w:numFmt w:val="bullet"/>
+      <w:lvlText w:val=""/>
+      <w:lvlJc w:val="left"/>
+      <w:pPr>
+        <w:tabs>
+          <w:tab w:val="num" w:pos="720"/>
+        </w:tabs>
+        <w:ind w:left="720" w:hanging="360"/>
+      </w:pPr>
+      <w:rPr>
+        <w:rFonts w:ascii="Symbol" w:hAnsi="Symbol" w:hint="default"/>
+        <w:sz w:val="20"/>
+      </w:rPr>
+    </w:lvl>
+    <w:lvl w:ilvl="1" w:tentative="1">
+      <w:start w:val="1"/>
+      <w:numFmt w:val="bullet"/>
+      <w:lvlText w:val="o"/>
+      <w:lvlJc w:val="left"/>
+      <w:pPr>
+        <w:tabs>
+          <w:tab w:val="num" w:pos="1440"/>
+        </w:tabs>
+        <w:ind w:left="1440" w:hanging="360"/>
+      </w:pPr>
+      <w:rPr>
+        <w:rFonts w:ascii="Courier New" w:hAnsi="Courier New" w:hint="default"/>
+        <w:sz w:val="20"/>
+      </w:rPr>
+    </w:lvl>
+    <w:lvl w:ilvl="2" w:tentative="1">
+      <w:start w:val="1"/>
+      <w:numFmt w:val="bullet"/>
+      <w:lvlText w:val=""/>
+      <w:lvlJc w:val="left"/>
+      <w:pPr>
+        <w:tabs>
+          <w:tab w:val="num" w:pos="2160"/>
+        </w:tabs>
+        <w:ind w:left="2160" w:hanging="360"/>
+      </w:pPr>
+      <w:rPr>
+        <w:rFonts w:ascii="Wingdings" w:hAnsi="Wingdings" w:hint="default"/>
+        <w:sz w:val="20"/>
+      </w:rPr>
+    </w:lvl>
+    <w:lvl w:ilvl="3" w:tentative="1">
+      <w:start w:val="1"/>
+      <w:numFmt w:val="bullet"/>
+      <w:lvlText w:val=""/>
+      <w:lvlJc w:val="left"/>
+      <w:pPr>
+        <w:tabs>
+          <w:tab w:val="num" w:pos="2880"/>
+        </w:tabs>
+        <w:ind w:left="2880" w:hanging="360"/>
+      </w:pPr>
+      <w:rPr>
+        <w:rFonts w:ascii="Wingdings" w:hAnsi="Wingdings" w:hint="default"/>
+        <w:sz w:val="20"/>
+      </w:rPr>
+    </w:lvl>
+    <w:lvl w:ilvl="4" w:tentative="1">
+      <w:start w:val="1"/>
+      <w:numFmt w:val="bullet"/>
+      <w:lvlText w:val=""/>
+      <w:lvlJc w:val="left"/>
+      <w:pPr>
+        <w:tabs>
+          <w:tab w:val="num" w:pos="3600"/>
+        </w:tabs>
+        <w:ind w:left="3600" w:hanging="360"/>
+      </w:pPr>
+      <w:rPr>
+        <w:rFonts w:ascii="Wingdings" w:hAnsi="Wingdings" w:hint="default"/>
+        <w:sz w:val="20"/>
+      </w:rPr>
+    </w:lvl>
+    <w:lvl w:ilvl="5" w:tentative="1">
+      <w:start w:val="1"/>
+      <w:numFmt w:val="bullet"/>
+      <w:lvlText w:val=""/>
+      <w:lvlJc w:val="left"/>
+      <w:pPr>
+        <w:tabs>
+          <w:tab w:val="num" w:pos="4320"/>
+        </w:tabs>
+        <w:ind w:left="4320" w:hanging="360"/>
+      </w:pPr>
+      <w:rPr>
+        <w:rFonts w:ascii="Wingdings" w:hAnsi="Wingdings" w:hint="default"/>
+        <w:sz w:val="20"/>
+      </w:rPr>
+    </w:lvl>
+    <w:lvl w:ilvl="6" w:tentative="1">
+      <w:start w:val="1"/>
+      <w:numFmt w:val="bullet"/>
+      <w:lvlText w:val=""/>
+      <w:lvlJc w:val="left"/>
+      <w:pPr>
+        <w:tabs>
+          <w:tab w:val="num" w:pos="5040"/>
+        </w:tabs>
+        <w:ind w:left="5040" w:hanging="360"/>
+      </w:pPr>
+      <w:rPr>
+        <w:rFonts w:ascii="Wingdings" w:hAnsi="Wingdings" w:hint="default"/>
+        <w:sz w:val="20"/>
+      </w:rPr>
+    </w:lvl>
+    <w:lvl w:ilvl="7" w:tentative="1">
+      <w:start w:val="1"/>
+      <w:numFmt w:val="bullet"/>
+      <w:lvlText w:val=""/>
+      <w:lvlJc w:val="left"/>
+      <w:pPr>
+        <w:tabs>
+          <w:tab w:val="num" w:pos="5760"/>
+        </w:tabs>
+        <w:ind w:left="5760" w:hanging="360"/>
+      </w:pPr>
+      <w:rPr>
+        <w:rFonts w:ascii="Wingdings" w:hAnsi="Wingdings" w:hint="default"/>
+        <w:sz w:val="20"/>
+      </w:rPr>
+    </w:lvl>
+    <w:lvl w:ilvl="8" w:tentative="1">
+      <w:start w:val="1"/>
+      <w:numFmt w:val="bullet"/>
+      <w:lvlText w:val=""/>
+      <w:lvlJc w:val="left"/>
+      <w:pPr>
+        <w:tabs>
+          <w:tab w:val="num" w:pos="6480"/>
+        </w:tabs>
+        <w:ind w:left="6480" w:hanging="360"/>
+      </w:pPr>
+      <w:rPr>
+        <w:rFonts w:ascii="Wingdings" w:hAnsi="Wingdings" w:hint="default"/>
+        <w:sz w:val="20"/>
+      </w:rPr>
+    </w:lvl>
+  </w:abstractNum>
+  <w:abstractNum w:abstractNumId="9" w15:restartNumberingAfterBreak="0">
     <w:nsid w:val="201E4884"/>
     <w:multiLevelType w:val="multilevel"/>
     <w:tmpl w:val="6928B060"/>
@@ -7043,7 +8502,156 @@
       </w:rPr>
     </w:lvl>
   </w:abstractNum>
-  <w:abstractNum w:abstractNumId="8" w15:restartNumberingAfterBreak="0">
+  <w:abstractNum w:abstractNumId="10" w15:restartNumberingAfterBreak="0">
+    <w:nsid w:val="21446A46"/>
+    <w:multiLevelType w:val="multilevel"/>
+    <w:tmpl w:val="8F4CF192"/>
+    <w:lvl w:ilvl="0">
+      <w:start w:val="1"/>
+      <w:numFmt w:val="bullet"/>
+      <w:lvlText w:val=""/>
+      <w:lvlJc w:val="left"/>
+      <w:pPr>
+        <w:tabs>
+          <w:tab w:val="num" w:pos="720"/>
+        </w:tabs>
+        <w:ind w:left="720" w:hanging="360"/>
+      </w:pPr>
+      <w:rPr>
+        <w:rFonts w:ascii="Symbol" w:hAnsi="Symbol" w:hint="default"/>
+        <w:sz w:val="20"/>
+      </w:rPr>
+    </w:lvl>
+    <w:lvl w:ilvl="1" w:tentative="1">
+      <w:start w:val="1"/>
+      <w:numFmt w:val="bullet"/>
+      <w:lvlText w:val="o"/>
+      <w:lvlJc w:val="left"/>
+      <w:pPr>
+        <w:tabs>
+          <w:tab w:val="num" w:pos="1440"/>
+        </w:tabs>
+        <w:ind w:left="1440" w:hanging="360"/>
+      </w:pPr>
+      <w:rPr>
+        <w:rFonts w:ascii="Courier New" w:hAnsi="Courier New" w:hint="default"/>
+        <w:sz w:val="20"/>
+      </w:rPr>
+    </w:lvl>
+    <w:lvl w:ilvl="2" w:tentative="1">
+      <w:start w:val="1"/>
+      <w:numFmt w:val="bullet"/>
+      <w:lvlText w:val=""/>
+      <w:lvlJc w:val="left"/>
+      <w:pPr>
+        <w:tabs>
+          <w:tab w:val="num" w:pos="2160"/>
+        </w:tabs>
+        <w:ind w:left="2160" w:hanging="360"/>
+      </w:pPr>
+      <w:rPr>
+        <w:rFonts w:ascii="Wingdings" w:hAnsi="Wingdings" w:hint="default"/>
+        <w:sz w:val="20"/>
+      </w:rPr>
+    </w:lvl>
+    <w:lvl w:ilvl="3" w:tentative="1">
+      <w:start w:val="1"/>
+      <w:numFmt w:val="bullet"/>
+      <w:lvlText w:val=""/>
+      <w:lvlJc w:val="left"/>
+      <w:pPr>
+        <w:tabs>
+          <w:tab w:val="num" w:pos="2880"/>
+        </w:tabs>
+        <w:ind w:left="2880" w:hanging="360"/>
+      </w:pPr>
+      <w:rPr>
+        <w:rFonts w:ascii="Wingdings" w:hAnsi="Wingdings" w:hint="default"/>
+        <w:sz w:val="20"/>
+      </w:rPr>
+    </w:lvl>
+    <w:lvl w:ilvl="4" w:tentative="1">
+      <w:start w:val="1"/>
+      <w:numFmt w:val="bullet"/>
+      <w:lvlText w:val=""/>
+      <w:lvlJc w:val="left"/>
+      <w:pPr>
+        <w:tabs>
+          <w:tab w:val="num" w:pos="3600"/>
+        </w:tabs>
+        <w:ind w:left="3600" w:hanging="360"/>
+      </w:pPr>
+      <w:rPr>
+        <w:rFonts w:ascii="Wingdings" w:hAnsi="Wingdings" w:hint="default"/>
+        <w:sz w:val="20"/>
+      </w:rPr>
+    </w:lvl>
+    <w:lvl w:ilvl="5" w:tentative="1">
+      <w:start w:val="1"/>
+      <w:numFmt w:val="bullet"/>
+      <w:lvlText w:val=""/>
+      <w:lvlJc w:val="left"/>
+      <w:pPr>
+        <w:tabs>
+          <w:tab w:val="num" w:pos="4320"/>
+        </w:tabs>
+        <w:ind w:left="4320" w:hanging="360"/>
+      </w:pPr>
+      <w:rPr>
+        <w:rFonts w:ascii="Wingdings" w:hAnsi="Wingdings" w:hint="default"/>
+        <w:sz w:val="20"/>
+      </w:rPr>
+    </w:lvl>
+    <w:lvl w:ilvl="6" w:tentative="1">
+      <w:start w:val="1"/>
+      <w:numFmt w:val="bullet"/>
+      <w:lvlText w:val=""/>
+      <w:lvlJc w:val="left"/>
+      <w:pPr>
+        <w:tabs>
+          <w:tab w:val="num" w:pos="5040"/>
+        </w:tabs>
+        <w:ind w:left="5040" w:hanging="360"/>
+      </w:pPr>
+      <w:rPr>
+        <w:rFonts w:ascii="Wingdings" w:hAnsi="Wingdings" w:hint="default"/>
+        <w:sz w:val="20"/>
+      </w:rPr>
+    </w:lvl>
+    <w:lvl w:ilvl="7" w:tentative="1">
+      <w:start w:val="1"/>
+      <w:numFmt w:val="bullet"/>
+      <w:lvlText w:val=""/>
+      <w:lvlJc w:val="left"/>
+      <w:pPr>
+        <w:tabs>
+          <w:tab w:val="num" w:pos="5760"/>
+        </w:tabs>
+        <w:ind w:left="5760" w:hanging="360"/>
+      </w:pPr>
+      <w:rPr>
+        <w:rFonts w:ascii="Wingdings" w:hAnsi="Wingdings" w:hint="default"/>
+        <w:sz w:val="20"/>
+      </w:rPr>
+    </w:lvl>
+    <w:lvl w:ilvl="8" w:tentative="1">
+      <w:start w:val="1"/>
+      <w:numFmt w:val="bullet"/>
+      <w:lvlText w:val=""/>
+      <w:lvlJc w:val="left"/>
+      <w:pPr>
+        <w:tabs>
+          <w:tab w:val="num" w:pos="6480"/>
+        </w:tabs>
+        <w:ind w:left="6480" w:hanging="360"/>
+      </w:pPr>
+      <w:rPr>
+        <w:rFonts w:ascii="Wingdings" w:hAnsi="Wingdings" w:hint="default"/>
+        <w:sz w:val="20"/>
+      </w:rPr>
+    </w:lvl>
+  </w:abstractNum>
+  <w:abstractNum w:abstractNumId="11" w15:restartNumberingAfterBreak="0">
     <w:nsid w:val="245A4EBB"/>
     <w:multiLevelType w:val="hybridMultilevel"/>
     <w:tmpl w:val="AF2CA396"/>
@@ -7155,7 +8763,7 @@
       </w:rPr>
     </w:lvl>
   </w:abstractNum>
-  <w:abstractNum w:abstractNumId="9" w15:restartNumberingAfterBreak="0">
+  <w:abstractNum w:abstractNumId="12" w15:restartNumberingAfterBreak="0">
     <w:nsid w:val="28BC5CB1"/>
     <w:multiLevelType w:val="multilevel"/>
     <w:tmpl w:val="9EB28D50"/>
@@ -7304,7 +8912,7 @@
       </w:rPr>
     </w:lvl>
   </w:abstractNum>
-  <w:abstractNum w:abstractNumId="10" w15:restartNumberingAfterBreak="0">
+  <w:abstractNum w:abstractNumId="13" w15:restartNumberingAfterBreak="0">
     <w:nsid w:val="38EE374B"/>
     <w:multiLevelType w:val="multilevel"/>
     <w:tmpl w:val="FFA8691C"/>
@@ -7453,7 +9061,7 @@
       </w:rPr>
     </w:lvl>
   </w:abstractNum>
-  <w:abstractNum w:abstractNumId="11" w15:restartNumberingAfterBreak="0">
+  <w:abstractNum w:abstractNumId="14" w15:restartNumberingAfterBreak="0">
     <w:nsid w:val="3A9A68C4"/>
     <w:multiLevelType w:val="multilevel"/>
     <w:tmpl w:val="DECA6C2C"/>
@@ -7566,7 +9174,7 @@
       </w:pPr>
     </w:lvl>
   </w:abstractNum>
-  <w:abstractNum w:abstractNumId="12" w15:restartNumberingAfterBreak="0">
+  <w:abstractNum w:abstractNumId="15" w15:restartNumberingAfterBreak="0">
     <w:nsid w:val="3D6746BC"/>
     <w:multiLevelType w:val="multilevel"/>
     <w:tmpl w:val="B0903B76"/>
@@ -7679,7 +9287,7 @@
       </w:pPr>
     </w:lvl>
   </w:abstractNum>
-  <w:abstractNum w:abstractNumId="13" w15:restartNumberingAfterBreak="0">
+  <w:abstractNum w:abstractNumId="16" w15:restartNumberingAfterBreak="0">
     <w:nsid w:val="421B514B"/>
     <w:multiLevelType w:val="multilevel"/>
     <w:tmpl w:val="FE267C56"/>
@@ -7824,7 +9432,7 @@
       </w:rPr>
     </w:lvl>
   </w:abstractNum>
-  <w:abstractNum w:abstractNumId="14" w15:restartNumberingAfterBreak="0">
+  <w:abstractNum w:abstractNumId="17" w15:restartNumberingAfterBreak="0">
     <w:nsid w:val="48703DAC"/>
     <w:multiLevelType w:val="multilevel"/>
     <w:tmpl w:val="763EB722"/>
@@ -7973,7 +9581,7 @@
       </w:rPr>
     </w:lvl>
   </w:abstractNum>
-  <w:abstractNum w:abstractNumId="15" w15:restartNumberingAfterBreak="0">
+  <w:abstractNum w:abstractNumId="18" w15:restartNumberingAfterBreak="0">
     <w:nsid w:val="50AD39B5"/>
     <w:multiLevelType w:val="multilevel"/>
     <w:tmpl w:val="17DA6AF4"/>
@@ -8122,7 +9730,7 @@
       </w:rPr>
     </w:lvl>
   </w:abstractNum>
-  <w:abstractNum w:abstractNumId="16" w15:restartNumberingAfterBreak="0">
+  <w:abstractNum w:abstractNumId="19" w15:restartNumberingAfterBreak="0">
     <w:nsid w:val="588815ED"/>
     <w:multiLevelType w:val="multilevel"/>
     <w:tmpl w:val="CFFC8BF4"/>
@@ -8235,7 +9843,7 @@
       </w:pPr>
     </w:lvl>
   </w:abstractNum>
-  <w:abstractNum w:abstractNumId="17" w15:restartNumberingAfterBreak="0">
+  <w:abstractNum w:abstractNumId="20" w15:restartNumberingAfterBreak="0">
     <w:nsid w:val="62192D69"/>
     <w:multiLevelType w:val="multilevel"/>
     <w:tmpl w:val="BD829D5C"/>
@@ -8384,7 +9992,7 @@
       </w:rPr>
     </w:lvl>
   </w:abstractNum>
-  <w:abstractNum w:abstractNumId="18" w15:restartNumberingAfterBreak="0">
+  <w:abstractNum w:abstractNumId="21" w15:restartNumberingAfterBreak="0">
     <w:nsid w:val="62812D66"/>
     <w:multiLevelType w:val="multilevel"/>
     <w:tmpl w:val="D3F6393A"/>
@@ -8501,7 +10109,7 @@
       </w:pPr>
     </w:lvl>
   </w:abstractNum>
-  <w:abstractNum w:abstractNumId="19" w15:restartNumberingAfterBreak="0">
+  <w:abstractNum w:abstractNumId="22" w15:restartNumberingAfterBreak="0">
     <w:nsid w:val="66372309"/>
     <w:multiLevelType w:val="multilevel"/>
     <w:tmpl w:val="95D8FCAE"/>
@@ -8650,7 +10258,269 @@
       </w:rPr>
     </w:lvl>
   </w:abstractNum>
-  <w:abstractNum w:abstractNumId="20" w15:restartNumberingAfterBreak="0">
+  <w:abstractNum w:abstractNumId="23" w15:restartNumberingAfterBreak="0">
+    <w:nsid w:val="7490043A"/>
+    <w:multiLevelType w:val="multilevel"/>
+    <w:tmpl w:val="B78600C4"/>
+    <w:lvl w:ilvl="0">
+      <w:start w:val="1"/>
+      <w:numFmt w:val="decimal"/>
+      <w:lvlText w:val="%1."/>
+      <w:lvlJc w:val="left"/>
+      <w:pPr>
+        <w:tabs>
+          <w:tab w:val="num" w:pos="720"/>
+        </w:tabs>
+        <w:ind w:left="720" w:hanging="360"/>
+      </w:pPr>
+    </w:lvl>
+    <w:lvl w:ilvl="1" w:tentative="1">
+      <w:start w:val="1"/>
+      <w:numFmt w:val="decimal"/>
+      <w:lvlText w:val="%2."/>
+      <w:lvlJc w:val="left"/>
+      <w:pPr>
+        <w:tabs>
+          <w:tab w:val="num" w:pos="1440"/>
+        </w:tabs>
+        <w:ind w:left="1440" w:hanging="360"/>
+      </w:pPr>
+    </w:lvl>
+    <w:lvl w:ilvl="2" w:tentative="1">
+      <w:start w:val="1"/>
+      <w:numFmt w:val="decimal"/>
+      <w:lvlText w:val="%3."/>
+      <w:lvlJc w:val="left"/>
+      <w:pPr>
+        <w:tabs>
+          <w:tab w:val="num" w:pos="2160"/>
+        </w:tabs>
+        <w:ind w:left="2160" w:hanging="360"/>
+      </w:pPr>
+    </w:lvl>
+    <w:lvl w:ilvl="3" w:tentative="1">
+      <w:start w:val="1"/>
+      <w:numFmt w:val="decimal"/>
+      <w:lvlText w:val="%4."/>
+      <w:lvlJc w:val="left"/>
+      <w:pPr>
+        <w:tabs>
+          <w:tab w:val="num" w:pos="2880"/>
+        </w:tabs>
+        <w:ind w:left="2880" w:hanging="360"/>
+      </w:pPr>
+    </w:lvl>
+    <w:lvl w:ilvl="4" w:tentative="1">
+      <w:start w:val="1"/>
+      <w:numFmt w:val="decimal"/>
+      <w:lvlText w:val="%5."/>
+      <w:lvlJc w:val="left"/>
+      <w:pPr>
+        <w:tabs>
+          <w:tab w:val="num" w:pos="3600"/>
+        </w:tabs>
+        <w:ind w:left="3600" w:hanging="360"/>
+      </w:pPr>
+    </w:lvl>
+    <w:lvl w:ilvl="5" w:tentative="1">
+      <w:start w:val="1"/>
+      <w:numFmt w:val="decimal"/>
+      <w:lvlText w:val="%6."/>
+      <w:lvlJc w:val="left"/>
+      <w:pPr>
+        <w:tabs>
+          <w:tab w:val="num" w:pos="4320"/>
+        </w:tabs>
+        <w:ind w:left="4320" w:hanging="360"/>
+      </w:pPr>
+    </w:lvl>
+    <w:lvl w:ilvl="6" w:tentative="1">
+      <w:start w:val="1"/>
+      <w:numFmt w:val="decimal"/>
+      <w:lvlText w:val="%7."/>
+      <w:lvlJc w:val="left"/>
+      <w:pPr>
+        <w:tabs>
+          <w:tab w:val="num" w:pos="5040"/>
+        </w:tabs>
+        <w:ind w:left="5040" w:hanging="360"/>
+      </w:pPr>
+    </w:lvl>
+    <w:lvl w:ilvl="7" w:tentative="1">
+      <w:start w:val="1"/>
+      <w:numFmt w:val="decimal"/>
+      <w:lvlText w:val="%8."/>
+      <w:lvlJc w:val="left"/>
+      <w:pPr>
+        <w:tabs>
+          <w:tab w:val="num" w:pos="5760"/>
+        </w:tabs>
+        <w:ind w:left="5760" w:hanging="360"/>
+      </w:pPr>
+    </w:lvl>
+    <w:lvl w:ilvl="8" w:tentative="1">
+      <w:start w:val="1"/>
+      <w:numFmt w:val="decimal"/>
+      <w:lvlText w:val="%9."/>
+      <w:lvlJc w:val="left"/>
+      <w:pPr>
+        <w:tabs>
+          <w:tab w:val="num" w:pos="6480"/>
+        </w:tabs>
+        <w:ind w:left="6480" w:hanging="360"/>
+      </w:pPr>
+    </w:lvl>
+  </w:abstractNum>
+  <w:abstractNum w:abstractNumId="24" w15:restartNumberingAfterBreak="0">
+    <w:nsid w:val="777C2DEE"/>
+    <w:multiLevelType w:val="multilevel"/>
+    <w:tmpl w:val="66740FE6"/>
+    <w:lvl w:ilvl="0">
+      <w:start w:val="1"/>
+      <w:numFmt w:val="bullet"/>
+      <w:lvlText w:val=""/>
+      <w:lvlJc w:val="left"/>
+      <w:pPr>
+        <w:tabs>
+          <w:tab w:val="num" w:pos="720"/>
+        </w:tabs>
+        <w:ind w:left="720" w:hanging="360"/>
+      </w:pPr>
+      <w:rPr>
+        <w:rFonts w:ascii="Symbol" w:hAnsi="Symbol" w:hint="default"/>
+        <w:sz w:val="20"/>
+      </w:rPr>
+    </w:lvl>
+    <w:lvl w:ilvl="1" w:tentative="1">
+      <w:start w:val="1"/>
+      <w:numFmt w:val="bullet"/>
+      <w:lvlText w:val="o"/>
+      <w:lvlJc w:val="left"/>
+      <w:pPr>
+        <w:tabs>
+          <w:tab w:val="num" w:pos="1440"/>
+        </w:tabs>
+        <w:ind w:left="1440" w:hanging="360"/>
+      </w:pPr>
+      <w:rPr>
+        <w:rFonts w:ascii="Courier New" w:hAnsi="Courier New" w:hint="default"/>
+        <w:sz w:val="20"/>
+      </w:rPr>
+    </w:lvl>
+    <w:lvl w:ilvl="2" w:tentative="1">
+      <w:start w:val="1"/>
+      <w:numFmt w:val="bullet"/>
+      <w:lvlText w:val=""/>
+      <w:lvlJc w:val="left"/>
+      <w:pPr>
+        <w:tabs>
+          <w:tab w:val="num" w:pos="2160"/>
+        </w:tabs>
+        <w:ind w:left="2160" w:hanging="360"/>
+      </w:pPr>
+      <w:rPr>
+        <w:rFonts w:ascii="Wingdings" w:hAnsi="Wingdings" w:hint="default"/>
+        <w:sz w:val="20"/>
+      </w:rPr>
+    </w:lvl>
+    <w:lvl w:ilvl="3" w:tentative="1">
+      <w:start w:val="1"/>
+      <w:numFmt w:val="bullet"/>
+      <w:lvlText w:val=""/>
+      <w:lvlJc w:val="left"/>
+      <w:pPr>
+        <w:tabs>
+          <w:tab w:val="num" w:pos="2880"/>
+        </w:tabs>
+        <w:ind w:left="2880" w:hanging="360"/>
+      </w:pPr>
+      <w:rPr>
+        <w:rFonts w:ascii="Wingdings" w:hAnsi="Wingdings" w:hint="default"/>
+        <w:sz w:val="20"/>
+      </w:rPr>
+    </w:lvl>
+    <w:lvl w:ilvl="4" w:tentative="1">
+      <w:start w:val="1"/>
+      <w:numFmt w:val="bullet"/>
+      <w:lvlText w:val=""/>
+      <w:lvlJc w:val="left"/>
+      <w:pPr>
+        <w:tabs>
+          <w:tab w:val="num" w:pos="3600"/>
+        </w:tabs>
+        <w:ind w:left="3600" w:hanging="360"/>
+      </w:pPr>
+      <w:rPr>
+        <w:rFonts w:ascii="Wingdings" w:hAnsi="Wingdings" w:hint="default"/>
+        <w:sz w:val="20"/>
+      </w:rPr>
+    </w:lvl>
+    <w:lvl w:ilvl="5" w:tentative="1">
+      <w:start w:val="1"/>
+      <w:numFmt w:val="bullet"/>
+      <w:lvlText w:val=""/>
+      <w:lvlJc w:val="left"/>
+      <w:pPr>
+        <w:tabs>
+          <w:tab w:val="num" w:pos="4320"/>
+        </w:tabs>
+        <w:ind w:left="4320" w:hanging="360"/>
+      </w:pPr>
+      <w:rPr>
+        <w:rFonts w:ascii="Wingdings" w:hAnsi="Wingdings" w:hint="default"/>
+        <w:sz w:val="20"/>
+      </w:rPr>
+    </w:lvl>
+    <w:lvl w:ilvl="6" w:tentative="1">
+      <w:start w:val="1"/>
+      <w:numFmt w:val="bullet"/>
+      <w:lvlText w:val=""/>
+      <w:lvlJc w:val="left"/>
+      <w:pPr>
+        <w:tabs>
+          <w:tab w:val="num" w:pos="5040"/>
+        </w:tabs>
+        <w:ind w:left="5040" w:hanging="360"/>
+      </w:pPr>
+      <w:rPr>
+        <w:rFonts w:ascii="Wingdings" w:hAnsi="Wingdings" w:hint="default"/>
+        <w:sz w:val="20"/>
+      </w:rPr>
+    </w:lvl>
+    <w:lvl w:ilvl="7" w:tentative="1">
+      <w:start w:val="1"/>
+      <w:numFmt w:val="bullet"/>
+      <w:lvlText w:val=""/>
+      <w:lvlJc w:val="left"/>
+      <w:pPr>
+        <w:tabs>
+          <w:tab w:val="num" w:pos="5760"/>
+        </w:tabs>
+        <w:ind w:left="5760" w:hanging="360"/>
+      </w:pPr>
+      <w:rPr>
+        <w:rFonts w:ascii="Wingdings" w:hAnsi="Wingdings" w:hint="default"/>
+        <w:sz w:val="20"/>
+      </w:rPr>
+    </w:lvl>
+    <w:lvl w:ilvl="8" w:tentative="1">
+      <w:start w:val="1"/>
+      <w:numFmt w:val="bullet"/>
+      <w:lvlText w:val=""/>
+      <w:lvlJc w:val="left"/>
+      <w:pPr>
+        <w:tabs>
+          <w:tab w:val="num" w:pos="6480"/>
+        </w:tabs>
+        <w:ind w:left="6480" w:hanging="360"/>
+      </w:pPr>
+      <w:rPr>
+        <w:rFonts w:ascii="Wingdings" w:hAnsi="Wingdings" w:hint="default"/>
+        <w:sz w:val="20"/>
+      </w:rPr>
+    </w:lvl>
+  </w:abstractNum>
+  <w:abstractNum w:abstractNumId="25" w15:restartNumberingAfterBreak="0">
     <w:nsid w:val="78D969FB"/>
     <w:multiLevelType w:val="multilevel"/>
     <w:tmpl w:val="0D000B3A"/>
@@ -8799,7 +10669,7 @@
       </w:rPr>
     </w:lvl>
   </w:abstractNum>
-  <w:abstractNum w:abstractNumId="21" w15:restartNumberingAfterBreak="0">
+  <w:abstractNum w:abstractNumId="26" w15:restartNumberingAfterBreak="0">
     <w:nsid w:val="796F6D28"/>
     <w:multiLevelType w:val="multilevel"/>
     <w:tmpl w:val="D31EC47E"/>
@@ -8952,55 +10822,55 @@
     <w:abstractNumId w:val="1"/>
   </w:num>
   <w:num w:numId="2">
-    <w:abstractNumId w:val="8"/>
+    <w:abstractNumId w:val="11"/>
   </w:num>
   <w:num w:numId="3">
-    <w:abstractNumId w:val="18"/>
+    <w:abstractNumId w:val="21"/>
   </w:num>
   <w:num w:numId="4">
-    <w:abstractNumId w:val="17"/>
+    <w:abstractNumId w:val="20"/>
   </w:num>
   <w:num w:numId="5">
-    <w:abstractNumId w:val="6"/>
+    <w:abstractNumId w:val="7"/>
   </w:num>
   <w:num w:numId="6">
     <w:abstractNumId w:val="5"/>
   </w:num>
   <w:num w:numId="7">
-    <w:abstractNumId w:val="21"/>
+    <w:abstractNumId w:val="26"/>
   </w:num>
   <w:num w:numId="8">
-    <w:abstractNumId w:val="9"/>
+    <w:abstractNumId w:val="12"/>
   </w:num>
   <w:num w:numId="9">
-    <w:abstractNumId w:val="19"/>
+    <w:abstractNumId w:val="22"/>
   </w:num>
   <w:num w:numId="10">
     <w:abstractNumId w:val="3"/>
   </w:num>
   <w:num w:numId="11">
-    <w:abstractNumId w:val="20"/>
+    <w:abstractNumId w:val="25"/>
   </w:num>
   <w:num w:numId="12">
-    <w:abstractNumId w:val="10"/>
+    <w:abstractNumId w:val="13"/>
   </w:num>
   <w:num w:numId="13">
-    <w:abstractNumId w:val="16"/>
+    <w:abstractNumId w:val="19"/>
   </w:num>
   <w:num w:numId="14">
-    <w:abstractNumId w:val="12"/>
+    <w:abstractNumId w:val="15"/>
   </w:num>
   <w:num w:numId="15">
-    <w:abstractNumId w:val="15"/>
+    <w:abstractNumId w:val="18"/>
   </w:num>
   <w:num w:numId="16">
     <w:abstractNumId w:val="2"/>
   </w:num>
   <w:num w:numId="17">
-    <w:abstractNumId w:val="13"/>
+    <w:abstractNumId w:val="16"/>
   </w:num>
   <w:num w:numId="18">
-    <w:abstractNumId w:val="14"/>
+    <w:abstractNumId w:val="17"/>
   </w:num>
   <w:num w:numId="19">
     <w:abstractNumId w:val="0"/>
@@ -9009,10 +10879,25 @@
     <w:abstractNumId w:val="4"/>
   </w:num>
   <w:num w:numId="21">
-    <w:abstractNumId w:val="11"/>
+    <w:abstractNumId w:val="14"/>
   </w:num>
   <w:num w:numId="22">
-    <w:abstractNumId w:val="7"/>
+    <w:abstractNumId w:val="9"/>
+  </w:num>
+  <w:num w:numId="23">
+    <w:abstractNumId w:val="6"/>
+  </w:num>
+  <w:num w:numId="24">
+    <w:abstractNumId w:val="10"/>
+  </w:num>
+  <w:num w:numId="25">
+    <w:abstractNumId w:val="24"/>
+  </w:num>
+  <w:num w:numId="26">
+    <w:abstractNumId w:val="8"/>
+  </w:num>
+  <w:num w:numId="27">
+    <w:abstractNumId w:val="23"/>
   </w:num>
 </w:numbering>
 </file>
@@ -9418,6 +11303,29 @@
     <w:name w:val="Normal"/>
     <w:qFormat/>
   </w:style>
+  <w:style w:type="paragraph" w:styleId="Ttulo2">
+    <w:name w:val="heading 2"/>
+    <w:basedOn w:val="Normal"/>
+    <w:next w:val="Normal"/>
+    <w:link w:val="Ttulo2Char"/>
+    <w:uiPriority w:val="9"/>
+    <w:semiHidden/>
+    <w:unhideWhenUsed/>
+    <w:qFormat/>
+    <w:rsid w:val="003C02DF"/>
+    <w:pPr>
+      <w:keepNext/>
+      <w:keepLines/>
+      <w:spacing w:before="40" w:after="0"/>
+      <w:outlineLvl w:val="1"/>
+    </w:pPr>
+    <w:rPr>
+      <w:rFonts w:asciiTheme="majorHAnsi" w:eastAsiaTheme="majorEastAsia" w:hAnsiTheme="majorHAnsi" w:cstheme="majorBidi"/>
+      <w:color w:val="2F5496" w:themeColor="accent1" w:themeShade="BF"/>
+      <w:sz w:val="26"/>
+      <w:szCs w:val="26"/>
+    </w:rPr>
+  </w:style>
   <w:style w:type="paragraph" w:styleId="Ttulo3">
     <w:name w:val="heading 3"/>
     <w:basedOn w:val="Normal"/>
@@ -9536,6 +11444,52 @@
       <w:rFonts w:ascii="Courier New" w:eastAsia="Times New Roman" w:hAnsi="Courier New" w:cs="Courier New"/>
       <w:sz w:val="20"/>
       <w:szCs w:val="20"/>
+    </w:rPr>
+  </w:style>
+  <w:style w:type="character" w:customStyle="1" w:styleId="Ttulo2Char">
+    <w:name w:val="Título 2 Char"/>
+    <w:basedOn w:val="Fontepargpadro"/>
+    <w:link w:val="Ttulo2"/>
+    <w:uiPriority w:val="9"/>
+    <w:semiHidden/>
+    <w:rsid w:val="003C02DF"/>
+    <w:rPr>
+      <w:rFonts w:asciiTheme="majorHAnsi" w:eastAsiaTheme="majorEastAsia" w:hAnsiTheme="majorHAnsi" w:cstheme="majorBidi"/>
+      <w:color w:val="2F5496" w:themeColor="accent1" w:themeShade="BF"/>
+      <w:sz w:val="26"/>
+      <w:szCs w:val="26"/>
+    </w:rPr>
+  </w:style>
+  <w:style w:type="character" w:customStyle="1" w:styleId="font-semibold">
+    <w:name w:val="font-semibold"/>
+    <w:basedOn w:val="Fontepargpadro"/>
+    <w:rsid w:val="003C02DF"/>
+  </w:style>
+  <w:style w:type="character" w:styleId="nfase">
+    <w:name w:val="Emphasis"/>
+    <w:basedOn w:val="Fontepargpadro"/>
+    <w:uiPriority w:val="20"/>
+    <w:qFormat/>
+    <w:rsid w:val="003C02DF"/>
+    <w:rPr>
+      <w:i/>
+      <w:iCs/>
+    </w:rPr>
+  </w:style>
+  <w:style w:type="paragraph" w:customStyle="1" w:styleId="py-0">
+    <w:name w:val="py-0"/>
+    <w:basedOn w:val="Normal"/>
+    <w:rsid w:val="003C02DF"/>
+    <w:pPr>
+      <w:spacing w:before="100" w:beforeAutospacing="1" w:after="100" w:afterAutospacing="1" w:line="240" w:lineRule="auto"/>
+    </w:pPr>
+    <w:rPr>
+      <w:rFonts w:ascii="Times New Roman" w:eastAsia="Times New Roman" w:hAnsi="Times New Roman" w:cs="Times New Roman"/>
+      <w:kern w:val="0"/>
+      <w:sz w:val="24"/>
+      <w:szCs w:val="24"/>
+      <w:lang w:eastAsia="pt-BR"/>
+      <w14:ligatures w14:val="none"/>
     </w:rPr>
   </w:style>
 </w:styles>

</xml_diff>

<commit_message>
Alteração de nome interno para facildoc
</commit_message>
<xml_diff>
--- a/planejamento/planejamento.docx
+++ b/planejamento/planejamento.docx
@@ -12751,7 +12751,7 @@
     <w:p>
       <w:r>
         <w:pict w14:anchorId="059A2F04">
-          <v:rect id="_x0000_i1058" style="width:0;height:1.5pt" o:hralign="center" o:hrstd="t" o:hr="t" fillcolor="#a0a0a0" stroked="f"/>
+          <v:rect id="_x0000_i1044" style="width:0;height:1.5pt" o:hralign="center" o:hrstd="t" o:hr="t" fillcolor="#a0a0a0" stroked="f"/>
         </w:pict>
       </w:r>
     </w:p>
@@ -13330,7 +13330,7 @@
     <w:p>
       <w:r>
         <w:pict w14:anchorId="070A4D5A">
-          <v:rect id="_x0000_i1059" style="width:0;height:1.5pt" o:hralign="center" o:hrstd="t" o:hr="t" fillcolor="#a0a0a0" stroked="f"/>
+          <v:rect id="_x0000_i1045" style="width:0;height:1.5pt" o:hralign="center" o:hrstd="t" o:hr="t" fillcolor="#a0a0a0" stroked="f"/>
         </w:pict>
       </w:r>
     </w:p>
@@ -13517,7 +13517,7 @@
     <w:p>
       <w:r>
         <w:pict w14:anchorId="31461F35">
-          <v:rect id="_x0000_i1060" style="width:0;height:1.5pt" o:hralign="center" o:hrstd="t" o:hr="t" fillcolor="#a0a0a0" stroked="f"/>
+          <v:rect id="_x0000_i1046" style="width:0;height:1.5pt" o:hralign="center" o:hrstd="t" o:hr="t" fillcolor="#a0a0a0" stroked="f"/>
         </w:pict>
       </w:r>
     </w:p>
@@ -13711,9 +13711,9 @@
       <w:lvlJc w:val="left"/>
       <w:pPr>
         <w:tabs>
-          <w:tab w:val="num" w:pos="720"/>
-        </w:tabs>
-        <w:ind w:left="720" w:hanging="360"/>
+          <w:tab w:val="num" w:pos="643"/>
+        </w:tabs>
+        <w:ind w:left="643" w:hanging="360"/>
       </w:pPr>
     </w:lvl>
     <w:lvl w:ilvl="1">
@@ -13723,9 +13723,9 @@
       <w:lvlJc w:val="left"/>
       <w:pPr>
         <w:tabs>
-          <w:tab w:val="num" w:pos="1440"/>
-        </w:tabs>
-        <w:ind w:left="1440" w:hanging="360"/>
+          <w:tab w:val="num" w:pos="1363"/>
+        </w:tabs>
+        <w:ind w:left="1363" w:hanging="360"/>
       </w:pPr>
       <w:rPr>
         <w:rFonts w:ascii="Courier New" w:hAnsi="Courier New" w:hint="default"/>
@@ -13739,9 +13739,9 @@
       <w:lvlJc w:val="left"/>
       <w:pPr>
         <w:tabs>
-          <w:tab w:val="num" w:pos="2160"/>
-        </w:tabs>
-        <w:ind w:left="2160" w:hanging="360"/>
+          <w:tab w:val="num" w:pos="2083"/>
+        </w:tabs>
+        <w:ind w:left="2083" w:hanging="360"/>
       </w:pPr>
       <w:rPr>
         <w:rFonts w:ascii="Wingdings" w:hAnsi="Wingdings" w:hint="default"/>
@@ -13755,9 +13755,9 @@
       <w:lvlJc w:val="left"/>
       <w:pPr>
         <w:tabs>
-          <w:tab w:val="num" w:pos="2880"/>
-        </w:tabs>
-        <w:ind w:left="2880" w:hanging="360"/>
+          <w:tab w:val="num" w:pos="2803"/>
+        </w:tabs>
+        <w:ind w:left="2803" w:hanging="360"/>
       </w:pPr>
     </w:lvl>
     <w:lvl w:ilvl="4" w:tentative="1">
@@ -13767,9 +13767,9 @@
       <w:lvlJc w:val="left"/>
       <w:pPr>
         <w:tabs>
-          <w:tab w:val="num" w:pos="3600"/>
-        </w:tabs>
-        <w:ind w:left="3600" w:hanging="360"/>
+          <w:tab w:val="num" w:pos="3523"/>
+        </w:tabs>
+        <w:ind w:left="3523" w:hanging="360"/>
       </w:pPr>
     </w:lvl>
     <w:lvl w:ilvl="5" w:tentative="1">
@@ -13779,9 +13779,9 @@
       <w:lvlJc w:val="left"/>
       <w:pPr>
         <w:tabs>
-          <w:tab w:val="num" w:pos="4320"/>
-        </w:tabs>
-        <w:ind w:left="4320" w:hanging="360"/>
+          <w:tab w:val="num" w:pos="4243"/>
+        </w:tabs>
+        <w:ind w:left="4243" w:hanging="360"/>
       </w:pPr>
     </w:lvl>
     <w:lvl w:ilvl="6" w:tentative="1">
@@ -13791,9 +13791,9 @@
       <w:lvlJc w:val="left"/>
       <w:pPr>
         <w:tabs>
-          <w:tab w:val="num" w:pos="5040"/>
-        </w:tabs>
-        <w:ind w:left="5040" w:hanging="360"/>
+          <w:tab w:val="num" w:pos="4963"/>
+        </w:tabs>
+        <w:ind w:left="4963" w:hanging="360"/>
       </w:pPr>
     </w:lvl>
     <w:lvl w:ilvl="7" w:tentative="1">
@@ -13803,9 +13803,9 @@
       <w:lvlJc w:val="left"/>
       <w:pPr>
         <w:tabs>
-          <w:tab w:val="num" w:pos="5760"/>
-        </w:tabs>
-        <w:ind w:left="5760" w:hanging="360"/>
+          <w:tab w:val="num" w:pos="5683"/>
+        </w:tabs>
+        <w:ind w:left="5683" w:hanging="360"/>
       </w:pPr>
     </w:lvl>
     <w:lvl w:ilvl="8" w:tentative="1">
@@ -13815,9 +13815,9 @@
       <w:lvlJc w:val="left"/>
       <w:pPr>
         <w:tabs>
-          <w:tab w:val="num" w:pos="6480"/>
-        </w:tabs>
-        <w:ind w:left="6480" w:hanging="360"/>
+          <w:tab w:val="num" w:pos="6403"/>
+        </w:tabs>
+        <w:ind w:left="6403" w:hanging="360"/>
       </w:pPr>
     </w:lvl>
   </w:abstractNum>

</xml_diff>

<commit_message>
Melhoria de 'aviso legal' importante
</commit_message>
<xml_diff>
--- a/planejamento/planejamento.docx
+++ b/planejamento/planejamento.docx
@@ -521,31 +521,7 @@
           <w:lang w:eastAsia="pt-BR"/>
           <w14:ligatures w14:val="none"/>
         </w:rPr>
-        <w:t>Armazenar o contrato na nuvem (</w:t>
-      </w:r>
-      <w:proofErr w:type="spellStart"/>
-      <w:r>
-        <w:rPr>
-          <w:rFonts w:ascii="Times New Roman" w:eastAsia="Times New Roman" w:hAnsi="Times New Roman" w:cs="Times New Roman"/>
-          <w:kern w:val="0"/>
-          <w:sz w:val="24"/>
-          <w:szCs w:val="24"/>
-          <w:lang w:eastAsia="pt-BR"/>
-          <w14:ligatures w14:val="none"/>
-        </w:rPr>
-        <w:t>Firebase</w:t>
-      </w:r>
-      <w:proofErr w:type="spellEnd"/>
-      <w:r>
-        <w:rPr>
-          <w:rFonts w:ascii="Times New Roman" w:eastAsia="Times New Roman" w:hAnsi="Times New Roman" w:cs="Times New Roman"/>
-          <w:kern w:val="0"/>
-          <w:sz w:val="24"/>
-          <w:szCs w:val="24"/>
-          <w:lang w:eastAsia="pt-BR"/>
-          <w14:ligatures w14:val="none"/>
-        </w:rPr>
-        <w:t>).</w:t>
+        <w:t>Armazenar o contrato na nuvem (Firebase).</w:t>
       </w:r>
     </w:p>
     <w:p>
@@ -792,15 +768,7 @@
         <w:t>assinatura na tela</w:t>
       </w:r>
       <w:r>
-        <w:t xml:space="preserve"> (</w:t>
-      </w:r>
-      <w:proofErr w:type="spellStart"/>
-      <w:r>
-        <w:t>canvas</w:t>
-      </w:r>
-      <w:proofErr w:type="spellEnd"/>
-      <w:r>
-        <w:t>).</w:t>
+        <w:t xml:space="preserve"> (canvas).</w:t>
       </w:r>
     </w:p>
     <w:p>
@@ -846,15 +814,7 @@
         <w:pStyle w:val="Ttulo3"/>
       </w:pPr>
       <w:r>
-        <w:t xml:space="preserve">3. Organização por Clientes (O </w:t>
-      </w:r>
-      <w:proofErr w:type="spellStart"/>
-      <w:r>
-        <w:t>mini-CRM</w:t>
-      </w:r>
-      <w:proofErr w:type="spellEnd"/>
-      <w:r>
-        <w:t>)</w:t>
+        <w:t>3. Organização por Clientes (O mini-CRM)</w:t>
       </w:r>
     </w:p>
     <w:p>
@@ -881,15 +841,7 @@
         <w:t>Melhoria:</w:t>
       </w:r>
       <w:r>
-        <w:t xml:space="preserve"> Use o </w:t>
-      </w:r>
-      <w:proofErr w:type="spellStart"/>
-      <w:r>
-        <w:t>Firebase</w:t>
-      </w:r>
-      <w:proofErr w:type="spellEnd"/>
-      <w:r>
-        <w:t xml:space="preserve"> para criar um "Histórico de Contratos". O usuário faz login e vê: </w:t>
+        <w:t xml:space="preserve"> Use o Firebase para criar um "Histórico de Contratos". O usuário faz login e vê: </w:t>
       </w:r>
       <w:r>
         <w:rPr>
@@ -929,15 +881,7 @@
         <w:t>Monetização:</w:t>
       </w:r>
       <w:r>
-        <w:t xml:space="preserve"> Você pode oferecer 3 contratos grátis por mês e cobrar uma assinatura (</w:t>
-      </w:r>
-      <w:proofErr w:type="spellStart"/>
-      <w:r>
-        <w:t>ex</w:t>
-      </w:r>
-      <w:proofErr w:type="spellEnd"/>
-      <w:r>
-        <w:t xml:space="preserve">: R$ 29,90) para contratos ilimitados e gestão de clientes. </w:t>
+        <w:t xml:space="preserve"> Você pode oferecer 3 contratos grátis por mês e cobrar uma assinatura (ex: R$ 29,90) para contratos ilimitados e gestão de clientes. </w:t>
       </w:r>
       <w:r>
         <w:rPr>
@@ -981,21 +925,12 @@
       <w:r>
         <w:t xml:space="preserve"> No contrato de compra e venda, adicione um "Checklist de Estado": </w:t>
       </w:r>
-      <w:proofErr w:type="gramStart"/>
       <w:r>
         <w:rPr>
           <w:i/>
           <w:iCs/>
         </w:rPr>
-        <w:t>( )</w:t>
-      </w:r>
-      <w:proofErr w:type="gramEnd"/>
-      <w:r>
-        <w:rPr>
-          <w:i/>
-          <w:iCs/>
-        </w:rPr>
-        <w:t xml:space="preserve"> Motor funcionando, ( ) Pintura com riscos, ( ) Sem garantia.</w:t>
+        <w:t>( ) Motor funcionando, ( ) Pintura com riscos, ( ) Sem garantia.</w:t>
       </w:r>
     </w:p>
     <w:p>
@@ -1205,23 +1140,7 @@
                 <w:b/>
                 <w:bCs/>
               </w:rPr>
-              <w:t>Hospedagem (</w:t>
-            </w:r>
-            <w:proofErr w:type="spellStart"/>
-            <w:r>
-              <w:rPr>
-                <w:b/>
-                <w:bCs/>
-              </w:rPr>
-              <w:t>Firebase</w:t>
-            </w:r>
-            <w:proofErr w:type="spellEnd"/>
-            <w:r>
-              <w:rPr>
-                <w:b/>
-                <w:bCs/>
-              </w:rPr>
-              <w:t>/GitHub)</w:t>
+              <w:t>Hospedagem (Firebase/GitHub)</w:t>
             </w:r>
           </w:p>
         </w:tc>
@@ -1263,15 +1182,7 @@
               <w:spacing w:after="480"/>
             </w:pPr>
             <w:r>
-              <w:t>No plano gratuito (</w:t>
-            </w:r>
-            <w:proofErr w:type="spellStart"/>
-            <w:r>
-              <w:t>Spark</w:t>
-            </w:r>
-            <w:proofErr w:type="spellEnd"/>
-            <w:r>
-              <w:t>) você aguenta milhares de usuários.</w:t>
+              <w:t>No plano gratuito (Spark) você aguenta milhares de usuários.</w:t>
             </w:r>
           </w:p>
         </w:tc>
@@ -1301,23 +1212,7 @@
                 <w:b/>
                 <w:bCs/>
               </w:rPr>
-              <w:t xml:space="preserve">Domínio </w:t>
-            </w:r>
-            <w:proofErr w:type="gramStart"/>
-            <w:r>
-              <w:rPr>
-                <w:b/>
-                <w:bCs/>
-              </w:rPr>
-              <w:t>(.com.br</w:t>
-            </w:r>
-            <w:proofErr w:type="gramEnd"/>
-            <w:r>
-              <w:rPr>
-                <w:b/>
-                <w:bCs/>
-              </w:rPr>
-              <w:t>)</w:t>
+              <w:t>Domínio (.com.br)</w:t>
             </w:r>
           </w:p>
         </w:tc>
@@ -2146,7 +2041,6 @@
           <w14:ligatures w14:val="none"/>
         </w:rPr>
       </w:pPr>
-      <w:proofErr w:type="spellStart"/>
       <w:r>
         <w:rPr>
           <w:rFonts w:ascii="Times New Roman" w:eastAsia="Times New Roman" w:hAnsi="Times New Roman" w:cs="Times New Roman"/>
@@ -2158,9 +2052,36 @@
           <w:lang w:eastAsia="pt-BR"/>
           <w14:ligatures w14:val="none"/>
         </w:rPr>
-        <w:t>Remarketing</w:t>
-      </w:r>
-      <w:proofErr w:type="spellEnd"/>
+        <w:t>Remarketing:</w:t>
+      </w:r>
+      <w:r>
+        <w:rPr>
+          <w:rFonts w:ascii="Times New Roman" w:eastAsia="Times New Roman" w:hAnsi="Times New Roman" w:cs="Times New Roman"/>
+          <w:kern w:val="0"/>
+          <w:sz w:val="24"/>
+          <w:szCs w:val="24"/>
+          <w:lang w:eastAsia="pt-BR"/>
+          <w14:ligatures w14:val="none"/>
+        </w:rPr>
+        <w:t xml:space="preserve"> Não tente atrair gente nova todo dia. Use o dinheiro para "perseguir" quem já entrou no seu site via busca orgânica ou indicação.</w:t>
+      </w:r>
+    </w:p>
+    <w:p>
+      <w:pPr>
+        <w:numPr>
+          <w:ilvl w:val="0"/>
+          <w:numId w:val="10"/>
+        </w:numPr>
+        <w:spacing w:before="100" w:beforeAutospacing="1" w:after="100" w:afterAutospacing="1" w:line="240" w:lineRule="auto"/>
+        <w:rPr>
+          <w:rFonts w:ascii="Times New Roman" w:eastAsia="Times New Roman" w:hAnsi="Times New Roman" w:cs="Times New Roman"/>
+          <w:kern w:val="0"/>
+          <w:sz w:val="24"/>
+          <w:szCs w:val="24"/>
+          <w:lang w:eastAsia="pt-BR"/>
+          <w14:ligatures w14:val="none"/>
+        </w:rPr>
+      </w:pPr>
       <w:r>
         <w:rPr>
           <w:rFonts w:ascii="Times New Roman" w:eastAsia="Times New Roman" w:hAnsi="Times New Roman" w:cs="Times New Roman"/>
@@ -2172,18 +2093,18 @@
           <w:lang w:eastAsia="pt-BR"/>
           <w14:ligatures w14:val="none"/>
         </w:rPr>
-        <w:t>:</w:t>
-      </w:r>
-      <w:r>
-        <w:rPr>
-          <w:rFonts w:ascii="Times New Roman" w:eastAsia="Times New Roman" w:hAnsi="Times New Roman" w:cs="Times New Roman"/>
-          <w:kern w:val="0"/>
-          <w:sz w:val="24"/>
-          <w:szCs w:val="24"/>
-          <w:lang w:eastAsia="pt-BR"/>
-          <w14:ligatures w14:val="none"/>
-        </w:rPr>
-        <w:t xml:space="preserve"> Não tente atrair gente nova todo dia. Use o dinheiro para "perseguir" quem já entrou no seu site via busca orgânica ou indicação.</w:t>
+        <w:t>Nichos Hiper-Locais:</w:t>
+      </w:r>
+      <w:r>
+        <w:rPr>
+          <w:rFonts w:ascii="Times New Roman" w:eastAsia="Times New Roman" w:hAnsi="Times New Roman" w:cs="Times New Roman"/>
+          <w:kern w:val="0"/>
+          <w:sz w:val="24"/>
+          <w:szCs w:val="24"/>
+          <w:lang w:eastAsia="pt-BR"/>
+          <w14:ligatures w14:val="none"/>
+        </w:rPr>
+        <w:t xml:space="preserve"> Em vez de anunciar para "Brasil", anuncie para profissionais de manutenção em uma região específica. O leilão é mais barato.</w:t>
       </w:r>
     </w:p>
     <w:p>
@@ -2213,75 +2134,6 @@
           <w:lang w:eastAsia="pt-BR"/>
           <w14:ligatures w14:val="none"/>
         </w:rPr>
-        <w:t xml:space="preserve">Nichos </w:t>
-      </w:r>
-      <w:proofErr w:type="spellStart"/>
-      <w:r>
-        <w:rPr>
-          <w:rFonts w:ascii="Times New Roman" w:eastAsia="Times New Roman" w:hAnsi="Times New Roman" w:cs="Times New Roman"/>
-          <w:b/>
-          <w:bCs/>
-          <w:kern w:val="0"/>
-          <w:sz w:val="24"/>
-          <w:szCs w:val="24"/>
-          <w:lang w:eastAsia="pt-BR"/>
-          <w14:ligatures w14:val="none"/>
-        </w:rPr>
-        <w:t>Hiper-Locais</w:t>
-      </w:r>
-      <w:proofErr w:type="spellEnd"/>
-      <w:r>
-        <w:rPr>
-          <w:rFonts w:ascii="Times New Roman" w:eastAsia="Times New Roman" w:hAnsi="Times New Roman" w:cs="Times New Roman"/>
-          <w:b/>
-          <w:bCs/>
-          <w:kern w:val="0"/>
-          <w:sz w:val="24"/>
-          <w:szCs w:val="24"/>
-          <w:lang w:eastAsia="pt-BR"/>
-          <w14:ligatures w14:val="none"/>
-        </w:rPr>
-        <w:t>:</w:t>
-      </w:r>
-      <w:r>
-        <w:rPr>
-          <w:rFonts w:ascii="Times New Roman" w:eastAsia="Times New Roman" w:hAnsi="Times New Roman" w:cs="Times New Roman"/>
-          <w:kern w:val="0"/>
-          <w:sz w:val="24"/>
-          <w:szCs w:val="24"/>
-          <w:lang w:eastAsia="pt-BR"/>
-          <w14:ligatures w14:val="none"/>
-        </w:rPr>
-        <w:t xml:space="preserve"> Em vez de anunciar para "Brasil", anuncie para profissionais de manutenção em uma região específica. O leilão é mais barato.</w:t>
-      </w:r>
-    </w:p>
-    <w:p>
-      <w:pPr>
-        <w:numPr>
-          <w:ilvl w:val="0"/>
-          <w:numId w:val="10"/>
-        </w:numPr>
-        <w:spacing w:before="100" w:beforeAutospacing="1" w:after="100" w:afterAutospacing="1" w:line="240" w:lineRule="auto"/>
-        <w:rPr>
-          <w:rFonts w:ascii="Times New Roman" w:eastAsia="Times New Roman" w:hAnsi="Times New Roman" w:cs="Times New Roman"/>
-          <w:kern w:val="0"/>
-          <w:sz w:val="24"/>
-          <w:szCs w:val="24"/>
-          <w:lang w:eastAsia="pt-BR"/>
-          <w14:ligatures w14:val="none"/>
-        </w:rPr>
-      </w:pPr>
-      <w:r>
-        <w:rPr>
-          <w:rFonts w:ascii="Times New Roman" w:eastAsia="Times New Roman" w:hAnsi="Times New Roman" w:cs="Times New Roman"/>
-          <w:b/>
-          <w:bCs/>
-          <w:kern w:val="0"/>
-          <w:sz w:val="24"/>
-          <w:szCs w:val="24"/>
-          <w:lang w:eastAsia="pt-BR"/>
-          <w14:ligatures w14:val="none"/>
-        </w:rPr>
         <w:t>Vídeos de Demonstração:</w:t>
       </w:r>
       <w:r>
@@ -2293,55 +2145,7 @@
           <w:lang w:eastAsia="pt-BR"/>
           <w14:ligatures w14:val="none"/>
         </w:rPr>
-        <w:t xml:space="preserve"> Invista os R$ 300,00 em impulsionar um vídeo curto (</w:t>
-      </w:r>
-      <w:proofErr w:type="spellStart"/>
-      <w:r>
-        <w:rPr>
-          <w:rFonts w:ascii="Times New Roman" w:eastAsia="Times New Roman" w:hAnsi="Times New Roman" w:cs="Times New Roman"/>
-          <w:kern w:val="0"/>
-          <w:sz w:val="24"/>
-          <w:szCs w:val="24"/>
-          <w:lang w:eastAsia="pt-BR"/>
-          <w14:ligatures w14:val="none"/>
-        </w:rPr>
-        <w:t>Reels</w:t>
-      </w:r>
-      <w:proofErr w:type="spellEnd"/>
-      <w:r>
-        <w:rPr>
-          <w:rFonts w:ascii="Times New Roman" w:eastAsia="Times New Roman" w:hAnsi="Times New Roman" w:cs="Times New Roman"/>
-          <w:kern w:val="0"/>
-          <w:sz w:val="24"/>
-          <w:szCs w:val="24"/>
-          <w:lang w:eastAsia="pt-BR"/>
-          <w14:ligatures w14:val="none"/>
-        </w:rPr>
-        <w:t>/</w:t>
-      </w:r>
-      <w:proofErr w:type="spellStart"/>
-      <w:r>
-        <w:rPr>
-          <w:rFonts w:ascii="Times New Roman" w:eastAsia="Times New Roman" w:hAnsi="Times New Roman" w:cs="Times New Roman"/>
-          <w:kern w:val="0"/>
-          <w:sz w:val="24"/>
-          <w:szCs w:val="24"/>
-          <w:lang w:eastAsia="pt-BR"/>
-          <w14:ligatures w14:val="none"/>
-        </w:rPr>
-        <w:t>TikTok</w:t>
-      </w:r>
-      <w:proofErr w:type="spellEnd"/>
-      <w:r>
-        <w:rPr>
-          <w:rFonts w:ascii="Times New Roman" w:eastAsia="Times New Roman" w:hAnsi="Times New Roman" w:cs="Times New Roman"/>
-          <w:kern w:val="0"/>
-          <w:sz w:val="24"/>
-          <w:szCs w:val="24"/>
-          <w:lang w:eastAsia="pt-BR"/>
-          <w14:ligatures w14:val="none"/>
-        </w:rPr>
-        <w:t xml:space="preserve">) mostrando: </w:t>
+        <w:t xml:space="preserve"> Invista os R$ 300,00 em impulsionar um vídeo curto (Reels/TikTok) mostrando: </w:t>
       </w:r>
       <w:r>
         <w:rPr>
@@ -2886,121 +2690,89 @@
           <w:b/>
           <w:bCs/>
         </w:rPr>
-        <w:t xml:space="preserve">O segredo para você não perder esses clientes (evitar o </w:t>
-      </w:r>
-      <w:proofErr w:type="spellStart"/>
+        <w:t>O segredo para você não perder esses clientes (evitar o churn) é:</w:t>
+      </w:r>
+      <w:r>
+        <w:t xml:space="preserve"> O seu app não pode ser apenas um "gerador". Ele tem que ser o "arquivo" do profissional. Se ele sentir que todos os contratos da vida dele estão salvos ali no seu Firebase, ele </w:t>
+      </w:r>
       <w:r>
         <w:rPr>
           <w:b/>
           <w:bCs/>
         </w:rPr>
-        <w:t>churn</w:t>
-      </w:r>
-      <w:proofErr w:type="spellEnd"/>
+        <w:t>nunca</w:t>
+      </w:r>
+      <w:r>
+        <w:t xml:space="preserve"> vai cancelar, porque ele terá medo de perder o histórico.</w:t>
+      </w:r>
+    </w:p>
+    <w:p>
+      <w:pPr>
+        <w:pStyle w:val="NormalWeb"/>
+      </w:pPr>
+    </w:p>
+    <w:p>
+      <w:pPr>
+        <w:pStyle w:val="Ttulo3"/>
+      </w:pPr>
+      <w:r>
+        <w:t>3. A Estratégia de "Ancoragem" (O segredo do meio termo)</w:t>
+      </w:r>
+    </w:p>
+    <w:p>
+      <w:pPr>
+        <w:pStyle w:val="NormalWeb"/>
+      </w:pPr>
+      <w:r>
+        <w:t xml:space="preserve">Como estrategista, eu não escolheria um valor só. Eu usaria a </w:t>
+      </w:r>
       <w:r>
         <w:rPr>
           <w:b/>
           <w:bCs/>
         </w:rPr>
-        <w:t>) é:</w:t>
-      </w:r>
-      <w:r>
-        <w:t xml:space="preserve"> O seu app não pode ser apenas um "gerador". Ele tem que ser o "arquivo" do profissional. Se ele sentir que todos os contratos da vida dele estão salvos ali no seu </w:t>
-      </w:r>
-      <w:proofErr w:type="spellStart"/>
-      <w:r>
-        <w:t>Firebase</w:t>
-      </w:r>
-      <w:proofErr w:type="spellEnd"/>
-      <w:r>
-        <w:t xml:space="preserve">, ele </w:t>
-      </w:r>
+        <w:t>Ancoragem de Preço</w:t>
+      </w:r>
+      <w:r>
+        <w:t>:</w:t>
+      </w:r>
+    </w:p>
+    <w:p>
+      <w:pPr>
+        <w:pStyle w:val="NormalWeb"/>
+        <w:numPr>
+          <w:ilvl w:val="0"/>
+          <w:numId w:val="12"/>
+        </w:numPr>
+      </w:pPr>
       <w:r>
         <w:rPr>
           <w:b/>
           <w:bCs/>
         </w:rPr>
-        <w:t>nunca</w:t>
-      </w:r>
-      <w:r>
-        <w:t xml:space="preserve"> vai cancelar, porque ele terá medo de perder o histórico.</w:t>
+        <w:t>Plano Starter (Grátis):</w:t>
+      </w:r>
+      <w:r>
+        <w:t xml:space="preserve"> Gera 1 contrato por mês (para o usuário comum sentir o gostinho).</w:t>
       </w:r>
     </w:p>
     <w:p>
       <w:pPr>
         <w:pStyle w:val="NormalWeb"/>
-      </w:pPr>
-    </w:p>
-    <w:p>
-      <w:pPr>
-        <w:pStyle w:val="Ttulo3"/>
-      </w:pPr>
-      <w:r>
-        <w:t>3. A Estratégia de "Ancoragem" (O segredo do meio termo)</w:t>
-      </w:r>
-    </w:p>
-    <w:p>
-      <w:pPr>
-        <w:pStyle w:val="NormalWeb"/>
-      </w:pPr>
-      <w:r>
-        <w:t xml:space="preserve">Como estrategista, eu não escolheria um valor só. Eu usaria a </w:t>
-      </w:r>
+        <w:numPr>
+          <w:ilvl w:val="0"/>
+          <w:numId w:val="12"/>
+        </w:numPr>
+      </w:pPr>
       <w:r>
         <w:rPr>
           <w:b/>
           <w:bCs/>
         </w:rPr>
-        <w:t>Ancoragem de Preço</w:t>
-      </w:r>
-      <w:r>
-        <w:t>:</w:t>
-      </w:r>
-    </w:p>
-    <w:p>
-      <w:pPr>
-        <w:pStyle w:val="NormalWeb"/>
-        <w:numPr>
-          <w:ilvl w:val="0"/>
-          <w:numId w:val="12"/>
-        </w:numPr>
-      </w:pPr>
-      <w:r>
-        <w:rPr>
-          <w:b/>
-          <w:bCs/>
-        </w:rPr>
-        <w:t>Plano Starter (Grátis):</w:t>
-      </w:r>
-      <w:r>
-        <w:t xml:space="preserve"> Gera 1 contrato por mês (para o usuário comum sentir o gostinho).</w:t>
-      </w:r>
-    </w:p>
-    <w:p>
-      <w:pPr>
-        <w:pStyle w:val="NormalWeb"/>
-        <w:numPr>
-          <w:ilvl w:val="0"/>
-          <w:numId w:val="12"/>
-        </w:numPr>
-      </w:pPr>
-      <w:r>
-        <w:rPr>
-          <w:b/>
-          <w:bCs/>
-        </w:rPr>
         <w:t>Plano Profissional (R$ 24,90 ou R$ 29,90):</w:t>
       </w:r>
       <w:r>
-        <w:t xml:space="preserve"> Contratos ilimitados + Assinatura na tela + Histórico no </w:t>
-      </w:r>
-      <w:proofErr w:type="spellStart"/>
-      <w:r>
-        <w:t>Firebase</w:t>
-      </w:r>
-      <w:proofErr w:type="spellEnd"/>
-      <w:r>
-        <w:t xml:space="preserve">. </w:t>
+        <w:t xml:space="preserve"> Contratos ilimitados + Assinatura na tela + Histórico no Firebase. </w:t>
       </w:r>
       <w:r>
         <w:rPr>
@@ -3299,7 +3071,6 @@
         </w:rPr>
         <w:t xml:space="preserve"> Quem aluga imóvel "sozinho" hoje usa o </w:t>
       </w:r>
-      <w:proofErr w:type="spellStart"/>
       <w:r>
         <w:rPr>
           <w:rFonts w:ascii="Times New Roman" w:eastAsia="Times New Roman" w:hAnsi="Times New Roman" w:cs="Times New Roman"/>
@@ -3313,7 +3084,6 @@
         </w:rPr>
         <w:t>QuintoAndar</w:t>
       </w:r>
-      <w:proofErr w:type="spellEnd"/>
       <w:r>
         <w:rPr>
           <w:rFonts w:ascii="Times New Roman" w:eastAsia="Times New Roman" w:hAnsi="Times New Roman" w:cs="Times New Roman"/>
@@ -3754,57 +3524,18 @@
           <w:lang w:eastAsia="pt-BR"/>
           <w14:ligatures w14:val="none"/>
         </w:rPr>
-        <w:t xml:space="preserve">Instagram/Facebook </w:t>
-      </w:r>
-      <w:proofErr w:type="spellStart"/>
-      <w:r>
-        <w:rPr>
-          <w:rFonts w:ascii="Times New Roman" w:eastAsia="Times New Roman" w:hAnsi="Times New Roman" w:cs="Times New Roman"/>
-          <w:b/>
-          <w:bCs/>
-          <w:kern w:val="0"/>
-          <w:sz w:val="24"/>
-          <w:szCs w:val="24"/>
-          <w:lang w:eastAsia="pt-BR"/>
-          <w14:ligatures w14:val="none"/>
-        </w:rPr>
-        <w:t>Ads</w:t>
-      </w:r>
-      <w:proofErr w:type="spellEnd"/>
-      <w:r>
-        <w:rPr>
-          <w:rFonts w:ascii="Times New Roman" w:eastAsia="Times New Roman" w:hAnsi="Times New Roman" w:cs="Times New Roman"/>
-          <w:kern w:val="0"/>
-          <w:sz w:val="24"/>
-          <w:szCs w:val="24"/>
-          <w:lang w:eastAsia="pt-BR"/>
-          <w14:ligatures w14:val="none"/>
-        </w:rPr>
-        <w:t xml:space="preserve"> segmentado por "Interesses em ferramentas (</w:t>
-      </w:r>
-      <w:proofErr w:type="spellStart"/>
-      <w:r>
-        <w:rPr>
-          <w:rFonts w:ascii="Times New Roman" w:eastAsia="Times New Roman" w:hAnsi="Times New Roman" w:cs="Times New Roman"/>
-          <w:kern w:val="0"/>
-          <w:sz w:val="24"/>
-          <w:szCs w:val="24"/>
-          <w:lang w:eastAsia="pt-BR"/>
-          <w14:ligatures w14:val="none"/>
-        </w:rPr>
-        <w:t>Makita</w:t>
-      </w:r>
-      <w:proofErr w:type="spellEnd"/>
-      <w:r>
-        <w:rPr>
-          <w:rFonts w:ascii="Times New Roman" w:eastAsia="Times New Roman" w:hAnsi="Times New Roman" w:cs="Times New Roman"/>
-          <w:kern w:val="0"/>
-          <w:sz w:val="24"/>
-          <w:szCs w:val="24"/>
-          <w:lang w:eastAsia="pt-BR"/>
-          <w14:ligatures w14:val="none"/>
-        </w:rPr>
-        <w:t>, Bosch)" ou "Profissões autônomas".</w:t>
+        <w:t>Instagram/Facebook Ads</w:t>
+      </w:r>
+      <w:r>
+        <w:rPr>
+          <w:rFonts w:ascii="Times New Roman" w:eastAsia="Times New Roman" w:hAnsi="Times New Roman" w:cs="Times New Roman"/>
+          <w:kern w:val="0"/>
+          <w:sz w:val="24"/>
+          <w:szCs w:val="24"/>
+          <w:lang w:eastAsia="pt-BR"/>
+          <w14:ligatures w14:val="none"/>
+        </w:rPr>
+        <w:t xml:space="preserve"> segmentado por "Interesses em ferramentas (Makita, Bosch)" ou "Profissões autônomas".</w:t>
       </w:r>
     </w:p>
     <w:p>
@@ -4139,7 +3870,6 @@
         </w:rPr>
         <w:t xml:space="preserve">Como seu estrategista de tráfego e social media, aqui está o plano real para invadir o </w:t>
       </w:r>
-      <w:proofErr w:type="spellStart"/>
       <w:r>
         <w:rPr>
           <w:rFonts w:ascii="Times New Roman" w:eastAsia="Times New Roman" w:hAnsi="Times New Roman" w:cs="Times New Roman"/>
@@ -4153,7 +3883,6 @@
         </w:rPr>
         <w:t>TikTok</w:t>
       </w:r>
-      <w:proofErr w:type="spellEnd"/>
       <w:r>
         <w:rPr>
           <w:rFonts w:ascii="Times New Roman" w:eastAsia="Times New Roman" w:hAnsi="Times New Roman" w:cs="Times New Roman"/>
@@ -4176,35 +3905,7 @@
           <w:lang w:eastAsia="pt-BR"/>
           <w14:ligatures w14:val="none"/>
         </w:rPr>
-        <w:t>Instagram (</w:t>
-      </w:r>
-      <w:proofErr w:type="spellStart"/>
-      <w:r>
-        <w:rPr>
-          <w:rFonts w:ascii="Times New Roman" w:eastAsia="Times New Roman" w:hAnsi="Times New Roman" w:cs="Times New Roman"/>
-          <w:b/>
-          <w:bCs/>
-          <w:kern w:val="0"/>
-          <w:sz w:val="24"/>
-          <w:szCs w:val="24"/>
-          <w:lang w:eastAsia="pt-BR"/>
-          <w14:ligatures w14:val="none"/>
-        </w:rPr>
-        <w:t>Reels</w:t>
-      </w:r>
-      <w:proofErr w:type="spellEnd"/>
-      <w:r>
-        <w:rPr>
-          <w:rFonts w:ascii="Times New Roman" w:eastAsia="Times New Roman" w:hAnsi="Times New Roman" w:cs="Times New Roman"/>
-          <w:b/>
-          <w:bCs/>
-          <w:kern w:val="0"/>
-          <w:sz w:val="24"/>
-          <w:szCs w:val="24"/>
-          <w:lang w:eastAsia="pt-BR"/>
-          <w14:ligatures w14:val="none"/>
-        </w:rPr>
-        <w:t>)</w:t>
+        <w:t>Instagram (Reels)</w:t>
       </w:r>
       <w:r>
         <w:rPr>
@@ -4577,31 +4278,7 @@
           <w:lang w:eastAsia="pt-BR"/>
           <w14:ligatures w14:val="none"/>
         </w:rPr>
-        <w:t xml:space="preserve"> "Se você é autônomo, o link tá na minha </w:t>
-      </w:r>
-      <w:proofErr w:type="spellStart"/>
-      <w:r>
-        <w:rPr>
-          <w:rFonts w:ascii="Times New Roman" w:eastAsia="Times New Roman" w:hAnsi="Times New Roman" w:cs="Times New Roman"/>
-          <w:kern w:val="0"/>
-          <w:sz w:val="24"/>
-          <w:szCs w:val="24"/>
-          <w:lang w:eastAsia="pt-BR"/>
-          <w14:ligatures w14:val="none"/>
-        </w:rPr>
-        <w:t>bio</w:t>
-      </w:r>
-      <w:proofErr w:type="spellEnd"/>
-      <w:r>
-        <w:rPr>
-          <w:rFonts w:ascii="Times New Roman" w:eastAsia="Times New Roman" w:hAnsi="Times New Roman" w:cs="Times New Roman"/>
-          <w:kern w:val="0"/>
-          <w:sz w:val="24"/>
-          <w:szCs w:val="24"/>
-          <w:lang w:eastAsia="pt-BR"/>
-          <w14:ligatures w14:val="none"/>
-        </w:rPr>
-        <w:t>. Testa aí."</w:t>
+        <w:t xml:space="preserve"> "Se você é autônomo, o link tá na minha bio. Testa aí."</w:t>
       </w:r>
     </w:p>
     <w:p>
@@ -4704,33 +4381,8 @@
           <w:lang w:eastAsia="pt-BR"/>
           <w14:ligatures w14:val="none"/>
         </w:rPr>
-        <w:t xml:space="preserve"> (Meta </w:t>
-      </w:r>
-      <w:proofErr w:type="spellStart"/>
-      <w:r>
-        <w:rPr>
-          <w:rFonts w:ascii="Times New Roman" w:eastAsia="Times New Roman" w:hAnsi="Times New Roman" w:cs="Times New Roman"/>
-          <w:kern w:val="0"/>
-          <w:sz w:val="24"/>
-          <w:szCs w:val="24"/>
-          <w:lang w:eastAsia="pt-BR"/>
-          <w14:ligatures w14:val="none"/>
-        </w:rPr>
-        <w:t>Ads</w:t>
-      </w:r>
-      <w:proofErr w:type="spellEnd"/>
-      <w:r>
-        <w:rPr>
-          <w:rFonts w:ascii="Times New Roman" w:eastAsia="Times New Roman" w:hAnsi="Times New Roman" w:cs="Times New Roman"/>
-          <w:kern w:val="0"/>
-          <w:sz w:val="24"/>
-          <w:szCs w:val="24"/>
-          <w:lang w:eastAsia="pt-BR"/>
-          <w14:ligatures w14:val="none"/>
-        </w:rPr>
-        <w:t xml:space="preserve">) ou o </w:t>
-      </w:r>
-      <w:proofErr w:type="spellStart"/>
+        <w:t xml:space="preserve"> (Meta Ads) ou o </w:t>
+      </w:r>
       <w:r>
         <w:rPr>
           <w:rFonts w:ascii="Times New Roman" w:eastAsia="Times New Roman" w:hAnsi="Times New Roman" w:cs="Times New Roman"/>
@@ -4742,9 +4394,36 @@
           <w:lang w:eastAsia="pt-BR"/>
           <w14:ligatures w14:val="none"/>
         </w:rPr>
-        <w:t>TikTok</w:t>
-      </w:r>
-      <w:proofErr w:type="spellEnd"/>
+        <w:t>TikTok Ads</w:t>
+      </w:r>
+      <w:r>
+        <w:rPr>
+          <w:rFonts w:ascii="Times New Roman" w:eastAsia="Times New Roman" w:hAnsi="Times New Roman" w:cs="Times New Roman"/>
+          <w:kern w:val="0"/>
+          <w:sz w:val="24"/>
+          <w:szCs w:val="24"/>
+          <w:lang w:eastAsia="pt-BR"/>
+          <w14:ligatures w14:val="none"/>
+        </w:rPr>
+        <w:t>.</w:t>
+      </w:r>
+    </w:p>
+    <w:p>
+      <w:pPr>
+        <w:numPr>
+          <w:ilvl w:val="0"/>
+          <w:numId w:val="18"/>
+        </w:numPr>
+        <w:spacing w:before="100" w:beforeAutospacing="1" w:after="100" w:afterAutospacing="1" w:line="240" w:lineRule="auto"/>
+        <w:rPr>
+          <w:rFonts w:ascii="Times New Roman" w:eastAsia="Times New Roman" w:hAnsi="Times New Roman" w:cs="Times New Roman"/>
+          <w:kern w:val="0"/>
+          <w:sz w:val="24"/>
+          <w:szCs w:val="24"/>
+          <w:lang w:eastAsia="pt-BR"/>
+          <w14:ligatures w14:val="none"/>
+        </w:rPr>
+      </w:pPr>
       <w:r>
         <w:rPr>
           <w:rFonts w:ascii="Times New Roman" w:eastAsia="Times New Roman" w:hAnsi="Times New Roman" w:cs="Times New Roman"/>
@@ -4756,9 +4435,124 @@
           <w:lang w:eastAsia="pt-BR"/>
           <w14:ligatures w14:val="none"/>
         </w:rPr>
-        <w:t xml:space="preserve"> </w:t>
-      </w:r>
-      <w:proofErr w:type="spellStart"/>
+        <w:t>No TikTok:</w:t>
+      </w:r>
+      <w:r>
+        <w:rPr>
+          <w:rFonts w:ascii="Times New Roman" w:eastAsia="Times New Roman" w:hAnsi="Times New Roman" w:cs="Times New Roman"/>
+          <w:kern w:val="0"/>
+          <w:sz w:val="24"/>
+          <w:szCs w:val="24"/>
+          <w:lang w:eastAsia="pt-BR"/>
+          <w14:ligatures w14:val="none"/>
+        </w:rPr>
+        <w:t xml:space="preserve"> O algoritmo é excelente para achar "tribos". Use hashtags como </w:t>
+      </w:r>
+      <w:r>
+        <w:rPr>
+          <w:rFonts w:ascii="Courier New" w:eastAsia="Times New Roman" w:hAnsi="Courier New" w:cs="Courier New"/>
+          <w:kern w:val="0"/>
+          <w:sz w:val="20"/>
+          <w:szCs w:val="20"/>
+          <w:lang w:eastAsia="pt-BR"/>
+          <w14:ligatures w14:val="none"/>
+        </w:rPr>
+        <w:t>#arcondicionado</w:t>
+      </w:r>
+      <w:r>
+        <w:rPr>
+          <w:rFonts w:ascii="Times New Roman" w:eastAsia="Times New Roman" w:hAnsi="Times New Roman" w:cs="Times New Roman"/>
+          <w:kern w:val="0"/>
+          <w:sz w:val="24"/>
+          <w:szCs w:val="24"/>
+          <w:lang w:eastAsia="pt-BR"/>
+          <w14:ligatures w14:val="none"/>
+        </w:rPr>
+        <w:t xml:space="preserve">, </w:t>
+      </w:r>
+      <w:r>
+        <w:rPr>
+          <w:rFonts w:ascii="Courier New" w:eastAsia="Times New Roman" w:hAnsi="Courier New" w:cs="Courier New"/>
+          <w:kern w:val="0"/>
+          <w:sz w:val="20"/>
+          <w:szCs w:val="20"/>
+          <w:lang w:eastAsia="pt-BR"/>
+          <w14:ligatures w14:val="none"/>
+        </w:rPr>
+        <w:t>#eletricista</w:t>
+      </w:r>
+      <w:r>
+        <w:rPr>
+          <w:rFonts w:ascii="Times New Roman" w:eastAsia="Times New Roman" w:hAnsi="Times New Roman" w:cs="Times New Roman"/>
+          <w:kern w:val="0"/>
+          <w:sz w:val="24"/>
+          <w:szCs w:val="24"/>
+          <w:lang w:eastAsia="pt-BR"/>
+          <w14:ligatures w14:val="none"/>
+        </w:rPr>
+        <w:t xml:space="preserve">, </w:t>
+      </w:r>
+      <w:r>
+        <w:rPr>
+          <w:rFonts w:ascii="Courier New" w:eastAsia="Times New Roman" w:hAnsi="Courier New" w:cs="Courier New"/>
+          <w:kern w:val="0"/>
+          <w:sz w:val="20"/>
+          <w:szCs w:val="20"/>
+          <w:lang w:eastAsia="pt-BR"/>
+          <w14:ligatures w14:val="none"/>
+        </w:rPr>
+        <w:t>#maridodealuguel</w:t>
+      </w:r>
+      <w:r>
+        <w:rPr>
+          <w:rFonts w:ascii="Times New Roman" w:eastAsia="Times New Roman" w:hAnsi="Times New Roman" w:cs="Times New Roman"/>
+          <w:kern w:val="0"/>
+          <w:sz w:val="24"/>
+          <w:szCs w:val="24"/>
+          <w:lang w:eastAsia="pt-BR"/>
+          <w14:ligatures w14:val="none"/>
+        </w:rPr>
+        <w:t xml:space="preserve">, </w:t>
+      </w:r>
+      <w:r>
+        <w:rPr>
+          <w:rFonts w:ascii="Courier New" w:eastAsia="Times New Roman" w:hAnsi="Courier New" w:cs="Courier New"/>
+          <w:kern w:val="0"/>
+          <w:sz w:val="20"/>
+          <w:szCs w:val="20"/>
+          <w:lang w:eastAsia="pt-BR"/>
+          <w14:ligatures w14:val="none"/>
+        </w:rPr>
+        <w:t>#refrigeração</w:t>
+      </w:r>
+      <w:r>
+        <w:rPr>
+          <w:rFonts w:ascii="Times New Roman" w:eastAsia="Times New Roman" w:hAnsi="Times New Roman" w:cs="Times New Roman"/>
+          <w:kern w:val="0"/>
+          <w:sz w:val="24"/>
+          <w:szCs w:val="24"/>
+          <w:lang w:eastAsia="pt-BR"/>
+          <w14:ligatures w14:val="none"/>
+        </w:rPr>
+        <w:t>. O TikTok vai entregar para quem consome esses conteúdos de trabalho manual.</w:t>
+      </w:r>
+    </w:p>
+    <w:p>
+      <w:pPr>
+        <w:numPr>
+          <w:ilvl w:val="0"/>
+          <w:numId w:val="18"/>
+        </w:numPr>
+        <w:spacing w:before="100" w:beforeAutospacing="1" w:after="100" w:afterAutospacing="1" w:line="240" w:lineRule="auto"/>
+        <w:rPr>
+          <w:rFonts w:ascii="Times New Roman" w:eastAsia="Times New Roman" w:hAnsi="Times New Roman" w:cs="Times New Roman"/>
+          <w:kern w:val="0"/>
+          <w:sz w:val="24"/>
+          <w:szCs w:val="24"/>
+          <w:lang w:eastAsia="pt-BR"/>
+          <w14:ligatures w14:val="none"/>
+        </w:rPr>
+      </w:pPr>
       <w:r>
         <w:rPr>
           <w:rFonts w:ascii="Times New Roman" w:eastAsia="Times New Roman" w:hAnsi="Times New Roman" w:cs="Times New Roman"/>
@@ -4770,37 +4564,19 @@
           <w:lang w:eastAsia="pt-BR"/>
           <w14:ligatures w14:val="none"/>
         </w:rPr>
-        <w:t>Ads</w:t>
-      </w:r>
-      <w:proofErr w:type="spellEnd"/>
-      <w:r>
-        <w:rPr>
-          <w:rFonts w:ascii="Times New Roman" w:eastAsia="Times New Roman" w:hAnsi="Times New Roman" w:cs="Times New Roman"/>
-          <w:kern w:val="0"/>
-          <w:sz w:val="24"/>
-          <w:szCs w:val="24"/>
-          <w:lang w:eastAsia="pt-BR"/>
-          <w14:ligatures w14:val="none"/>
-        </w:rPr>
-        <w:t>.</w:t>
-      </w:r>
-    </w:p>
-    <w:p>
-      <w:pPr>
-        <w:numPr>
-          <w:ilvl w:val="0"/>
-          <w:numId w:val="18"/>
-        </w:numPr>
-        <w:spacing w:before="100" w:beforeAutospacing="1" w:after="100" w:afterAutospacing="1" w:line="240" w:lineRule="auto"/>
-        <w:rPr>
-          <w:rFonts w:ascii="Times New Roman" w:eastAsia="Times New Roman" w:hAnsi="Times New Roman" w:cs="Times New Roman"/>
-          <w:kern w:val="0"/>
-          <w:sz w:val="24"/>
-          <w:szCs w:val="24"/>
-          <w:lang w:eastAsia="pt-BR"/>
-          <w14:ligatures w14:val="none"/>
-        </w:rPr>
-      </w:pPr>
+        <w:t>No Instagram/Facebook:</w:t>
+      </w:r>
+      <w:r>
+        <w:rPr>
+          <w:rFonts w:ascii="Times New Roman" w:eastAsia="Times New Roman" w:hAnsi="Times New Roman" w:cs="Times New Roman"/>
+          <w:kern w:val="0"/>
+          <w:sz w:val="24"/>
+          <w:szCs w:val="24"/>
+          <w:lang w:eastAsia="pt-BR"/>
+          <w14:ligatures w14:val="none"/>
+        </w:rPr>
+        <w:t xml:space="preserve"> Foque em </w:t>
+      </w:r>
       <w:r>
         <w:rPr>
           <w:rFonts w:ascii="Times New Roman" w:eastAsia="Times New Roman" w:hAnsi="Times New Roman" w:cs="Times New Roman"/>
@@ -4812,9 +4588,36 @@
           <w:lang w:eastAsia="pt-BR"/>
           <w14:ligatures w14:val="none"/>
         </w:rPr>
-        <w:t xml:space="preserve">No </w:t>
-      </w:r>
-      <w:proofErr w:type="spellStart"/>
+        <w:t>Interesses Profissionais</w:t>
+      </w:r>
+      <w:r>
+        <w:rPr>
+          <w:rFonts w:ascii="Times New Roman" w:eastAsia="Times New Roman" w:hAnsi="Times New Roman" w:cs="Times New Roman"/>
+          <w:kern w:val="0"/>
+          <w:sz w:val="24"/>
+          <w:szCs w:val="24"/>
+          <w:lang w:eastAsia="pt-BR"/>
+          <w14:ligatures w14:val="none"/>
+        </w:rPr>
+        <w:t>.</w:t>
+      </w:r>
+    </w:p>
+    <w:p>
+      <w:pPr>
+        <w:numPr>
+          <w:ilvl w:val="1"/>
+          <w:numId w:val="18"/>
+        </w:numPr>
+        <w:spacing w:before="100" w:beforeAutospacing="1" w:after="100" w:afterAutospacing="1" w:line="240" w:lineRule="auto"/>
+        <w:rPr>
+          <w:rFonts w:ascii="Times New Roman" w:eastAsia="Times New Roman" w:hAnsi="Times New Roman" w:cs="Times New Roman"/>
+          <w:kern w:val="0"/>
+          <w:sz w:val="24"/>
+          <w:szCs w:val="24"/>
+          <w:lang w:eastAsia="pt-BR"/>
+          <w14:ligatures w14:val="none"/>
+        </w:rPr>
+      </w:pPr>
       <w:r>
         <w:rPr>
           <w:rFonts w:ascii="Times New Roman" w:eastAsia="Times New Roman" w:hAnsi="Times New Roman" w:cs="Times New Roman"/>
@@ -4826,9 +4629,36 @@
           <w:lang w:eastAsia="pt-BR"/>
           <w14:ligatures w14:val="none"/>
         </w:rPr>
-        <w:t>TikTok</w:t>
-      </w:r>
-      <w:proofErr w:type="spellEnd"/>
+        <w:t>Público:</w:t>
+      </w:r>
+      <w:r>
+        <w:rPr>
+          <w:rFonts w:ascii="Times New Roman" w:eastAsia="Times New Roman" w:hAnsi="Times New Roman" w:cs="Times New Roman"/>
+          <w:kern w:val="0"/>
+          <w:sz w:val="24"/>
+          <w:szCs w:val="24"/>
+          <w:lang w:eastAsia="pt-BR"/>
+          <w14:ligatures w14:val="none"/>
+        </w:rPr>
+        <w:t xml:space="preserve"> Homens/Mulheres, 25-50 anos.</w:t>
+      </w:r>
+    </w:p>
+    <w:p>
+      <w:pPr>
+        <w:numPr>
+          <w:ilvl w:val="1"/>
+          <w:numId w:val="18"/>
+        </w:numPr>
+        <w:spacing w:before="100" w:beforeAutospacing="1" w:after="100" w:afterAutospacing="1" w:line="240" w:lineRule="auto"/>
+        <w:rPr>
+          <w:rFonts w:ascii="Times New Roman" w:eastAsia="Times New Roman" w:hAnsi="Times New Roman" w:cs="Times New Roman"/>
+          <w:kern w:val="0"/>
+          <w:sz w:val="24"/>
+          <w:szCs w:val="24"/>
+          <w:lang w:eastAsia="pt-BR"/>
+          <w14:ligatures w14:val="none"/>
+        </w:rPr>
+      </w:pPr>
       <w:r>
         <w:rPr>
           <w:rFonts w:ascii="Times New Roman" w:eastAsia="Times New Roman" w:hAnsi="Times New Roman" w:cs="Times New Roman"/>
@@ -4840,265 +4670,6 @@
           <w:lang w:eastAsia="pt-BR"/>
           <w14:ligatures w14:val="none"/>
         </w:rPr>
-        <w:t>:</w:t>
-      </w:r>
-      <w:r>
-        <w:rPr>
-          <w:rFonts w:ascii="Times New Roman" w:eastAsia="Times New Roman" w:hAnsi="Times New Roman" w:cs="Times New Roman"/>
-          <w:kern w:val="0"/>
-          <w:sz w:val="24"/>
-          <w:szCs w:val="24"/>
-          <w:lang w:eastAsia="pt-BR"/>
-          <w14:ligatures w14:val="none"/>
-        </w:rPr>
-        <w:t xml:space="preserve"> O algoritmo é excelente para achar "tribos". Use hashtags como </w:t>
-      </w:r>
-      <w:r>
-        <w:rPr>
-          <w:rFonts w:ascii="Courier New" w:eastAsia="Times New Roman" w:hAnsi="Courier New" w:cs="Courier New"/>
-          <w:kern w:val="0"/>
-          <w:sz w:val="20"/>
-          <w:szCs w:val="20"/>
-          <w:lang w:eastAsia="pt-BR"/>
-          <w14:ligatures w14:val="none"/>
-        </w:rPr>
-        <w:t>#arcondicionado</w:t>
-      </w:r>
-      <w:r>
-        <w:rPr>
-          <w:rFonts w:ascii="Times New Roman" w:eastAsia="Times New Roman" w:hAnsi="Times New Roman" w:cs="Times New Roman"/>
-          <w:kern w:val="0"/>
-          <w:sz w:val="24"/>
-          <w:szCs w:val="24"/>
-          <w:lang w:eastAsia="pt-BR"/>
-          <w14:ligatures w14:val="none"/>
-        </w:rPr>
-        <w:t xml:space="preserve">, </w:t>
-      </w:r>
-      <w:r>
-        <w:rPr>
-          <w:rFonts w:ascii="Courier New" w:eastAsia="Times New Roman" w:hAnsi="Courier New" w:cs="Courier New"/>
-          <w:kern w:val="0"/>
-          <w:sz w:val="20"/>
-          <w:szCs w:val="20"/>
-          <w:lang w:eastAsia="pt-BR"/>
-          <w14:ligatures w14:val="none"/>
-        </w:rPr>
-        <w:t>#eletricista</w:t>
-      </w:r>
-      <w:r>
-        <w:rPr>
-          <w:rFonts w:ascii="Times New Roman" w:eastAsia="Times New Roman" w:hAnsi="Times New Roman" w:cs="Times New Roman"/>
-          <w:kern w:val="0"/>
-          <w:sz w:val="24"/>
-          <w:szCs w:val="24"/>
-          <w:lang w:eastAsia="pt-BR"/>
-          <w14:ligatures w14:val="none"/>
-        </w:rPr>
-        <w:t xml:space="preserve">, </w:t>
-      </w:r>
-      <w:r>
-        <w:rPr>
-          <w:rFonts w:ascii="Courier New" w:eastAsia="Times New Roman" w:hAnsi="Courier New" w:cs="Courier New"/>
-          <w:kern w:val="0"/>
-          <w:sz w:val="20"/>
-          <w:szCs w:val="20"/>
-          <w:lang w:eastAsia="pt-BR"/>
-          <w14:ligatures w14:val="none"/>
-        </w:rPr>
-        <w:t>#maridodealuguel</w:t>
-      </w:r>
-      <w:r>
-        <w:rPr>
-          <w:rFonts w:ascii="Times New Roman" w:eastAsia="Times New Roman" w:hAnsi="Times New Roman" w:cs="Times New Roman"/>
-          <w:kern w:val="0"/>
-          <w:sz w:val="24"/>
-          <w:szCs w:val="24"/>
-          <w:lang w:eastAsia="pt-BR"/>
-          <w14:ligatures w14:val="none"/>
-        </w:rPr>
-        <w:t xml:space="preserve">, </w:t>
-      </w:r>
-      <w:r>
-        <w:rPr>
-          <w:rFonts w:ascii="Courier New" w:eastAsia="Times New Roman" w:hAnsi="Courier New" w:cs="Courier New"/>
-          <w:kern w:val="0"/>
-          <w:sz w:val="20"/>
-          <w:szCs w:val="20"/>
-          <w:lang w:eastAsia="pt-BR"/>
-          <w14:ligatures w14:val="none"/>
-        </w:rPr>
-        <w:t>#refrigeração</w:t>
-      </w:r>
-      <w:r>
-        <w:rPr>
-          <w:rFonts w:ascii="Times New Roman" w:eastAsia="Times New Roman" w:hAnsi="Times New Roman" w:cs="Times New Roman"/>
-          <w:kern w:val="0"/>
-          <w:sz w:val="24"/>
-          <w:szCs w:val="24"/>
-          <w:lang w:eastAsia="pt-BR"/>
-          <w14:ligatures w14:val="none"/>
-        </w:rPr>
-        <w:t xml:space="preserve">. O </w:t>
-      </w:r>
-      <w:proofErr w:type="spellStart"/>
-      <w:r>
-        <w:rPr>
-          <w:rFonts w:ascii="Times New Roman" w:eastAsia="Times New Roman" w:hAnsi="Times New Roman" w:cs="Times New Roman"/>
-          <w:kern w:val="0"/>
-          <w:sz w:val="24"/>
-          <w:szCs w:val="24"/>
-          <w:lang w:eastAsia="pt-BR"/>
-          <w14:ligatures w14:val="none"/>
-        </w:rPr>
-        <w:t>TikTok</w:t>
-      </w:r>
-      <w:proofErr w:type="spellEnd"/>
-      <w:r>
-        <w:rPr>
-          <w:rFonts w:ascii="Times New Roman" w:eastAsia="Times New Roman" w:hAnsi="Times New Roman" w:cs="Times New Roman"/>
-          <w:kern w:val="0"/>
-          <w:sz w:val="24"/>
-          <w:szCs w:val="24"/>
-          <w:lang w:eastAsia="pt-BR"/>
-          <w14:ligatures w14:val="none"/>
-        </w:rPr>
-        <w:t xml:space="preserve"> vai entregar para quem consome esses conteúdos de trabalho manual.</w:t>
-      </w:r>
-    </w:p>
-    <w:p>
-      <w:pPr>
-        <w:numPr>
-          <w:ilvl w:val="0"/>
-          <w:numId w:val="18"/>
-        </w:numPr>
-        <w:spacing w:before="100" w:beforeAutospacing="1" w:after="100" w:afterAutospacing="1" w:line="240" w:lineRule="auto"/>
-        <w:rPr>
-          <w:rFonts w:ascii="Times New Roman" w:eastAsia="Times New Roman" w:hAnsi="Times New Roman" w:cs="Times New Roman"/>
-          <w:kern w:val="0"/>
-          <w:sz w:val="24"/>
-          <w:szCs w:val="24"/>
-          <w:lang w:eastAsia="pt-BR"/>
-          <w14:ligatures w14:val="none"/>
-        </w:rPr>
-      </w:pPr>
-      <w:r>
-        <w:rPr>
-          <w:rFonts w:ascii="Times New Roman" w:eastAsia="Times New Roman" w:hAnsi="Times New Roman" w:cs="Times New Roman"/>
-          <w:b/>
-          <w:bCs/>
-          <w:kern w:val="0"/>
-          <w:sz w:val="24"/>
-          <w:szCs w:val="24"/>
-          <w:lang w:eastAsia="pt-BR"/>
-          <w14:ligatures w14:val="none"/>
-        </w:rPr>
-        <w:t>No Instagram/Facebook:</w:t>
-      </w:r>
-      <w:r>
-        <w:rPr>
-          <w:rFonts w:ascii="Times New Roman" w:eastAsia="Times New Roman" w:hAnsi="Times New Roman" w:cs="Times New Roman"/>
-          <w:kern w:val="0"/>
-          <w:sz w:val="24"/>
-          <w:szCs w:val="24"/>
-          <w:lang w:eastAsia="pt-BR"/>
-          <w14:ligatures w14:val="none"/>
-        </w:rPr>
-        <w:t xml:space="preserve"> Foque em </w:t>
-      </w:r>
-      <w:r>
-        <w:rPr>
-          <w:rFonts w:ascii="Times New Roman" w:eastAsia="Times New Roman" w:hAnsi="Times New Roman" w:cs="Times New Roman"/>
-          <w:b/>
-          <w:bCs/>
-          <w:kern w:val="0"/>
-          <w:sz w:val="24"/>
-          <w:szCs w:val="24"/>
-          <w:lang w:eastAsia="pt-BR"/>
-          <w14:ligatures w14:val="none"/>
-        </w:rPr>
-        <w:t>Interesses Profissionais</w:t>
-      </w:r>
-      <w:r>
-        <w:rPr>
-          <w:rFonts w:ascii="Times New Roman" w:eastAsia="Times New Roman" w:hAnsi="Times New Roman" w:cs="Times New Roman"/>
-          <w:kern w:val="0"/>
-          <w:sz w:val="24"/>
-          <w:szCs w:val="24"/>
-          <w:lang w:eastAsia="pt-BR"/>
-          <w14:ligatures w14:val="none"/>
-        </w:rPr>
-        <w:t>.</w:t>
-      </w:r>
-    </w:p>
-    <w:p>
-      <w:pPr>
-        <w:numPr>
-          <w:ilvl w:val="1"/>
-          <w:numId w:val="18"/>
-        </w:numPr>
-        <w:spacing w:before="100" w:beforeAutospacing="1" w:after="100" w:afterAutospacing="1" w:line="240" w:lineRule="auto"/>
-        <w:rPr>
-          <w:rFonts w:ascii="Times New Roman" w:eastAsia="Times New Roman" w:hAnsi="Times New Roman" w:cs="Times New Roman"/>
-          <w:kern w:val="0"/>
-          <w:sz w:val="24"/>
-          <w:szCs w:val="24"/>
-          <w:lang w:eastAsia="pt-BR"/>
-          <w14:ligatures w14:val="none"/>
-        </w:rPr>
-      </w:pPr>
-      <w:r>
-        <w:rPr>
-          <w:rFonts w:ascii="Times New Roman" w:eastAsia="Times New Roman" w:hAnsi="Times New Roman" w:cs="Times New Roman"/>
-          <w:b/>
-          <w:bCs/>
-          <w:kern w:val="0"/>
-          <w:sz w:val="24"/>
-          <w:szCs w:val="24"/>
-          <w:lang w:eastAsia="pt-BR"/>
-          <w14:ligatures w14:val="none"/>
-        </w:rPr>
-        <w:t>Público:</w:t>
-      </w:r>
-      <w:r>
-        <w:rPr>
-          <w:rFonts w:ascii="Times New Roman" w:eastAsia="Times New Roman" w:hAnsi="Times New Roman" w:cs="Times New Roman"/>
-          <w:kern w:val="0"/>
-          <w:sz w:val="24"/>
-          <w:szCs w:val="24"/>
-          <w:lang w:eastAsia="pt-BR"/>
-          <w14:ligatures w14:val="none"/>
-        </w:rPr>
-        <w:t xml:space="preserve"> Homens/Mulheres, 25-50 anos.</w:t>
-      </w:r>
-    </w:p>
-    <w:p>
-      <w:pPr>
-        <w:numPr>
-          <w:ilvl w:val="1"/>
-          <w:numId w:val="18"/>
-        </w:numPr>
-        <w:spacing w:before="100" w:beforeAutospacing="1" w:after="100" w:afterAutospacing="1" w:line="240" w:lineRule="auto"/>
-        <w:rPr>
-          <w:rFonts w:ascii="Times New Roman" w:eastAsia="Times New Roman" w:hAnsi="Times New Roman" w:cs="Times New Roman"/>
-          <w:kern w:val="0"/>
-          <w:sz w:val="24"/>
-          <w:szCs w:val="24"/>
-          <w:lang w:eastAsia="pt-BR"/>
-          <w14:ligatures w14:val="none"/>
-        </w:rPr>
-      </w:pPr>
-      <w:r>
-        <w:rPr>
-          <w:rFonts w:ascii="Times New Roman" w:eastAsia="Times New Roman" w:hAnsi="Times New Roman" w:cs="Times New Roman"/>
-          <w:b/>
-          <w:bCs/>
-          <w:kern w:val="0"/>
-          <w:sz w:val="24"/>
-          <w:szCs w:val="24"/>
-          <w:lang w:eastAsia="pt-BR"/>
-          <w14:ligatures w14:val="none"/>
-        </w:rPr>
         <w:lastRenderedPageBreak/>
         <w:t>Interesses:</w:t>
       </w:r>
@@ -5111,79 +4682,7 @@
           <w:lang w:eastAsia="pt-BR"/>
           <w14:ligatures w14:val="none"/>
         </w:rPr>
-        <w:t xml:space="preserve"> Ferramentas (</w:t>
-      </w:r>
-      <w:proofErr w:type="spellStart"/>
-      <w:r>
-        <w:rPr>
-          <w:rFonts w:ascii="Times New Roman" w:eastAsia="Times New Roman" w:hAnsi="Times New Roman" w:cs="Times New Roman"/>
-          <w:kern w:val="0"/>
-          <w:sz w:val="24"/>
-          <w:szCs w:val="24"/>
-          <w:lang w:eastAsia="pt-BR"/>
-          <w14:ligatures w14:val="none"/>
-        </w:rPr>
-        <w:t>Makita</w:t>
-      </w:r>
-      <w:proofErr w:type="spellEnd"/>
-      <w:r>
-        <w:rPr>
-          <w:rFonts w:ascii="Times New Roman" w:eastAsia="Times New Roman" w:hAnsi="Times New Roman" w:cs="Times New Roman"/>
-          <w:kern w:val="0"/>
-          <w:sz w:val="24"/>
-          <w:szCs w:val="24"/>
-          <w:lang w:eastAsia="pt-BR"/>
-          <w14:ligatures w14:val="none"/>
-        </w:rPr>
-        <w:t xml:space="preserve">, </w:t>
-      </w:r>
-      <w:proofErr w:type="spellStart"/>
-      <w:r>
-        <w:rPr>
-          <w:rFonts w:ascii="Times New Roman" w:eastAsia="Times New Roman" w:hAnsi="Times New Roman" w:cs="Times New Roman"/>
-          <w:kern w:val="0"/>
-          <w:sz w:val="24"/>
-          <w:szCs w:val="24"/>
-          <w:lang w:eastAsia="pt-BR"/>
-          <w14:ligatures w14:val="none"/>
-        </w:rPr>
-        <w:t>DeWalt</w:t>
-      </w:r>
-      <w:proofErr w:type="spellEnd"/>
-      <w:r>
-        <w:rPr>
-          <w:rFonts w:ascii="Times New Roman" w:eastAsia="Times New Roman" w:hAnsi="Times New Roman" w:cs="Times New Roman"/>
-          <w:kern w:val="0"/>
-          <w:sz w:val="24"/>
-          <w:szCs w:val="24"/>
-          <w:lang w:eastAsia="pt-BR"/>
-          <w14:ligatures w14:val="none"/>
-        </w:rPr>
-        <w:t xml:space="preserve">), Pagamento por aproximação (quem usa maquininha de cartão), </w:t>
-      </w:r>
-      <w:proofErr w:type="gramStart"/>
-      <w:r>
-        <w:rPr>
-          <w:rFonts w:ascii="Times New Roman" w:eastAsia="Times New Roman" w:hAnsi="Times New Roman" w:cs="Times New Roman"/>
-          <w:kern w:val="0"/>
-          <w:sz w:val="24"/>
-          <w:szCs w:val="24"/>
-          <w:lang w:eastAsia="pt-BR"/>
-          <w14:ligatures w14:val="none"/>
-        </w:rPr>
-        <w:t>Pequenos</w:t>
-      </w:r>
-      <w:proofErr w:type="gramEnd"/>
-      <w:r>
-        <w:rPr>
-          <w:rFonts w:ascii="Times New Roman" w:eastAsia="Times New Roman" w:hAnsi="Times New Roman" w:cs="Times New Roman"/>
-          <w:kern w:val="0"/>
-          <w:sz w:val="24"/>
-          <w:szCs w:val="24"/>
-          <w:lang w:eastAsia="pt-BR"/>
-          <w14:ligatures w14:val="none"/>
-        </w:rPr>
-        <w:t xml:space="preserve"> empresários.</w:t>
+        <w:t xml:space="preserve"> Ferramentas (Makita, DeWalt), Pagamento por aproximação (quem usa maquininha de cartão), Pequenos empresários.</w:t>
       </w:r>
     </w:p>
     <w:p>
@@ -5635,55 +5134,7 @@
           <w:lang w:eastAsia="pt-BR"/>
           <w14:ligatures w14:val="none"/>
         </w:rPr>
-        <w:t xml:space="preserve"> no </w:t>
-      </w:r>
-      <w:proofErr w:type="spellStart"/>
-      <w:r>
-        <w:rPr>
-          <w:rFonts w:ascii="Times New Roman" w:eastAsia="Times New Roman" w:hAnsi="Times New Roman" w:cs="Times New Roman"/>
-          <w:kern w:val="0"/>
-          <w:sz w:val="24"/>
-          <w:szCs w:val="24"/>
-          <w:lang w:eastAsia="pt-BR"/>
-          <w14:ligatures w14:val="none"/>
-        </w:rPr>
-        <w:t>TikTok</w:t>
-      </w:r>
-      <w:proofErr w:type="spellEnd"/>
-      <w:r>
-        <w:rPr>
-          <w:rFonts w:ascii="Times New Roman" w:eastAsia="Times New Roman" w:hAnsi="Times New Roman" w:cs="Times New Roman"/>
-          <w:kern w:val="0"/>
-          <w:sz w:val="24"/>
-          <w:szCs w:val="24"/>
-          <w:lang w:eastAsia="pt-BR"/>
-          <w14:ligatures w14:val="none"/>
-        </w:rPr>
-        <w:t>/</w:t>
-      </w:r>
-      <w:proofErr w:type="spellStart"/>
-      <w:r>
-        <w:rPr>
-          <w:rFonts w:ascii="Times New Roman" w:eastAsia="Times New Roman" w:hAnsi="Times New Roman" w:cs="Times New Roman"/>
-          <w:kern w:val="0"/>
-          <w:sz w:val="24"/>
-          <w:szCs w:val="24"/>
-          <w:lang w:eastAsia="pt-BR"/>
-          <w14:ligatures w14:val="none"/>
-        </w:rPr>
-        <w:t>Reels</w:t>
-      </w:r>
-      <w:proofErr w:type="spellEnd"/>
-      <w:r>
-        <w:rPr>
-          <w:rFonts w:ascii="Times New Roman" w:eastAsia="Times New Roman" w:hAnsi="Times New Roman" w:cs="Times New Roman"/>
-          <w:kern w:val="0"/>
-          <w:sz w:val="24"/>
-          <w:szCs w:val="24"/>
-          <w:lang w:eastAsia="pt-BR"/>
-          <w14:ligatures w14:val="none"/>
-        </w:rPr>
-        <w:t>. Se o seu vídeo for sincero e mostrar a dor do calote, você vai ter uma fila de profissionais querendo testar.</w:t>
+        <w:t xml:space="preserve"> no TikTok/Reels. Se o seu vídeo for sincero e mostrar a dor do calote, você vai ter uma fila de profissionais querendo testar.</w:t>
       </w:r>
     </w:p>
     <w:p>
@@ -5734,31 +5185,7 @@
           <w:lang w:eastAsia="pt-BR"/>
           <w14:ligatures w14:val="none"/>
         </w:rPr>
-        <w:t xml:space="preserve"> O </w:t>
-      </w:r>
-      <w:proofErr w:type="spellStart"/>
-      <w:r>
-        <w:rPr>
-          <w:rFonts w:ascii="Times New Roman" w:eastAsia="Times New Roman" w:hAnsi="Times New Roman" w:cs="Times New Roman"/>
-          <w:kern w:val="0"/>
-          <w:sz w:val="24"/>
-          <w:szCs w:val="24"/>
-          <w:lang w:eastAsia="pt-BR"/>
-          <w14:ligatures w14:val="none"/>
-        </w:rPr>
-        <w:t>Firebase</w:t>
-      </w:r>
-      <w:proofErr w:type="spellEnd"/>
-      <w:r>
-        <w:rPr>
-          <w:rFonts w:ascii="Times New Roman" w:eastAsia="Times New Roman" w:hAnsi="Times New Roman" w:cs="Times New Roman"/>
-          <w:kern w:val="0"/>
-          <w:sz w:val="24"/>
-          <w:szCs w:val="24"/>
-          <w:lang w:eastAsia="pt-BR"/>
-          <w14:ligatures w14:val="none"/>
-        </w:rPr>
-        <w:t>, o PDF e o WhatsApp precisam estar integrados e sem "bugs". É melhor gastar tempo agora depurando o código do que gastar dinheiro depois pedindo desculpas para um cliente que pagou e o contrato não gerou.</w:t>
+        <w:t xml:space="preserve"> O Firebase, o PDF e o WhatsApp precisam estar integrados e sem "bugs". É melhor gastar tempo agora depurando o código do que gastar dinheiro depois pedindo desculpas para um cliente que pagou e o contrato não gerou.</w:t>
       </w:r>
     </w:p>
     <w:p>
@@ -5946,31 +5373,7 @@
           <w14:ligatures w14:val="none"/>
         </w:rPr>
         <w:lastRenderedPageBreak/>
-        <w:t xml:space="preserve">Os dados estão sendo salvos corretamente no </w:t>
-      </w:r>
-      <w:proofErr w:type="spellStart"/>
-      <w:r>
-        <w:rPr>
-          <w:rFonts w:ascii="Times New Roman" w:eastAsia="Times New Roman" w:hAnsi="Times New Roman" w:cs="Times New Roman"/>
-          <w:kern w:val="0"/>
-          <w:sz w:val="24"/>
-          <w:szCs w:val="24"/>
-          <w:lang w:eastAsia="pt-BR"/>
-          <w14:ligatures w14:val="none"/>
-        </w:rPr>
-        <w:t>Firebase</w:t>
-      </w:r>
-      <w:proofErr w:type="spellEnd"/>
-      <w:r>
-        <w:rPr>
-          <w:rFonts w:ascii="Times New Roman" w:eastAsia="Times New Roman" w:hAnsi="Times New Roman" w:cs="Times New Roman"/>
-          <w:kern w:val="0"/>
-          <w:sz w:val="24"/>
-          <w:szCs w:val="24"/>
-          <w:lang w:eastAsia="pt-BR"/>
-          <w14:ligatures w14:val="none"/>
-        </w:rPr>
-        <w:t>?</w:t>
+        <w:t>Os dados estão sendo salvos corretamente no Firebase?</w:t>
       </w:r>
     </w:p>
     <w:p>
@@ -6005,17 +5408,8 @@
           <w:sz w:val="72"/>
           <w:szCs w:val="72"/>
         </w:rPr>
-        <w:t xml:space="preserve">Entrada do </w:t>
-      </w:r>
-      <w:proofErr w:type="spellStart"/>
-      <w:r>
-        <w:rPr>
-          <w:sz w:val="72"/>
-          <w:szCs w:val="72"/>
-        </w:rPr>
-        <w:t>claude</w:t>
-      </w:r>
-      <w:proofErr w:type="spellEnd"/>
+        <w:t>Entrada do claude</w:t>
+      </w:r>
     </w:p>
     <w:p>
       <w:pPr>
@@ -6122,23 +5516,7 @@
           <w:sz w:val="36"/>
           <w:szCs w:val="36"/>
         </w:rPr>
-        <w:t xml:space="preserve"> PWA instalável e offline-</w:t>
-      </w:r>
-      <w:proofErr w:type="spellStart"/>
-      <w:r>
-        <w:rPr>
-          <w:sz w:val="36"/>
-          <w:szCs w:val="36"/>
-        </w:rPr>
-        <w:t>first</w:t>
-      </w:r>
-      <w:proofErr w:type="spellEnd"/>
-      <w:r>
-        <w:rPr>
-          <w:sz w:val="36"/>
-          <w:szCs w:val="36"/>
-        </w:rPr>
-        <w:t xml:space="preserve"> (Feito: </w:t>
+        <w:t xml:space="preserve"> PWA instalável e offline-first (Feito: </w:t>
       </w:r>
       <w:r>
         <w:rPr>
@@ -6155,8 +5533,6 @@
         </w:rPr>
         <w:t xml:space="preserve"> e </w:t>
       </w:r>
-      <w:proofErr w:type="spellStart"/>
-      <w:proofErr w:type="gramStart"/>
       <w:r>
         <w:rPr>
           <w:rStyle w:val="CdigoHTML"/>
@@ -6165,8 +5541,6 @@
         </w:rPr>
         <w:t>manifest.json</w:t>
       </w:r>
-      <w:proofErr w:type="spellEnd"/>
-      <w:proofErr w:type="gramEnd"/>
       <w:r>
         <w:rPr>
           <w:sz w:val="36"/>
@@ -6236,47 +5610,14 @@
           <w:sz w:val="36"/>
           <w:szCs w:val="36"/>
         </w:rPr>
-        <w:t>(PRÓXIMO PASSO</w:t>
-      </w:r>
-      <w:proofErr w:type="gramStart"/>
-      <w:r>
-        <w:rPr>
-          <w:rStyle w:val="font-semibold"/>
-          <w:sz w:val="36"/>
-          <w:szCs w:val="36"/>
-        </w:rPr>
-        <w:t>)</w:t>
-      </w:r>
-      <w:r>
-        <w:rPr>
-          <w:sz w:val="36"/>
-          <w:szCs w:val="36"/>
-        </w:rPr>
-        <w:t xml:space="preserve"> Salvar</w:t>
-      </w:r>
-      <w:proofErr w:type="gramEnd"/>
-      <w:r>
-        <w:rPr>
-          <w:sz w:val="36"/>
-          <w:szCs w:val="36"/>
-        </w:rPr>
-        <w:t xml:space="preserve"> os dados no dispositivo (</w:t>
-      </w:r>
-      <w:proofErr w:type="spellStart"/>
-      <w:r>
-        <w:rPr>
-          <w:sz w:val="36"/>
-          <w:szCs w:val="36"/>
-        </w:rPr>
-        <w:t>LocalStorage</w:t>
-      </w:r>
-      <w:proofErr w:type="spellEnd"/>
-      <w:r>
-        <w:rPr>
-          <w:sz w:val="36"/>
-          <w:szCs w:val="36"/>
-        </w:rPr>
-        <w:t>): Para o usuário não perder os dados se fechar a aba e para preencher automaticamente os próprios dados na próxima vez.</w:t>
+        <w:t>(PRÓXIMO PASSO)</w:t>
+      </w:r>
+      <w:r>
+        <w:rPr>
+          <w:sz w:val="36"/>
+          <w:szCs w:val="36"/>
+        </w:rPr>
+        <w:t xml:space="preserve"> Salvar os dados no dispositivo (LocalStorage): Para o usuário não perder os dados se fechar a aba e para preencher automaticamente os próprios dados na próxima vez.</w:t>
       </w:r>
     </w:p>
     <w:p>
@@ -6304,23 +5645,7 @@
           <w:sz w:val="36"/>
           <w:szCs w:val="36"/>
         </w:rPr>
-        <w:t xml:space="preserve"> Exportação e Compartilhamento: Botões para PDF, </w:t>
-      </w:r>
-      <w:proofErr w:type="gramStart"/>
-      <w:r>
-        <w:rPr>
-          <w:sz w:val="36"/>
-          <w:szCs w:val="36"/>
-        </w:rPr>
-        <w:t>Imprimir e enviar</w:t>
-      </w:r>
-      <w:proofErr w:type="gramEnd"/>
-      <w:r>
-        <w:rPr>
-          <w:sz w:val="36"/>
-          <w:szCs w:val="36"/>
-        </w:rPr>
-        <w:t xml:space="preserve"> direto pro WhatsApp.</w:t>
+        <w:t xml:space="preserve"> Exportação e Compartilhamento: Botões para PDF, Imprimir e enviar direto pro WhatsApp.</w:t>
       </w:r>
     </w:p>
     <w:p>
@@ -6448,39 +5773,7 @@
           <w:sz w:val="36"/>
           <w:szCs w:val="36"/>
         </w:rPr>
-        <w:t xml:space="preserve"> Uma lista dos contratos já gerados (salvos no celular via </w:t>
-      </w:r>
-      <w:proofErr w:type="spellStart"/>
-      <w:r>
-        <w:rPr>
-          <w:sz w:val="36"/>
-          <w:szCs w:val="36"/>
-        </w:rPr>
-        <w:t>IndexedDB</w:t>
-      </w:r>
-      <w:proofErr w:type="spellEnd"/>
-      <w:r>
-        <w:rPr>
-          <w:sz w:val="36"/>
-          <w:szCs w:val="36"/>
-        </w:rPr>
-        <w:t>/</w:t>
-      </w:r>
-      <w:proofErr w:type="spellStart"/>
-      <w:r>
-        <w:rPr>
-          <w:sz w:val="36"/>
-          <w:szCs w:val="36"/>
-        </w:rPr>
-        <w:t>LocalStorage</w:t>
-      </w:r>
-      <w:proofErr w:type="spellEnd"/>
-      <w:r>
-        <w:rPr>
-          <w:sz w:val="36"/>
-          <w:szCs w:val="36"/>
-        </w:rPr>
-        <w:t>) para ele consultar ou baixar de novo.</w:t>
+        <w:t xml:space="preserve"> Uma lista dos contratos já gerados (salvos no celular via IndexedDB/LocalStorage) para ele consultar ou baixar de novo.</w:t>
       </w:r>
     </w:p>
     <w:p>
@@ -6600,55 +5893,7 @@
           <w:sz w:val="36"/>
           <w:szCs w:val="36"/>
         </w:rPr>
-        <w:t xml:space="preserve"> Login simples (</w:t>
-      </w:r>
-      <w:proofErr w:type="spellStart"/>
-      <w:r>
-        <w:rPr>
-          <w:sz w:val="36"/>
-          <w:szCs w:val="36"/>
-        </w:rPr>
-        <w:t>Email</w:t>
-      </w:r>
-      <w:proofErr w:type="spellEnd"/>
-      <w:r>
-        <w:rPr>
-          <w:sz w:val="36"/>
-          <w:szCs w:val="36"/>
-        </w:rPr>
-        <w:t xml:space="preserve">/Senha ou Google). Podemos usar o </w:t>
-      </w:r>
-      <w:proofErr w:type="spellStart"/>
-      <w:r>
-        <w:rPr>
-          <w:sz w:val="36"/>
-          <w:szCs w:val="36"/>
-        </w:rPr>
-        <w:t>Firebase</w:t>
-      </w:r>
-      <w:proofErr w:type="spellEnd"/>
-      <w:r>
-        <w:rPr>
-          <w:sz w:val="36"/>
-          <w:szCs w:val="36"/>
-        </w:rPr>
-        <w:t xml:space="preserve"> (gratuito e excelente para </w:t>
-      </w:r>
-      <w:proofErr w:type="spellStart"/>
-      <w:r>
-        <w:rPr>
-          <w:sz w:val="36"/>
-          <w:szCs w:val="36"/>
-        </w:rPr>
-        <w:t>PWAs</w:t>
-      </w:r>
-      <w:proofErr w:type="spellEnd"/>
-      <w:r>
-        <w:rPr>
-          <w:sz w:val="36"/>
-          <w:szCs w:val="36"/>
-        </w:rPr>
-        <w:t xml:space="preserve"> híbridos).</w:t>
+        <w:t xml:space="preserve"> Login simples (Email/Senha ou Google). Podemos usar o Firebase (gratuito e excelente para PWAs híbridos).</w:t>
       </w:r>
     </w:p>
     <w:p>
@@ -6691,23 +5936,7 @@
           <w:sz w:val="36"/>
           <w:szCs w:val="36"/>
         </w:rPr>
-        <w:t xml:space="preserve"> O app pega o histórico que estava só no celular e joga pra nuvem associado àquela conta. Se ele </w:t>
-      </w:r>
-      <w:proofErr w:type="spellStart"/>
-      <w:r>
-        <w:rPr>
-          <w:sz w:val="36"/>
-          <w:szCs w:val="36"/>
-        </w:rPr>
-        <w:t>logar</w:t>
-      </w:r>
-      <w:proofErr w:type="spellEnd"/>
-      <w:r>
-        <w:rPr>
-          <w:sz w:val="36"/>
-          <w:szCs w:val="36"/>
-        </w:rPr>
-        <w:t xml:space="preserve"> no computador, os contratos estão lá.</w:t>
+        <w:t xml:space="preserve"> O app pega o histórico que estava só no celular e joga pra nuvem associado àquela conta. Se ele logar no computador, os contratos estão lá.</w:t>
       </w:r>
     </w:p>
     <w:p>
@@ -6777,25 +6006,7 @@
           <w:sz w:val="36"/>
           <w:szCs w:val="36"/>
         </w:rPr>
-        <w:t>Contador de Uso (</w:t>
-      </w:r>
-      <w:proofErr w:type="spellStart"/>
-      <w:r>
-        <w:rPr>
-          <w:rStyle w:val="font-semibold"/>
-          <w:sz w:val="36"/>
-          <w:szCs w:val="36"/>
-        </w:rPr>
-        <w:t>Paywall</w:t>
-      </w:r>
-      <w:proofErr w:type="spellEnd"/>
-      <w:r>
-        <w:rPr>
-          <w:rStyle w:val="font-semibold"/>
-          <w:sz w:val="36"/>
-          <w:szCs w:val="36"/>
-        </w:rPr>
-        <w:t>):</w:t>
+        <w:t>Contador de Uso (Paywall):</w:t>
       </w:r>
       <w:r>
         <w:rPr>
@@ -6846,39 +6057,7 @@
           <w:sz w:val="36"/>
           <w:szCs w:val="36"/>
         </w:rPr>
-        <w:t xml:space="preserve"> Conectar com </w:t>
-      </w:r>
-      <w:proofErr w:type="spellStart"/>
-      <w:r>
-        <w:rPr>
-          <w:sz w:val="36"/>
-          <w:szCs w:val="36"/>
-        </w:rPr>
-        <w:t>Stripe</w:t>
-      </w:r>
-      <w:proofErr w:type="spellEnd"/>
-      <w:r>
-        <w:rPr>
-          <w:sz w:val="36"/>
-          <w:szCs w:val="36"/>
-        </w:rPr>
-        <w:t xml:space="preserve">, Mercado Pago ou </w:t>
-      </w:r>
-      <w:proofErr w:type="spellStart"/>
-      <w:r>
-        <w:rPr>
-          <w:sz w:val="36"/>
-          <w:szCs w:val="36"/>
-        </w:rPr>
-        <w:t>Asaas</w:t>
-      </w:r>
-      <w:proofErr w:type="spellEnd"/>
-      <w:r>
-        <w:rPr>
-          <w:sz w:val="36"/>
-          <w:szCs w:val="36"/>
-        </w:rPr>
-        <w:t xml:space="preserve"> para cobrar a assinatura (mensal/anual).</w:t>
+        <w:t xml:space="preserve"> Conectar com Stripe, Mercado Pago ou Asaas para cobrar a assinatura (mensal/anual).</w:t>
       </w:r>
     </w:p>
     <w:p>
@@ -7046,23 +6225,13 @@
           <w:szCs w:val="36"/>
         </w:rPr>
       </w:pPr>
-      <w:proofErr w:type="spellStart"/>
       <w:r>
         <w:rPr>
           <w:rStyle w:val="font-semibold"/>
           <w:sz w:val="36"/>
           <w:szCs w:val="36"/>
         </w:rPr>
-        <w:t>LocalStorage</w:t>
-      </w:r>
-      <w:proofErr w:type="spellEnd"/>
-      <w:r>
-        <w:rPr>
-          <w:rStyle w:val="font-semibold"/>
-          <w:sz w:val="36"/>
-          <w:szCs w:val="36"/>
-        </w:rPr>
-        <w:t xml:space="preserve"> (Salvar Dados):</w:t>
+        <w:t>LocalStorage (Salvar Dados):</w:t>
       </w:r>
       <w:r>
         <w:rPr>
@@ -7260,6 +6429,7 @@
           <w:numId w:val="29"/>
         </w:numPr>
         <w:rPr>
+          <w:color w:val="ACB9CA" w:themeColor="text2" w:themeTint="66"/>
           <w:sz w:val="36"/>
           <w:szCs w:val="36"/>
         </w:rPr>
@@ -7267,6 +6437,7 @@
       <w:r>
         <w:rPr>
           <w:rFonts w:ascii="Segoe UI Symbol" w:hAnsi="Segoe UI Symbol" w:cs="Segoe UI Symbol"/>
+          <w:color w:val="ACB9CA" w:themeColor="text2" w:themeTint="66"/>
           <w:sz w:val="36"/>
           <w:szCs w:val="36"/>
         </w:rPr>
@@ -7274,26 +6445,19 @@
       </w:r>
       <w:r>
         <w:rPr>
-          <w:sz w:val="36"/>
-          <w:szCs w:val="36"/>
-        </w:rPr>
-        <w:t xml:space="preserve"> Termo de Responsabilidade (</w:t>
-      </w:r>
-      <w:proofErr w:type="spellStart"/>
-      <w:r>
-        <w:rPr>
-          <w:sz w:val="36"/>
-          <w:szCs w:val="36"/>
-        </w:rPr>
-        <w:t>disclaimer</w:t>
-      </w:r>
-      <w:proofErr w:type="spellEnd"/>
-      <w:r>
-        <w:rPr>
-          <w:sz w:val="36"/>
-          <w:szCs w:val="36"/>
-        </w:rPr>
-        <w:t xml:space="preserve"> jurídico)</w:t>
+          <w:color w:val="ACB9CA" w:themeColor="text2" w:themeTint="66"/>
+          <w:sz w:val="36"/>
+          <w:szCs w:val="36"/>
+        </w:rPr>
+        <w:t xml:space="preserve"> Termo de Responsabilidade (disclaimer jurídico)</w:t>
+      </w:r>
+      <w:r>
+        <w:rPr>
+          <w:color w:val="ACB9CA" w:themeColor="text2" w:themeTint="66"/>
+          <w:sz w:val="36"/>
+          <w:szCs w:val="36"/>
+        </w:rPr>
+        <w:t xml:space="preserve"> - FEITO</w:t>
       </w:r>
     </w:p>
     <w:p>
@@ -7705,23 +6869,7 @@
           <w:sz w:val="36"/>
           <w:szCs w:val="36"/>
         </w:rPr>
-        <w:t xml:space="preserve"> CPF/CNPJ - você </w:t>
-      </w:r>
-      <w:proofErr w:type="spellStart"/>
-      <w:r>
-        <w:rPr>
-          <w:sz w:val="36"/>
-          <w:szCs w:val="36"/>
-        </w:rPr>
-        <w:t>valida</w:t>
-      </w:r>
-      <w:proofErr w:type="spellEnd"/>
-      <w:r>
-        <w:rPr>
-          <w:sz w:val="36"/>
-          <w:szCs w:val="36"/>
-        </w:rPr>
-        <w:t>, mas não integra com API de validação</w:t>
+        <w:t xml:space="preserve"> CPF/CNPJ - você valida, mas não integra com API de validação</w:t>
       </w:r>
     </w:p>
     <w:p>
@@ -7799,25 +6947,7 @@
           <w:szCs w:val="36"/>
         </w:rPr>
         <w:lastRenderedPageBreak/>
-        <w:t xml:space="preserve">Questões de </w:t>
-      </w:r>
-      <w:proofErr w:type="spellStart"/>
-      <w:r>
-        <w:rPr>
-          <w:rStyle w:val="font-semibold"/>
-          <w:sz w:val="36"/>
-          <w:szCs w:val="36"/>
-        </w:rPr>
-        <w:t>Compliance</w:t>
-      </w:r>
-      <w:proofErr w:type="spellEnd"/>
-      <w:r>
-        <w:rPr>
-          <w:rStyle w:val="font-semibold"/>
-          <w:sz w:val="36"/>
-          <w:szCs w:val="36"/>
-        </w:rPr>
-        <w:t>:</w:t>
+        <w:t>Questões de Compliance:</w:t>
       </w:r>
     </w:p>
     <w:p>
@@ -7872,23 +7002,7 @@
           <w:sz w:val="36"/>
           <w:szCs w:val="36"/>
         </w:rPr>
-        <w:t>Assinatura eletrônica (e-</w:t>
-      </w:r>
-      <w:proofErr w:type="spellStart"/>
-      <w:r>
-        <w:rPr>
-          <w:sz w:val="36"/>
-          <w:szCs w:val="36"/>
-        </w:rPr>
-        <w:t>signature</w:t>
-      </w:r>
-      <w:proofErr w:type="spellEnd"/>
-      <w:r>
-        <w:rPr>
-          <w:sz w:val="36"/>
-          <w:szCs w:val="36"/>
-        </w:rPr>
-        <w:t>) - você tem?</w:t>
+        <w:t>Assinatura eletrônica (e-signature) - você tem?</w:t>
       </w:r>
     </w:p>
     <w:p>
@@ -8078,21 +7192,12 @@
           <w:szCs w:val="36"/>
         </w:rPr>
       </w:pPr>
-      <w:proofErr w:type="spellStart"/>
-      <w:r>
-        <w:rPr>
-          <w:sz w:val="36"/>
-          <w:szCs w:val="36"/>
-        </w:rPr>
-        <w:t>Responsive</w:t>
-      </w:r>
-      <w:proofErr w:type="spellEnd"/>
-      <w:r>
-        <w:rPr>
-          <w:sz w:val="36"/>
-          <w:szCs w:val="36"/>
-        </w:rPr>
-        <w:t xml:space="preserve"> design</w:t>
+      <w:r>
+        <w:rPr>
+          <w:sz w:val="36"/>
+          <w:szCs w:val="36"/>
+        </w:rPr>
+        <w:t>Responsive design</w:t>
       </w:r>
     </w:p>
     <w:p>
@@ -8107,21 +7212,12 @@
           <w:szCs w:val="36"/>
         </w:rPr>
       </w:pPr>
-      <w:proofErr w:type="spellStart"/>
-      <w:r>
-        <w:rPr>
-          <w:sz w:val="36"/>
-          <w:szCs w:val="36"/>
-        </w:rPr>
-        <w:t>Toggle</w:t>
-      </w:r>
-      <w:proofErr w:type="spellEnd"/>
-      <w:r>
-        <w:rPr>
-          <w:sz w:val="36"/>
-          <w:szCs w:val="36"/>
-        </w:rPr>
-        <w:t xml:space="preserve"> switches bem implementados</w:t>
+      <w:r>
+        <w:rPr>
+          <w:sz w:val="36"/>
+          <w:szCs w:val="36"/>
+        </w:rPr>
+        <w:t>Toggle switches bem implementados</w:t>
       </w:r>
     </w:p>
     <w:p>
@@ -8231,23 +7327,7 @@
           <w:sz w:val="36"/>
           <w:szCs w:val="36"/>
         </w:rPr>
-        <w:t xml:space="preserve"> (</w:t>
-      </w:r>
-      <w:proofErr w:type="spellStart"/>
-      <w:r>
-        <w:rPr>
-          <w:sz w:val="36"/>
-          <w:szCs w:val="36"/>
-        </w:rPr>
-        <w:t>user</w:t>
-      </w:r>
-      <w:proofErr w:type="spellEnd"/>
-      <w:r>
-        <w:rPr>
-          <w:sz w:val="36"/>
-          <w:szCs w:val="36"/>
-        </w:rPr>
-        <w:t xml:space="preserve"> vê tudo de uma vez no final)</w:t>
+        <w:t xml:space="preserve"> (user vê tudo de uma vez no final)</w:t>
       </w:r>
     </w:p>
     <w:p>
@@ -8320,46 +7400,20 @@
         </w:rPr>
         <w:t xml:space="preserve"> Sem </w:t>
       </w:r>
-      <w:proofErr w:type="spellStart"/>
       <w:r>
         <w:rPr>
           <w:rStyle w:val="font-semibold"/>
           <w:sz w:val="36"/>
           <w:szCs w:val="36"/>
         </w:rPr>
-        <w:t>templates</w:t>
-      </w:r>
-      <w:proofErr w:type="spellEnd"/>
-      <w:r>
-        <w:rPr>
-          <w:rStyle w:val="font-semibold"/>
-          <w:sz w:val="36"/>
-          <w:szCs w:val="36"/>
-        </w:rPr>
-        <w:t xml:space="preserve"> salvos</w:t>
-      </w:r>
-      <w:r>
-        <w:rPr>
-          <w:sz w:val="36"/>
-          <w:szCs w:val="36"/>
-        </w:rPr>
-        <w:t xml:space="preserve"> (</w:t>
-      </w:r>
-      <w:proofErr w:type="spellStart"/>
-      <w:r>
-        <w:rPr>
-          <w:sz w:val="36"/>
-          <w:szCs w:val="36"/>
-        </w:rPr>
-        <w:t>user</w:t>
-      </w:r>
-      <w:proofErr w:type="spellEnd"/>
-      <w:r>
-        <w:rPr>
-          <w:sz w:val="36"/>
-          <w:szCs w:val="36"/>
-        </w:rPr>
-        <w:t xml:space="preserve"> preenche tudo toda vez)</w:t>
+        <w:t>templates salvos</w:t>
+      </w:r>
+      <w:r>
+        <w:rPr>
+          <w:sz w:val="36"/>
+          <w:szCs w:val="36"/>
+        </w:rPr>
+        <w:t xml:space="preserve"> (user preenche tudo toda vez)</w:t>
       </w:r>
     </w:p>
     <w:p>
@@ -8402,39 +7456,7 @@
           <w:sz w:val="36"/>
           <w:szCs w:val="36"/>
         </w:rPr>
-        <w:t xml:space="preserve"> (</w:t>
-      </w:r>
-      <w:proofErr w:type="spellStart"/>
-      <w:r>
-        <w:rPr>
-          <w:sz w:val="36"/>
-          <w:szCs w:val="36"/>
-        </w:rPr>
-        <w:t>Dark</w:t>
-      </w:r>
-      <w:proofErr w:type="spellEnd"/>
-      <w:r>
-        <w:rPr>
-          <w:sz w:val="36"/>
-          <w:szCs w:val="36"/>
-        </w:rPr>
-        <w:t xml:space="preserve"> </w:t>
-      </w:r>
-      <w:proofErr w:type="spellStart"/>
-      <w:r>
-        <w:rPr>
-          <w:sz w:val="36"/>
-          <w:szCs w:val="36"/>
-        </w:rPr>
-        <w:t>Mode</w:t>
-      </w:r>
-      <w:proofErr w:type="spellEnd"/>
-      <w:r>
-        <w:rPr>
-          <w:sz w:val="36"/>
-          <w:szCs w:val="36"/>
-        </w:rPr>
-        <w:t>)</w:t>
+        <w:t xml:space="preserve"> (Dark Mode)</w:t>
       </w:r>
     </w:p>
     <w:p>
@@ -8477,39 +7499,7 @@
           <w:sz w:val="36"/>
           <w:szCs w:val="36"/>
         </w:rPr>
-        <w:t xml:space="preserve"> </w:t>
-      </w:r>
-      <w:proofErr w:type="spellStart"/>
-      <w:r>
-        <w:rPr>
-          <w:sz w:val="36"/>
-          <w:szCs w:val="36"/>
-        </w:rPr>
-        <w:t>inline</w:t>
-      </w:r>
-      <w:proofErr w:type="spellEnd"/>
-      <w:r>
-        <w:rPr>
-          <w:sz w:val="36"/>
-          <w:szCs w:val="36"/>
-        </w:rPr>
-        <w:t xml:space="preserve"> (</w:t>
-      </w:r>
-      <w:proofErr w:type="spellStart"/>
-      <w:r>
-        <w:rPr>
-          <w:sz w:val="36"/>
-          <w:szCs w:val="36"/>
-        </w:rPr>
-        <w:t>tooltips</w:t>
-      </w:r>
-      <w:proofErr w:type="spellEnd"/>
-      <w:r>
-        <w:rPr>
-          <w:sz w:val="36"/>
-          <w:szCs w:val="36"/>
-        </w:rPr>
-        <w:t xml:space="preserve"> nos campos)</w:t>
+        <w:t xml:space="preserve"> inline (tooltips nos campos)</w:t>
       </w:r>
     </w:p>
     <w:p>
@@ -8637,23 +7627,13 @@
         </w:rPr>
         <w:t xml:space="preserve"> Sem </w:t>
       </w:r>
-      <w:proofErr w:type="spellStart"/>
       <w:r>
         <w:rPr>
           <w:rStyle w:val="font-semibold"/>
           <w:sz w:val="36"/>
           <w:szCs w:val="36"/>
         </w:rPr>
-        <w:t>labels</w:t>
-      </w:r>
-      <w:proofErr w:type="spellEnd"/>
-      <w:r>
-        <w:rPr>
-          <w:rStyle w:val="font-semibold"/>
-          <w:sz w:val="36"/>
-          <w:szCs w:val="36"/>
-        </w:rPr>
-        <w:t xml:space="preserve"> acessíveis</w:t>
+        <w:t>labels acessíveis</w:t>
       </w:r>
       <w:r>
         <w:rPr>
@@ -8696,18 +7676,8 @@
           <w:sz w:val="36"/>
           <w:szCs w:val="36"/>
         </w:rPr>
-        <w:t xml:space="preserve">ARIA </w:t>
-      </w:r>
-      <w:proofErr w:type="spellStart"/>
-      <w:r>
-        <w:rPr>
-          <w:rStyle w:val="font-semibold"/>
-          <w:sz w:val="36"/>
-          <w:szCs w:val="36"/>
-        </w:rPr>
-        <w:t>attributes</w:t>
-      </w:r>
-      <w:proofErr w:type="spellEnd"/>
+        <w:t>ARIA attributes</w:t>
+      </w:r>
     </w:p>
     <w:p>
       <w:pPr>
@@ -8742,18 +7712,8 @@
           <w:sz w:val="36"/>
           <w:szCs w:val="36"/>
         </w:rPr>
-        <w:t xml:space="preserve">keyboard </w:t>
-      </w:r>
-      <w:proofErr w:type="spellStart"/>
-      <w:r>
-        <w:rPr>
-          <w:rStyle w:val="font-semibold"/>
-          <w:sz w:val="36"/>
-          <w:szCs w:val="36"/>
-        </w:rPr>
-        <w:t>navigation</w:t>
-      </w:r>
-      <w:proofErr w:type="spellEnd"/>
+        <w:t>keyboard navigation</w:t>
+      </w:r>
       <w:r>
         <w:rPr>
           <w:sz w:val="36"/>
@@ -8846,34 +7806,14 @@
         </w:rPr>
         <w:t xml:space="preserve"> Sem </w:t>
       </w:r>
-      <w:proofErr w:type="spellStart"/>
       <w:r>
         <w:rPr>
           <w:rStyle w:val="font-semibold"/>
           <w:sz w:val="36"/>
           <w:szCs w:val="36"/>
         </w:rPr>
-        <w:t>spinner</w:t>
-      </w:r>
-      <w:proofErr w:type="spellEnd"/>
-      <w:r>
-        <w:rPr>
-          <w:rStyle w:val="font-semibold"/>
-          <w:sz w:val="36"/>
-          <w:szCs w:val="36"/>
-        </w:rPr>
-        <w:t>/</w:t>
-      </w:r>
-      <w:proofErr w:type="spellStart"/>
-      <w:r>
-        <w:rPr>
-          <w:rStyle w:val="font-semibold"/>
-          <w:sz w:val="36"/>
-          <w:szCs w:val="36"/>
-        </w:rPr>
-        <w:t>loading</w:t>
-      </w:r>
-      <w:proofErr w:type="spellEnd"/>
+        <w:t>spinner/loading</w:t>
+      </w:r>
       <w:r>
         <w:rPr>
           <w:sz w:val="36"/>
@@ -9388,23 +8328,13 @@
               </w:rPr>
               <w:t xml:space="preserve"> </w:t>
             </w:r>
-            <w:proofErr w:type="spellStart"/>
             <w:r>
               <w:rPr>
                 <w:rStyle w:val="font-semibold"/>
                 <w:sz w:val="36"/>
                 <w:szCs w:val="36"/>
               </w:rPr>
-              <w:t>Email</w:t>
-            </w:r>
-            <w:proofErr w:type="spellEnd"/>
-            <w:r>
-              <w:rPr>
-                <w:rStyle w:val="font-semibold"/>
-                <w:sz w:val="36"/>
-                <w:szCs w:val="36"/>
-              </w:rPr>
-              <w:t xml:space="preserve"> para usuário</w:t>
+              <w:t>Email para usuário</w:t>
             </w:r>
           </w:p>
         </w:tc>
@@ -10119,18 +9049,8 @@
           <w:sz w:val="36"/>
           <w:szCs w:val="36"/>
         </w:rPr>
-        <w:t xml:space="preserve">armazenados apenas no </w:t>
-      </w:r>
-      <w:proofErr w:type="spellStart"/>
-      <w:r>
-        <w:rPr>
-          <w:rStyle w:val="font-semibold"/>
-          <w:sz w:val="36"/>
-          <w:szCs w:val="36"/>
-        </w:rPr>
-        <w:t>localStorage</w:t>
-      </w:r>
-      <w:proofErr w:type="spellEnd"/>
+        <w:t>armazenados apenas no localStorage</w:t>
+      </w:r>
       <w:r>
         <w:rPr>
           <w:sz w:val="36"/>
@@ -10506,39 +9426,7 @@
           <w:sz w:val="36"/>
           <w:szCs w:val="36"/>
         </w:rPr>
-        <w:t xml:space="preserve"> (</w:t>
-      </w:r>
-      <w:proofErr w:type="spellStart"/>
-      <w:r>
-        <w:rPr>
-          <w:sz w:val="36"/>
-          <w:szCs w:val="36"/>
-        </w:rPr>
-        <w:t>Vue</w:t>
-      </w:r>
-      <w:proofErr w:type="spellEnd"/>
-      <w:r>
-        <w:rPr>
-          <w:sz w:val="36"/>
-          <w:szCs w:val="36"/>
-        </w:rPr>
-        <w:t>/</w:t>
-      </w:r>
-      <w:proofErr w:type="spellStart"/>
-      <w:r>
-        <w:rPr>
-          <w:sz w:val="36"/>
-          <w:szCs w:val="36"/>
-        </w:rPr>
-        <w:t>React</w:t>
-      </w:r>
-      <w:proofErr w:type="spellEnd"/>
-      <w:r>
-        <w:rPr>
-          <w:sz w:val="36"/>
-          <w:szCs w:val="36"/>
-        </w:rPr>
-        <w:t>) - dificulta escalabilidade</w:t>
+        <w:t xml:space="preserve"> (Vue/React) - dificulta escalabilidade</w:t>
       </w:r>
     </w:p>
     <w:p>
@@ -10574,34 +9462,15 @@
           <w:sz w:val="36"/>
           <w:szCs w:val="36"/>
         </w:rPr>
-        <w:t xml:space="preserve">API </w:t>
-      </w:r>
-      <w:proofErr w:type="spellStart"/>
-      <w:r>
-        <w:rPr>
-          <w:rStyle w:val="font-semibold"/>
-          <w:sz w:val="36"/>
-          <w:szCs w:val="36"/>
-        </w:rPr>
-        <w:t>Backend</w:t>
-      </w:r>
-      <w:proofErr w:type="spellEnd"/>
-      <w:r>
-        <w:rPr>
-          <w:sz w:val="36"/>
-          <w:szCs w:val="36"/>
-        </w:rPr>
-        <w:t xml:space="preserve"> - tudo </w:t>
-      </w:r>
-      <w:proofErr w:type="spellStart"/>
-      <w:r>
-        <w:rPr>
-          <w:sz w:val="36"/>
-          <w:szCs w:val="36"/>
-        </w:rPr>
-        <w:t>client-side</w:t>
-      </w:r>
-      <w:proofErr w:type="spellEnd"/>
+        <w:t>API Backend</w:t>
+      </w:r>
+      <w:r>
+        <w:rPr>
+          <w:sz w:val="36"/>
+          <w:szCs w:val="36"/>
+        </w:rPr>
+        <w:t xml:space="preserve"> - tudo client-side</w:t>
+      </w:r>
     </w:p>
     <w:p>
       <w:pPr>
@@ -10666,23 +9535,13 @@
         </w:rPr>
         <w:t xml:space="preserve"> Sem </w:t>
       </w:r>
-      <w:proofErr w:type="spellStart"/>
       <w:r>
         <w:rPr>
           <w:rStyle w:val="font-semibold"/>
           <w:sz w:val="36"/>
           <w:szCs w:val="36"/>
         </w:rPr>
-        <w:t>Logging</w:t>
-      </w:r>
-      <w:proofErr w:type="spellEnd"/>
-      <w:r>
-        <w:rPr>
-          <w:rStyle w:val="font-semibold"/>
-          <w:sz w:val="36"/>
-          <w:szCs w:val="36"/>
-        </w:rPr>
-        <w:t>/Monitoramento</w:t>
+        <w:t>Logging/Monitoramento</w:t>
       </w:r>
     </w:p>
     <w:p>
@@ -10937,23 +9796,7 @@
           <w:sz w:val="36"/>
           <w:szCs w:val="36"/>
         </w:rPr>
-        <w:t>├─ Assinatura digital (e-</w:t>
-      </w:r>
-      <w:proofErr w:type="spellStart"/>
-      <w:r>
-        <w:rPr>
-          <w:sz w:val="36"/>
-          <w:szCs w:val="36"/>
-        </w:rPr>
-        <w:t>signature</w:t>
-      </w:r>
-      <w:proofErr w:type="spellEnd"/>
-      <w:r>
-        <w:rPr>
-          <w:sz w:val="36"/>
-          <w:szCs w:val="36"/>
-        </w:rPr>
-        <w:t>)</w:t>
+        <w:t>├─ Assinatura digital (e-signature)</w:t>
       </w:r>
     </w:p>
     <w:p>
@@ -10985,23 +9828,7 @@
           <w:sz w:val="36"/>
           <w:szCs w:val="36"/>
         </w:rPr>
-        <w:t xml:space="preserve">├─ </w:t>
-      </w:r>
-      <w:proofErr w:type="spellStart"/>
-      <w:r>
-        <w:rPr>
-          <w:sz w:val="36"/>
-          <w:szCs w:val="36"/>
-        </w:rPr>
-        <w:t>Templates</w:t>
-      </w:r>
-      <w:proofErr w:type="spellEnd"/>
-      <w:r>
-        <w:rPr>
-          <w:sz w:val="36"/>
-          <w:szCs w:val="36"/>
-        </w:rPr>
-        <w:t xml:space="preserve"> salvos</w:t>
+        <w:t>├─ Templates salvos</w:t>
       </w:r>
     </w:p>
     <w:p>
@@ -11018,17 +9845,8 @@
           <w:szCs w:val="36"/>
         </w:rPr>
         <w:lastRenderedPageBreak/>
-        <w:t xml:space="preserve">├─ Suporte por </w:t>
-      </w:r>
-      <w:proofErr w:type="spellStart"/>
-      <w:r>
-        <w:rPr>
-          <w:sz w:val="36"/>
-          <w:szCs w:val="36"/>
-        </w:rPr>
-        <w:t>email</w:t>
-      </w:r>
-      <w:proofErr w:type="spellEnd"/>
+        <w:t>├─ Suporte por email</w:t>
+      </w:r>
     </w:p>
     <w:p>
       <w:pPr>
@@ -11100,17 +9918,8 @@
           <w:sz w:val="36"/>
           <w:szCs w:val="36"/>
         </w:rPr>
-        <w:t>├─ White-</w:t>
-      </w:r>
-      <w:proofErr w:type="spellStart"/>
-      <w:r>
-        <w:rPr>
-          <w:sz w:val="36"/>
-          <w:szCs w:val="36"/>
-        </w:rPr>
-        <w:t>label</w:t>
-      </w:r>
-      <w:proofErr w:type="spellEnd"/>
+        <w:t>├─ White-label</w:t>
+      </w:r>
     </w:p>
     <w:p>
       <w:pPr>
@@ -11249,7 +10058,6 @@
         </w:rPr>
         <w:t xml:space="preserve">Usar biblioteca como </w:t>
       </w:r>
-      <w:proofErr w:type="spellStart"/>
       <w:r>
         <w:rPr>
           <w:rStyle w:val="CdigoHTML"/>
@@ -11258,7 +10066,6 @@
         </w:rPr>
         <w:t>pdfkit</w:t>
       </w:r>
-      <w:proofErr w:type="spellEnd"/>
       <w:r>
         <w:rPr>
           <w:sz w:val="36"/>
@@ -11328,18 +10135,8 @@
           <w:sz w:val="36"/>
           <w:szCs w:val="36"/>
         </w:rPr>
-        <w:t xml:space="preserve">Banco de Dados </w:t>
-      </w:r>
-      <w:proofErr w:type="spellStart"/>
-      <w:r>
-        <w:rPr>
-          <w:rStyle w:val="font-semibold"/>
-          <w:sz w:val="36"/>
-          <w:szCs w:val="36"/>
-        </w:rPr>
-        <w:t>Backend</w:t>
-      </w:r>
-      <w:proofErr w:type="spellEnd"/>
+        <w:t>Banco de Dados Backend</w:t>
+      </w:r>
     </w:p>
     <w:p>
       <w:pPr>
@@ -11353,21 +10150,12 @@
           <w:szCs w:val="36"/>
         </w:rPr>
       </w:pPr>
-      <w:proofErr w:type="spellStart"/>
-      <w:r>
-        <w:rPr>
-          <w:sz w:val="36"/>
-          <w:szCs w:val="36"/>
-        </w:rPr>
-        <w:t>Firebase</w:t>
-      </w:r>
-      <w:proofErr w:type="spellEnd"/>
-      <w:r>
-        <w:rPr>
-          <w:sz w:val="36"/>
-          <w:szCs w:val="36"/>
-        </w:rPr>
-        <w:t xml:space="preserve"> (mais fácil) ou</w:t>
+      <w:r>
+        <w:rPr>
+          <w:sz w:val="36"/>
+          <w:szCs w:val="36"/>
+        </w:rPr>
+        <w:t>Firebase (mais fácil) ou</w:t>
       </w:r>
     </w:p>
     <w:p>
@@ -11387,23 +10175,7 @@
           <w:sz w:val="36"/>
           <w:szCs w:val="36"/>
         </w:rPr>
-        <w:t xml:space="preserve">Node.js + </w:t>
-      </w:r>
-      <w:proofErr w:type="spellStart"/>
-      <w:r>
-        <w:rPr>
-          <w:sz w:val="36"/>
-          <w:szCs w:val="36"/>
-        </w:rPr>
-        <w:t>MongoDB</w:t>
-      </w:r>
-      <w:proofErr w:type="spellEnd"/>
-      <w:r>
-        <w:rPr>
-          <w:sz w:val="36"/>
-          <w:szCs w:val="36"/>
-        </w:rPr>
-        <w:t xml:space="preserve"> (mais controle)</w:t>
+        <w:t>Node.js + MongoDB (mais controle)</w:t>
       </w:r>
     </w:p>
     <w:p>
@@ -11479,23 +10251,7 @@
           <w:sz w:val="36"/>
           <w:szCs w:val="36"/>
         </w:rPr>
-        <w:t xml:space="preserve">Login com </w:t>
-      </w:r>
-      <w:proofErr w:type="spellStart"/>
-      <w:r>
-        <w:rPr>
-          <w:sz w:val="36"/>
-          <w:szCs w:val="36"/>
-        </w:rPr>
-        <w:t>Email</w:t>
-      </w:r>
-      <w:proofErr w:type="spellEnd"/>
-      <w:r>
-        <w:rPr>
-          <w:sz w:val="36"/>
-          <w:szCs w:val="36"/>
-        </w:rPr>
-        <w:t>/Senha ou Google</w:t>
+        <w:t>Login com Email/Senha ou Google</w:t>
       </w:r>
     </w:p>
     <w:p>
@@ -11545,23 +10301,13 @@
         </w:rPr>
         <w:t xml:space="preserve"> </w:t>
       </w:r>
-      <w:proofErr w:type="spellStart"/>
       <w:r>
         <w:rPr>
           <w:rStyle w:val="font-semibold"/>
           <w:sz w:val="36"/>
           <w:szCs w:val="36"/>
         </w:rPr>
-        <w:t>Compliance</w:t>
-      </w:r>
-      <w:proofErr w:type="spellEnd"/>
-      <w:r>
-        <w:rPr>
-          <w:rStyle w:val="font-semibold"/>
-          <w:sz w:val="36"/>
-          <w:szCs w:val="36"/>
-        </w:rPr>
-        <w:t xml:space="preserve"> Legal</w:t>
+        <w:t>Compliance Legal</w:t>
       </w:r>
     </w:p>
     <w:p>
@@ -11581,23 +10327,7 @@
           <w:sz w:val="36"/>
           <w:szCs w:val="36"/>
         </w:rPr>
-        <w:t xml:space="preserve">Adicionar </w:t>
-      </w:r>
-      <w:proofErr w:type="spellStart"/>
-      <w:r>
-        <w:rPr>
-          <w:sz w:val="36"/>
-          <w:szCs w:val="36"/>
-        </w:rPr>
-        <w:t>disclaimer</w:t>
-      </w:r>
-      <w:proofErr w:type="spellEnd"/>
-      <w:r>
-        <w:rPr>
-          <w:sz w:val="36"/>
-          <w:szCs w:val="36"/>
-        </w:rPr>
-        <w:t xml:space="preserve"> jurídico</w:t>
+        <w:t>Adicionar disclaimer jurídico</w:t>
       </w:r>
     </w:p>
     <w:p>
@@ -11712,7 +10442,6 @@
         </w:rPr>
         <w:t xml:space="preserve">Integrar com plataforma como </w:t>
       </w:r>
-      <w:proofErr w:type="spellStart"/>
       <w:r>
         <w:rPr>
           <w:rStyle w:val="font-semibold"/>
@@ -11721,7 +10450,6 @@
         </w:rPr>
         <w:t>DocuSign</w:t>
       </w:r>
-      <w:proofErr w:type="spellEnd"/>
       <w:r>
         <w:rPr>
           <w:sz w:val="36"/>
@@ -11729,7 +10457,6 @@
         </w:rPr>
         <w:t xml:space="preserve"> ou </w:t>
       </w:r>
-      <w:proofErr w:type="spellStart"/>
       <w:r>
         <w:rPr>
           <w:rStyle w:val="font-semibold"/>
@@ -11738,7 +10465,6 @@
         </w:rPr>
         <w:t>Clicksign</w:t>
       </w:r>
-      <w:proofErr w:type="spellEnd"/>
     </w:p>
     <w:p>
       <w:pPr>
@@ -11849,21 +10575,12 @@
           <w:szCs w:val="36"/>
         </w:rPr>
       </w:pPr>
-      <w:proofErr w:type="spellStart"/>
-      <w:r>
-        <w:rPr>
-          <w:sz w:val="36"/>
-          <w:szCs w:val="36"/>
-        </w:rPr>
-        <w:t>Templates</w:t>
-      </w:r>
-      <w:proofErr w:type="spellEnd"/>
-      <w:r>
-        <w:rPr>
-          <w:sz w:val="36"/>
-          <w:szCs w:val="36"/>
-        </w:rPr>
-        <w:t xml:space="preserve"> salvos</w:t>
+      <w:r>
+        <w:rPr>
+          <w:sz w:val="36"/>
+          <w:szCs w:val="36"/>
+        </w:rPr>
+        <w:t>Templates salvos</w:t>
       </w:r>
     </w:p>
     <w:p>
@@ -11914,31 +10631,13 @@
           <w:szCs w:val="36"/>
         </w:rPr>
       </w:pPr>
-      <w:proofErr w:type="spellStart"/>
-      <w:r>
-        <w:rPr>
-          <w:sz w:val="36"/>
-          <w:szCs w:val="36"/>
-        </w:rPr>
-        <w:t>Dark</w:t>
-      </w:r>
-      <w:proofErr w:type="spellEnd"/>
-      <w:r>
-        <w:rPr>
-          <w:sz w:val="36"/>
-          <w:szCs w:val="36"/>
-        </w:rPr>
-        <w:t xml:space="preserve"> </w:t>
-      </w:r>
-      <w:proofErr w:type="spellStart"/>
-      <w:r>
-        <w:rPr>
-          <w:sz w:val="36"/>
-          <w:szCs w:val="36"/>
-        </w:rPr>
-        <w:t>mode</w:t>
-      </w:r>
-      <w:proofErr w:type="spellEnd"/>
+      <w:r>
+        <w:rPr>
+          <w:sz w:val="36"/>
+          <w:szCs w:val="36"/>
+        </w:rPr>
+        <w:t>Dark mode</w:t>
+      </w:r>
     </w:p>
     <w:p>
       <w:pPr>
@@ -11957,23 +10656,7 @@
           <w:sz w:val="36"/>
           <w:szCs w:val="36"/>
         </w:rPr>
-        <w:t>Mobile-</w:t>
-      </w:r>
-      <w:proofErr w:type="spellStart"/>
-      <w:r>
-        <w:rPr>
-          <w:sz w:val="36"/>
-          <w:szCs w:val="36"/>
-        </w:rPr>
-        <w:t>first</w:t>
-      </w:r>
-      <w:proofErr w:type="spellEnd"/>
-      <w:r>
-        <w:rPr>
-          <w:sz w:val="36"/>
-          <w:szCs w:val="36"/>
-        </w:rPr>
-        <w:t xml:space="preserve"> responsividade</w:t>
+        <w:t>Mobile-first responsividade</w:t>
       </w:r>
     </w:p>
     <w:p>
@@ -12133,23 +10816,7 @@
           <w:sz w:val="36"/>
           <w:szCs w:val="36"/>
         </w:rPr>
-        <w:t xml:space="preserve">API pública (para </w:t>
-      </w:r>
-      <w:proofErr w:type="spellStart"/>
-      <w:r>
-        <w:rPr>
-          <w:sz w:val="36"/>
-          <w:szCs w:val="36"/>
-        </w:rPr>
-        <w:t>white-label</w:t>
-      </w:r>
-      <w:proofErr w:type="spellEnd"/>
-      <w:r>
-        <w:rPr>
-          <w:sz w:val="36"/>
-          <w:szCs w:val="36"/>
-        </w:rPr>
-        <w:t>)</w:t>
+        <w:t>API pública (para white-label)</w:t>
       </w:r>
     </w:p>
     <w:p>
@@ -12291,7 +10958,6 @@
           <w:szCs w:val="36"/>
         </w:rPr>
       </w:pPr>
-      <w:proofErr w:type="spellStart"/>
       <w:r>
         <w:rPr>
           <w:sz w:val="36"/>
@@ -12299,7 +10965,6 @@
         </w:rPr>
         <w:t>Backend</w:t>
       </w:r>
-      <w:proofErr w:type="spellEnd"/>
     </w:p>
     <w:p>
       <w:pPr>
@@ -12338,17 +11003,8 @@
           <w:sz w:val="36"/>
           <w:szCs w:val="36"/>
         </w:rPr>
-        <w:t>Download/</w:t>
-      </w:r>
-      <w:proofErr w:type="spellStart"/>
-      <w:r>
-        <w:rPr>
-          <w:sz w:val="36"/>
-          <w:szCs w:val="36"/>
-        </w:rPr>
-        <w:t>export</w:t>
-      </w:r>
-      <w:proofErr w:type="spellEnd"/>
+        <w:t>Download/export</w:t>
+      </w:r>
     </w:p>
     <w:p>
       <w:pPr>
@@ -12382,21 +11038,12 @@
           <w:szCs w:val="36"/>
         </w:rPr>
       </w:pPr>
-      <w:proofErr w:type="spellStart"/>
-      <w:r>
-        <w:rPr>
-          <w:sz w:val="36"/>
-          <w:szCs w:val="36"/>
-        </w:rPr>
-        <w:t>Compliance</w:t>
-      </w:r>
-      <w:proofErr w:type="spellEnd"/>
-      <w:r>
-        <w:rPr>
-          <w:sz w:val="36"/>
-          <w:szCs w:val="36"/>
-        </w:rPr>
-        <w:t xml:space="preserve"> legal</w:t>
+      <w:r>
+        <w:rPr>
+          <w:sz w:val="36"/>
+          <w:szCs w:val="36"/>
+        </w:rPr>
+        <w:t>Compliance legal</w:t>
       </w:r>
     </w:p>
     <w:p>
@@ -12435,40 +11082,14 @@
           <w:sz w:val="36"/>
           <w:szCs w:val="36"/>
         </w:rPr>
-        <w:t xml:space="preserve">Adicionar </w:t>
-      </w:r>
-      <w:proofErr w:type="spellStart"/>
-      <w:r>
-        <w:rPr>
-          <w:rStyle w:val="font-semibold"/>
-          <w:sz w:val="36"/>
-          <w:szCs w:val="36"/>
-        </w:rPr>
-        <w:t>Backend</w:t>
-      </w:r>
-      <w:proofErr w:type="spellEnd"/>
-      <w:r>
-        <w:rPr>
-          <w:sz w:val="36"/>
-          <w:szCs w:val="36"/>
-        </w:rPr>
-        <w:t xml:space="preserve"> (</w:t>
-      </w:r>
-      <w:proofErr w:type="spellStart"/>
-      <w:r>
-        <w:rPr>
-          <w:sz w:val="36"/>
-          <w:szCs w:val="36"/>
-        </w:rPr>
-        <w:t>Firebase</w:t>
-      </w:r>
-      <w:proofErr w:type="spellEnd"/>
-      <w:r>
-        <w:rPr>
-          <w:sz w:val="36"/>
-          <w:szCs w:val="36"/>
-        </w:rPr>
-        <w:t xml:space="preserve"> é mais rápido)</w:t>
+        <w:t>Adicionar Backend</w:t>
+      </w:r>
+      <w:r>
+        <w:rPr>
+          <w:sz w:val="36"/>
+          <w:szCs w:val="36"/>
+        </w:rPr>
+        <w:t xml:space="preserve"> (Firebase é mais rápido)</w:t>
       </w:r>
     </w:p>
     <w:p>
@@ -12517,25 +11138,7 @@
           <w:sz w:val="36"/>
           <w:szCs w:val="36"/>
         </w:rPr>
-        <w:t xml:space="preserve">Adicionar </w:t>
-      </w:r>
-      <w:proofErr w:type="spellStart"/>
-      <w:r>
-        <w:rPr>
-          <w:rStyle w:val="font-semibold"/>
-          <w:sz w:val="36"/>
-          <w:szCs w:val="36"/>
-        </w:rPr>
-        <w:t>Disclaimer</w:t>
-      </w:r>
-      <w:proofErr w:type="spellEnd"/>
-      <w:r>
-        <w:rPr>
-          <w:rStyle w:val="font-semibold"/>
-          <w:sz w:val="36"/>
-          <w:szCs w:val="36"/>
-        </w:rPr>
-        <w:t xml:space="preserve"> jurídico</w:t>
+        <w:t>Adicionar Disclaimer jurídico</w:t>
       </w:r>
       <w:r>
         <w:rPr>
@@ -12591,91 +11194,61 @@
           <w:sz w:val="36"/>
           <w:szCs w:val="36"/>
         </w:rPr>
-        <w:t xml:space="preserve">Plano </w:t>
-      </w:r>
-      <w:proofErr w:type="spellStart"/>
+        <w:t>Plano Freemium</w:t>
+      </w:r>
+      <w:r>
+        <w:rPr>
+          <w:sz w:val="36"/>
+          <w:szCs w:val="36"/>
+        </w:rPr>
+        <w:t xml:space="preserve"> com limites (2 dias)</w:t>
+      </w:r>
+    </w:p>
+    <w:p>
+      <w:pPr>
+        <w:pStyle w:val="NormalWeb"/>
+        <w:rPr>
+          <w:sz w:val="36"/>
+          <w:szCs w:val="36"/>
+        </w:rPr>
+      </w:pPr>
       <w:r>
         <w:rPr>
           <w:rStyle w:val="font-semibold"/>
           <w:sz w:val="36"/>
           <w:szCs w:val="36"/>
         </w:rPr>
-        <w:t>Freemium</w:t>
-      </w:r>
-      <w:proofErr w:type="spellEnd"/>
-      <w:r>
-        <w:rPr>
-          <w:sz w:val="36"/>
-          <w:szCs w:val="36"/>
-        </w:rPr>
-        <w:t xml:space="preserve"> com limites (2 dias)</w:t>
-      </w:r>
-    </w:p>
-    <w:p>
-      <w:pPr>
-        <w:pStyle w:val="NormalWeb"/>
-        <w:rPr>
-          <w:sz w:val="36"/>
-          <w:szCs w:val="36"/>
-        </w:rPr>
-      </w:pPr>
-      <w:proofErr w:type="spellStart"/>
+        <w:t>Timeline realista:</w:t>
+      </w:r>
+      <w:r>
+        <w:rPr>
+          <w:sz w:val="36"/>
+          <w:szCs w:val="36"/>
+        </w:rPr>
+        <w:t xml:space="preserve"> </w:t>
+      </w:r>
       <w:r>
         <w:rPr>
           <w:rStyle w:val="font-semibold"/>
           <w:sz w:val="36"/>
           <w:szCs w:val="36"/>
         </w:rPr>
-        <w:t>Timeline</w:t>
-      </w:r>
-      <w:proofErr w:type="spellEnd"/>
+        <w:t>2-3 semanas</w:t>
+      </w:r>
+      <w:r>
+        <w:rPr>
+          <w:sz w:val="36"/>
+          <w:szCs w:val="36"/>
+        </w:rPr>
+        <w:t xml:space="preserve"> de desenvolvimento para ter um produto </w:t>
+      </w:r>
       <w:r>
         <w:rPr>
           <w:rStyle w:val="font-semibold"/>
           <w:sz w:val="36"/>
           <w:szCs w:val="36"/>
         </w:rPr>
-        <w:t xml:space="preserve"> realista:</w:t>
-      </w:r>
-      <w:r>
-        <w:rPr>
-          <w:sz w:val="36"/>
-          <w:szCs w:val="36"/>
-        </w:rPr>
-        <w:t xml:space="preserve"> </w:t>
-      </w:r>
-      <w:r>
-        <w:rPr>
-          <w:rStyle w:val="font-semibold"/>
-          <w:sz w:val="36"/>
-          <w:szCs w:val="36"/>
-        </w:rPr>
-        <w:t>2-3 semanas</w:t>
-      </w:r>
-      <w:r>
-        <w:rPr>
-          <w:sz w:val="36"/>
-          <w:szCs w:val="36"/>
-        </w:rPr>
-        <w:t xml:space="preserve"> de desenvolvimento para ter um produto </w:t>
-      </w:r>
-      <w:proofErr w:type="spellStart"/>
-      <w:r>
-        <w:rPr>
-          <w:rStyle w:val="font-semibold"/>
-          <w:sz w:val="36"/>
-          <w:szCs w:val="36"/>
-        </w:rPr>
-        <w:t>monetizável</w:t>
-      </w:r>
-      <w:proofErr w:type="spellEnd"/>
-      <w:r>
-        <w:rPr>
-          <w:rStyle w:val="font-semibold"/>
-          <w:sz w:val="36"/>
-          <w:szCs w:val="36"/>
-        </w:rPr>
-        <w:t xml:space="preserve"> e legal</w:t>
+        <w:t>monetizável e legal</w:t>
       </w:r>
       <w:r>
         <w:rPr>
@@ -12760,15 +11333,7 @@
         <w:pStyle w:val="Ttulo3"/>
       </w:pPr>
       <w:r>
-        <w:t>1. Hospedagem do App (</w:t>
-      </w:r>
-      <w:proofErr w:type="spellStart"/>
-      <w:r>
-        <w:t>Frontend</w:t>
-      </w:r>
-      <w:proofErr w:type="spellEnd"/>
-      <w:r>
-        <w:t>)</w:t>
+        <w:t>1. Hospedagem do App (Frontend)</w:t>
       </w:r>
     </w:p>
     <w:p>
@@ -12814,74 +11379,14 @@
       <w:r>
         <w:t xml:space="preserve"> Usando plataformas modernas como </w:t>
       </w:r>
-      <w:proofErr w:type="spellStart"/>
       <w:r>
         <w:rPr>
           <w:rStyle w:val="font-semibold"/>
         </w:rPr>
-        <w:t>Vercel</w:t>
-      </w:r>
-      <w:proofErr w:type="spellEnd"/>
-      <w:r>
-        <w:rPr>
-          <w:rStyle w:val="font-semibold"/>
-        </w:rPr>
-        <w:t xml:space="preserve">, </w:t>
-      </w:r>
-      <w:proofErr w:type="spellStart"/>
-      <w:r>
-        <w:rPr>
-          <w:rStyle w:val="font-semibold"/>
-        </w:rPr>
-        <w:t>Netlify</w:t>
-      </w:r>
-      <w:proofErr w:type="spellEnd"/>
-      <w:r>
-        <w:rPr>
-          <w:rStyle w:val="font-semibold"/>
-        </w:rPr>
-        <w:t xml:space="preserve"> ou </w:t>
-      </w:r>
-      <w:proofErr w:type="spellStart"/>
-      <w:r>
-        <w:rPr>
-          <w:rStyle w:val="font-semibold"/>
-        </w:rPr>
-        <w:t>Cloudflare</w:t>
-      </w:r>
-      <w:proofErr w:type="spellEnd"/>
-      <w:r>
-        <w:rPr>
-          <w:rStyle w:val="font-semibold"/>
-        </w:rPr>
-        <w:t xml:space="preserve"> </w:t>
-      </w:r>
-      <w:proofErr w:type="spellStart"/>
-      <w:r>
-        <w:rPr>
-          <w:rStyle w:val="font-semibold"/>
-        </w:rPr>
-        <w:t>Pages</w:t>
-      </w:r>
-      <w:proofErr w:type="spellEnd"/>
-      <w:r>
-        <w:t xml:space="preserve">. Elas hospedam aplicativos em </w:t>
-      </w:r>
-      <w:proofErr w:type="spellStart"/>
-      <w:r>
-        <w:t>JavaScript</w:t>
-      </w:r>
-      <w:proofErr w:type="spellEnd"/>
-      <w:r>
-        <w:t>/</w:t>
-      </w:r>
-      <w:proofErr w:type="spellStart"/>
-      <w:r>
-        <w:t>React</w:t>
-      </w:r>
-      <w:proofErr w:type="spellEnd"/>
-      <w:r>
-        <w:t xml:space="preserve"> de graça, com certificado de segurança (HTTPS) e são extremamente rápidas.</w:t>
+        <w:t>Vercel, Netlify ou Cloudflare Pages</w:t>
+      </w:r>
+      <w:r>
+        <w:t>. Elas hospedam aplicativos em JavaScript/React de graça, com certificado de segurança (HTTPS) e são extremamente rápidas.</w:t>
       </w:r>
     </w:p>
     <w:p>
@@ -12913,15 +11418,7 @@
         <w:pStyle w:val="Ttulo3"/>
       </w:pPr>
       <w:r>
-        <w:t xml:space="preserve">2. Banco de Dados, Login e </w:t>
-      </w:r>
-      <w:proofErr w:type="spellStart"/>
-      <w:r>
-        <w:t>Backend</w:t>
-      </w:r>
-      <w:proofErr w:type="spellEnd"/>
-      <w:r>
-        <w:t xml:space="preserve"> (A Nuvem)</w:t>
+        <w:t>2. Banco de Dados, Login e Backend (A Nuvem)</w:t>
       </w:r>
     </w:p>
     <w:p>
@@ -12968,35 +11465,23 @@
       <w:r>
         <w:t xml:space="preserve"> Usando o </w:t>
       </w:r>
-      <w:proofErr w:type="spellStart"/>
       <w:r>
         <w:rPr>
           <w:rStyle w:val="font-semibold"/>
         </w:rPr>
         <w:t>Firebase</w:t>
       </w:r>
-      <w:proofErr w:type="spellEnd"/>
       <w:r>
         <w:t xml:space="preserve"> (do Google) ou </w:t>
       </w:r>
-      <w:proofErr w:type="spellStart"/>
       <w:r>
         <w:rPr>
           <w:rStyle w:val="font-semibold"/>
         </w:rPr>
         <w:t>Supabase</w:t>
       </w:r>
-      <w:proofErr w:type="spellEnd"/>
-      <w:r>
-        <w:t xml:space="preserve">. O </w:t>
-      </w:r>
-      <w:proofErr w:type="spellStart"/>
-      <w:r>
-        <w:t>Firebase</w:t>
-      </w:r>
-      <w:proofErr w:type="spellEnd"/>
-      <w:r>
-        <w:t xml:space="preserve"> te dá de graça: até 50.000 logins por mês, 1 GB de banco de dados (cabe </w:t>
+      <w:r>
+        <w:t xml:space="preserve">. O Firebase te dá de graça: até 50.000 logins por mês, 1 GB de banco de dados (cabe </w:t>
       </w:r>
       <w:r>
         <w:rPr>
@@ -13006,15 +11491,7 @@
         <w:t>muito</w:t>
       </w:r>
       <w:r>
-        <w:t xml:space="preserve"> contrato em texto) e 5 GB para salvar os </w:t>
-      </w:r>
-      <w:proofErr w:type="spellStart"/>
-      <w:r>
-        <w:t>PDFs</w:t>
-      </w:r>
-      <w:proofErr w:type="spellEnd"/>
-      <w:r>
-        <w:t xml:space="preserve"> gerados.</w:t>
+        <w:t xml:space="preserve"> contrato em texto) e 5 GB para salvar os PDFs gerados.</w:t>
       </w:r>
     </w:p>
     <w:p>
@@ -13095,42 +11572,12 @@
       <w:r>
         <w:t xml:space="preserve"> Serviços como </w:t>
       </w:r>
-      <w:proofErr w:type="spellStart"/>
       <w:r>
         <w:rPr>
           <w:rStyle w:val="font-semibold"/>
         </w:rPr>
-        <w:t>Resend</w:t>
-      </w:r>
-      <w:proofErr w:type="spellEnd"/>
-      <w:r>
-        <w:rPr>
-          <w:rStyle w:val="font-semibold"/>
-        </w:rPr>
-        <w:t xml:space="preserve">, </w:t>
-      </w:r>
-      <w:proofErr w:type="spellStart"/>
-      <w:r>
-        <w:rPr>
-          <w:rStyle w:val="font-semibold"/>
-        </w:rPr>
-        <w:t>SendGrid</w:t>
-      </w:r>
-      <w:proofErr w:type="spellEnd"/>
-      <w:r>
-        <w:rPr>
-          <w:rStyle w:val="font-semibold"/>
-        </w:rPr>
-        <w:t xml:space="preserve"> ou </w:t>
-      </w:r>
-      <w:proofErr w:type="spellStart"/>
-      <w:r>
-        <w:rPr>
-          <w:rStyle w:val="font-semibold"/>
-        </w:rPr>
-        <w:t>MailerSend</w:t>
-      </w:r>
-      <w:proofErr w:type="spellEnd"/>
+        <w:t>Resend, SendGrid ou MailerSend</w:t>
+      </w:r>
       <w:r>
         <w:t xml:space="preserve"> permitem enviar entre 3.000 a 10.000 e-mails por mês totalmente de graça.</w:t>
       </w:r>
@@ -13182,15 +11629,7 @@
         <w:t>CEP:</w:t>
       </w:r>
       <w:r>
-        <w:t xml:space="preserve"> A API do </w:t>
-      </w:r>
-      <w:proofErr w:type="spellStart"/>
-      <w:r>
-        <w:t>ViaCEP</w:t>
-      </w:r>
-      <w:proofErr w:type="spellEnd"/>
-      <w:r>
-        <w:t xml:space="preserve"> é gratuita e ilimitada.</w:t>
+        <w:t xml:space="preserve"> A API do ViaCEP é gratuita e ilimitada.</w:t>
       </w:r>
     </w:p>
     <w:p>
@@ -13208,31 +11647,7 @@
         <w:t>CNPJ/CPF:</w:t>
       </w:r>
       <w:r>
-        <w:t xml:space="preserve"> A API da </w:t>
-      </w:r>
-      <w:proofErr w:type="spellStart"/>
-      <w:r>
-        <w:t>ReceitaWS</w:t>
-      </w:r>
-      <w:proofErr w:type="spellEnd"/>
-      <w:r>
-        <w:t xml:space="preserve"> ou </w:t>
-      </w:r>
-      <w:proofErr w:type="spellStart"/>
-      <w:r>
-        <w:t>BrasilAPI</w:t>
-      </w:r>
-      <w:proofErr w:type="spellEnd"/>
-      <w:r>
-        <w:t xml:space="preserve"> permite consultas gratuitas (</w:t>
-      </w:r>
-      <w:proofErr w:type="spellStart"/>
-      <w:r>
-        <w:t>ex</w:t>
-      </w:r>
-      <w:proofErr w:type="spellEnd"/>
-      <w:r>
-        <w:t>: 3 consultas por minuto). Para um app começando, é mais que suficiente.</w:t>
+        <w:t xml:space="preserve"> A API da ReceitaWS ou BrasilAPI permite consultas gratuitas (ex: 3 consultas por minuto). Para um app começando, é mais que suficiente.</w:t>
       </w:r>
     </w:p>
     <w:p>
@@ -13264,15 +11679,7 @@
         <w:pStyle w:val="Ttulo3"/>
       </w:pPr>
       <w:r>
-        <w:t xml:space="preserve">5. Domínio do Site (O seu </w:t>
-      </w:r>
-      <w:proofErr w:type="gramStart"/>
-      <w:r>
-        <w:t>endereço .</w:t>
-      </w:r>
-      <w:proofErr w:type="gramEnd"/>
-      <w:r>
-        <w:t>com.br)</w:t>
+        <w:t>5. Domínio do Site (O seu endereço .com.br)</w:t>
       </w:r>
     </w:p>
     <w:p>
@@ -13280,15 +11687,7 @@
         <w:pStyle w:val="NormalWeb"/>
       </w:pPr>
       <w:r>
-        <w:t>Esse não tem como fugir, você precisa de um nome profissional (</w:t>
-      </w:r>
-      <w:proofErr w:type="spellStart"/>
-      <w:r>
-        <w:t>ex</w:t>
-      </w:r>
-      <w:proofErr w:type="spellEnd"/>
-      <w:r>
-        <w:t xml:space="preserve">: </w:t>
+        <w:t xml:space="preserve">Esse não tem como fugir, você precisa de um nome profissional (ex: </w:t>
       </w:r>
       <w:r>
         <w:rPr>
@@ -13353,31 +11752,7 @@
         <w:pStyle w:val="NormalWeb"/>
       </w:pPr>
       <w:r>
-        <w:t>Aqui é onde o "bicho pega". Integrar assinatura digital via API (</w:t>
-      </w:r>
-      <w:proofErr w:type="spellStart"/>
-      <w:r>
-        <w:t>DocuSign</w:t>
-      </w:r>
-      <w:proofErr w:type="spellEnd"/>
-      <w:r>
-        <w:t xml:space="preserve">, </w:t>
-      </w:r>
-      <w:proofErr w:type="spellStart"/>
-      <w:r>
-        <w:t>ZapSign</w:t>
-      </w:r>
-      <w:proofErr w:type="spellEnd"/>
-      <w:r>
-        <w:t xml:space="preserve">, </w:t>
-      </w:r>
-      <w:proofErr w:type="spellStart"/>
-      <w:r>
-        <w:t>Clicksign</w:t>
-      </w:r>
-      <w:proofErr w:type="spellEnd"/>
-      <w:r>
-        <w:t xml:space="preserve">) </w:t>
+        <w:t xml:space="preserve">Aqui é onde o "bicho pega". Integrar assinatura digital via API (DocuSign, ZapSign, Clicksign) </w:t>
       </w:r>
       <w:r>
         <w:rPr>
@@ -13458,15 +11833,7 @@
         <w:t>Portal GOV.BR</w:t>
       </w:r>
       <w:r>
-        <w:t xml:space="preserve"> (o governo brasileiro tem um portal oficial, 100% gratuito, que assina </w:t>
-      </w:r>
-      <w:proofErr w:type="spellStart"/>
-      <w:r>
-        <w:t>PDFs</w:t>
-      </w:r>
-      <w:proofErr w:type="spellEnd"/>
-      <w:r>
-        <w:t xml:space="preserve"> com validade ICP-Brasil). Você pode até colocar um botão no seu app: </w:t>
+        <w:t xml:space="preserve"> (o governo brasileiro tem um portal oficial, 100% gratuito, que assina PDFs com validade ICP-Brasil). Você pode até colocar um botão no seu app: </w:t>
       </w:r>
       <w:r>
         <w:rPr>
@@ -13495,23 +11862,7 @@
         <w:t>Modo Premium (Quando você for cobrar):</w:t>
       </w:r>
       <w:r>
-        <w:t xml:space="preserve"> Se você cobrar R$ 29,90 por mês do usuário no plano Premium, você pode pagar um plano básico de API (</w:t>
-      </w:r>
-      <w:proofErr w:type="spellStart"/>
-      <w:r>
-        <w:t>ex</w:t>
-      </w:r>
-      <w:proofErr w:type="spellEnd"/>
-      <w:r>
-        <w:t xml:space="preserve">: </w:t>
-      </w:r>
-      <w:proofErr w:type="spellStart"/>
-      <w:r>
-        <w:t>ZapSign</w:t>
-      </w:r>
-      <w:proofErr w:type="spellEnd"/>
-      <w:r>
-        <w:t>) de R$ 100,00. Se 10 usuários pagarem o Premium, você arrecada R$ 300, paga a API e já tem lucro. Você repassa o custo da assinatura para o usuário que paga o app.</w:t>
+        <w:t xml:space="preserve"> Se você cobrar R$ 29,90 por mês do usuário no plano Premium, você pode pagar um plano básico de API (ex: ZapSign) de R$ 100,00. Se 10 usuários pagarem o Premium, você arrecada R$ 300, paga a API e já tem lucro. Você repassa o custo da assinatura para o usuário que paga o app.</w:t>
       </w:r>
     </w:p>
     <w:p>
@@ -13540,15 +11891,7 @@
         <w:pStyle w:val="NormalWeb"/>
       </w:pPr>
       <w:r>
-        <w:t xml:space="preserve">Para colocar o app no ar (Fases 1, 2 e 3 do nosso </w:t>
-      </w:r>
-      <w:proofErr w:type="spellStart"/>
-      <w:r>
-        <w:t>roadmap</w:t>
-      </w:r>
-      <w:proofErr w:type="spellEnd"/>
-      <w:r>
-        <w:t>), com login, salvando contratos e gerando PDF:</w:t>
+        <w:t>Para colocar o app no ar (Fases 1, 2 e 3 do nosso roadmap), com login, salvando contratos e gerando PDF:</w:t>
       </w:r>
     </w:p>
     <w:p>
@@ -13672,7 +12015,6 @@
     </w:p>
     <w:p>
       <w:pPr>
-        <w:pStyle w:val="PargrafodaLista"/>
         <w:rPr>
           <w:sz w:val="32"/>
           <w:szCs w:val="32"/>
@@ -13681,12 +12023,369 @@
     </w:p>
     <w:p>
       <w:pPr>
-        <w:pStyle w:val="PargrafodaLista"/>
-        <w:rPr>
-          <w:sz w:val="32"/>
-          <w:szCs w:val="32"/>
-        </w:rPr>
-      </w:pPr>
+        <w:rPr>
+          <w:rFonts w:ascii="Times New Roman" w:eastAsia="Times New Roman" w:hAnsi="Times New Roman" w:cs="Times New Roman"/>
+          <w:kern w:val="0"/>
+          <w:sz w:val="36"/>
+          <w:szCs w:val="36"/>
+          <w:lang w:eastAsia="pt-BR"/>
+          <w14:ligatures w14:val="none"/>
+        </w:rPr>
+      </w:pPr>
+      <w:r>
+        <w:rPr>
+          <w:sz w:val="56"/>
+          <w:szCs w:val="56"/>
+        </w:rPr>
+        <w:t>NOMES</w:t>
+      </w:r>
+      <w:r>
+        <w:rPr>
+          <w:sz w:val="36"/>
+          <w:szCs w:val="36"/>
+        </w:rPr>
+        <w:br/>
+      </w:r>
+      <w:r>
+        <w:rPr>
+          <w:sz w:val="36"/>
+          <w:szCs w:val="36"/>
+        </w:rPr>
+        <w:br/>
+      </w:r>
+      <w:r>
+        <w:rPr>
+          <w:rFonts w:ascii="Times New Roman" w:eastAsia="Times New Roman" w:hAnsi="Symbol" w:cs="Times New Roman"/>
+          <w:kern w:val="0"/>
+          <w:sz w:val="36"/>
+          <w:szCs w:val="36"/>
+          <w:lang w:eastAsia="pt-BR"/>
+          <w14:ligatures w14:val="none"/>
+        </w:rPr>
+        <w:t></w:t>
+      </w:r>
+      <w:r>
+        <w:rPr>
+          <w:rFonts w:ascii="Times New Roman" w:eastAsia="Times New Roman" w:hAnsi="Times New Roman" w:cs="Times New Roman"/>
+          <w:kern w:val="0"/>
+          <w:sz w:val="36"/>
+          <w:szCs w:val="36"/>
+          <w:lang w:eastAsia="pt-BR"/>
+          <w14:ligatures w14:val="none"/>
+        </w:rPr>
+        <w:t xml:space="preserve">  Contratei - Simples, memorável, sem concorrência </w:t>
+      </w:r>
+    </w:p>
+    <w:p>
+      <w:pPr>
+        <w:spacing w:after="0" w:line="240" w:lineRule="auto"/>
+        <w:rPr>
+          <w:rFonts w:ascii="Times New Roman" w:eastAsia="Times New Roman" w:hAnsi="Times New Roman" w:cs="Times New Roman"/>
+          <w:kern w:val="0"/>
+          <w:sz w:val="36"/>
+          <w:szCs w:val="36"/>
+          <w:lang w:eastAsia="pt-BR"/>
+          <w14:ligatures w14:val="none"/>
+        </w:rPr>
+      </w:pPr>
+      <w:r>
+        <w:rPr>
+          <w:rFonts w:ascii="Times New Roman" w:eastAsia="Times New Roman" w:hAnsi="Symbol" w:cs="Times New Roman"/>
+          <w:kern w:val="0"/>
+          <w:sz w:val="36"/>
+          <w:szCs w:val="36"/>
+          <w:lang w:eastAsia="pt-BR"/>
+          <w14:ligatures w14:val="none"/>
+        </w:rPr>
+        <w:t></w:t>
+      </w:r>
+      <w:r>
+        <w:rPr>
+          <w:rFonts w:ascii="Times New Roman" w:eastAsia="Times New Roman" w:hAnsi="Times New Roman" w:cs="Times New Roman"/>
+          <w:kern w:val="0"/>
+          <w:sz w:val="36"/>
+          <w:szCs w:val="36"/>
+          <w:lang w:eastAsia="pt-BR"/>
+          <w14:ligatures w14:val="none"/>
+        </w:rPr>
+        <w:t xml:space="preserve">  Docílio - Friendy, refere a "domicílio" (local do contrato) </w:t>
+      </w:r>
+    </w:p>
+    <w:p>
+      <w:pPr>
+        <w:spacing w:after="0" w:line="240" w:lineRule="auto"/>
+        <w:rPr>
+          <w:rFonts w:ascii="Times New Roman" w:eastAsia="Times New Roman" w:hAnsi="Times New Roman" w:cs="Times New Roman"/>
+          <w:kern w:val="0"/>
+          <w:sz w:val="36"/>
+          <w:szCs w:val="36"/>
+          <w:lang w:eastAsia="pt-BR"/>
+          <w14:ligatures w14:val="none"/>
+        </w:rPr>
+      </w:pPr>
+      <w:r>
+        <w:rPr>
+          <w:rFonts w:ascii="Times New Roman" w:eastAsia="Times New Roman" w:hAnsi="Symbol" w:cs="Times New Roman"/>
+          <w:kern w:val="0"/>
+          <w:sz w:val="36"/>
+          <w:szCs w:val="36"/>
+          <w:lang w:eastAsia="pt-BR"/>
+          <w14:ligatures w14:val="none"/>
+        </w:rPr>
+        <w:t></w:t>
+      </w:r>
+      <w:r>
+        <w:rPr>
+          <w:rFonts w:ascii="Times New Roman" w:eastAsia="Times New Roman" w:hAnsi="Times New Roman" w:cs="Times New Roman"/>
+          <w:kern w:val="0"/>
+          <w:sz w:val="36"/>
+          <w:szCs w:val="36"/>
+          <w:lang w:eastAsia="pt-BR"/>
+          <w14:ligatures w14:val="none"/>
+        </w:rPr>
+        <w:t xml:space="preserve">  Acordo Agora - Direto, ação imediata </w:t>
+      </w:r>
+    </w:p>
+    <w:p>
+      <w:pPr>
+        <w:spacing w:after="0" w:line="240" w:lineRule="auto"/>
+        <w:rPr>
+          <w:rFonts w:ascii="Times New Roman" w:eastAsia="Times New Roman" w:hAnsi="Times New Roman" w:cs="Times New Roman"/>
+          <w:kern w:val="0"/>
+          <w:sz w:val="36"/>
+          <w:szCs w:val="36"/>
+          <w:lang w:eastAsia="pt-BR"/>
+          <w14:ligatures w14:val="none"/>
+        </w:rPr>
+      </w:pPr>
+      <w:r>
+        <w:rPr>
+          <w:rFonts w:ascii="Times New Roman" w:eastAsia="Times New Roman" w:hAnsi="Symbol" w:cs="Times New Roman"/>
+          <w:kern w:val="0"/>
+          <w:sz w:val="36"/>
+          <w:szCs w:val="36"/>
+          <w:lang w:eastAsia="pt-BR"/>
+          <w14:ligatures w14:val="none"/>
+        </w:rPr>
+        <w:t></w:t>
+      </w:r>
+      <w:r>
+        <w:rPr>
+          <w:rFonts w:ascii="Times New Roman" w:eastAsia="Times New Roman" w:hAnsi="Times New Roman" w:cs="Times New Roman"/>
+          <w:kern w:val="0"/>
+          <w:sz w:val="36"/>
+          <w:szCs w:val="36"/>
+          <w:lang w:eastAsia="pt-BR"/>
+          <w14:ligatures w14:val="none"/>
+        </w:rPr>
+        <w:t xml:space="preserve">  Cláusula Fácil - Específico, diferenciado </w:t>
+      </w:r>
+    </w:p>
+    <w:p>
+      <w:pPr>
+        <w:spacing w:after="0" w:line="240" w:lineRule="auto"/>
+        <w:rPr>
+          <w:rFonts w:ascii="Times New Roman" w:eastAsia="Times New Roman" w:hAnsi="Times New Roman" w:cs="Times New Roman"/>
+          <w:kern w:val="0"/>
+          <w:sz w:val="36"/>
+          <w:szCs w:val="36"/>
+          <w:lang w:eastAsia="pt-BR"/>
+          <w14:ligatures w14:val="none"/>
+        </w:rPr>
+      </w:pPr>
+      <w:r>
+        <w:rPr>
+          <w:rFonts w:ascii="Times New Roman" w:eastAsia="Times New Roman" w:hAnsi="Symbol" w:cs="Times New Roman"/>
+          <w:kern w:val="0"/>
+          <w:sz w:val="36"/>
+          <w:szCs w:val="36"/>
+          <w:lang w:eastAsia="pt-BR"/>
+          <w14:ligatures w14:val="none"/>
+        </w:rPr>
+        <w:t></w:t>
+      </w:r>
+      <w:r>
+        <w:rPr>
+          <w:rFonts w:ascii="Times New Roman" w:eastAsia="Times New Roman" w:hAnsi="Times New Roman" w:cs="Times New Roman"/>
+          <w:kern w:val="0"/>
+          <w:sz w:val="36"/>
+          <w:szCs w:val="36"/>
+          <w:lang w:eastAsia="pt-BR"/>
+          <w14:ligatures w14:val="none"/>
+        </w:rPr>
+        <w:t xml:space="preserve">  ContratBox - Moderno, único </w:t>
+      </w:r>
+    </w:p>
+    <w:p>
+      <w:pPr>
+        <w:spacing w:after="0" w:line="240" w:lineRule="auto"/>
+        <w:rPr>
+          <w:rFonts w:ascii="Times New Roman" w:eastAsia="Times New Roman" w:hAnsi="Times New Roman" w:cs="Times New Roman"/>
+          <w:kern w:val="0"/>
+          <w:sz w:val="36"/>
+          <w:szCs w:val="36"/>
+          <w:lang w:eastAsia="pt-BR"/>
+          <w14:ligatures w14:val="none"/>
+        </w:rPr>
+      </w:pPr>
+      <w:r>
+        <w:rPr>
+          <w:rFonts w:ascii="Times New Roman" w:eastAsia="Times New Roman" w:hAnsi="Symbol" w:cs="Times New Roman"/>
+          <w:kern w:val="0"/>
+          <w:sz w:val="36"/>
+          <w:szCs w:val="36"/>
+          <w:lang w:eastAsia="pt-BR"/>
+          <w14:ligatures w14:val="none"/>
+        </w:rPr>
+        <w:t></w:t>
+      </w:r>
+      <w:r>
+        <w:rPr>
+          <w:rFonts w:ascii="Times New Roman" w:eastAsia="Times New Roman" w:hAnsi="Times New Roman" w:cs="Times New Roman"/>
+          <w:kern w:val="0"/>
+          <w:sz w:val="36"/>
+          <w:szCs w:val="36"/>
+          <w:lang w:eastAsia="pt-BR"/>
+          <w14:ligatures w14:val="none"/>
+        </w:rPr>
+        <w:t xml:space="preserve">  Pacto Rápido - Ação + simplicidade </w:t>
+      </w:r>
+    </w:p>
+    <w:p>
+      <w:pPr>
+        <w:spacing w:after="0" w:line="240" w:lineRule="auto"/>
+        <w:rPr>
+          <w:rFonts w:ascii="Times New Roman" w:eastAsia="Times New Roman" w:hAnsi="Times New Roman" w:cs="Times New Roman"/>
+          <w:kern w:val="0"/>
+          <w:sz w:val="36"/>
+          <w:szCs w:val="36"/>
+          <w:lang w:eastAsia="pt-BR"/>
+          <w14:ligatures w14:val="none"/>
+        </w:rPr>
+      </w:pPr>
+      <w:r>
+        <w:rPr>
+          <w:rFonts w:ascii="Times New Roman" w:eastAsia="Times New Roman" w:hAnsi="Symbol" w:cs="Times New Roman"/>
+          <w:kern w:val="0"/>
+          <w:sz w:val="36"/>
+          <w:szCs w:val="36"/>
+          <w:lang w:eastAsia="pt-BR"/>
+          <w14:ligatures w14:val="none"/>
+        </w:rPr>
+        <w:t></w:t>
+      </w:r>
+      <w:r>
+        <w:rPr>
+          <w:rFonts w:ascii="Times New Roman" w:eastAsia="Times New Roman" w:hAnsi="Times New Roman" w:cs="Times New Roman"/>
+          <w:kern w:val="0"/>
+          <w:sz w:val="36"/>
+          <w:szCs w:val="36"/>
+          <w:lang w:eastAsia="pt-BR"/>
+          <w14:ligatures w14:val="none"/>
+        </w:rPr>
+        <w:t xml:space="preserve">  DocFácil - Referencia a documento </w:t>
+      </w:r>
+    </w:p>
+    <w:p>
+      <w:pPr>
+        <w:spacing w:after="0" w:line="240" w:lineRule="auto"/>
+        <w:rPr>
+          <w:rFonts w:ascii="Times New Roman" w:eastAsia="Times New Roman" w:hAnsi="Times New Roman" w:cs="Times New Roman"/>
+          <w:kern w:val="0"/>
+          <w:sz w:val="36"/>
+          <w:szCs w:val="36"/>
+          <w:lang w:eastAsia="pt-BR"/>
+          <w14:ligatures w14:val="none"/>
+        </w:rPr>
+      </w:pPr>
+      <w:r>
+        <w:rPr>
+          <w:rFonts w:ascii="Times New Roman" w:eastAsia="Times New Roman" w:hAnsi="Symbol" w:cs="Times New Roman"/>
+          <w:kern w:val="0"/>
+          <w:sz w:val="36"/>
+          <w:szCs w:val="36"/>
+          <w:lang w:eastAsia="pt-BR"/>
+          <w14:ligatures w14:val="none"/>
+        </w:rPr>
+        <w:t></w:t>
+      </w:r>
+      <w:r>
+        <w:rPr>
+          <w:rFonts w:ascii="Times New Roman" w:eastAsia="Times New Roman" w:hAnsi="Times New Roman" w:cs="Times New Roman"/>
+          <w:kern w:val="0"/>
+          <w:sz w:val="36"/>
+          <w:szCs w:val="36"/>
+          <w:lang w:eastAsia="pt-BR"/>
+          <w14:ligatures w14:val="none"/>
+        </w:rPr>
+        <w:t xml:space="preserve">  ContratoAI - Moderno, mostra uso de IA </w:t>
+      </w:r>
+    </w:p>
+    <w:p>
+      <w:pPr>
+        <w:spacing w:after="0" w:line="240" w:lineRule="auto"/>
+        <w:rPr>
+          <w:rFonts w:ascii="Times New Roman" w:eastAsia="Times New Roman" w:hAnsi="Times New Roman" w:cs="Times New Roman"/>
+          <w:kern w:val="0"/>
+          <w:sz w:val="36"/>
+          <w:szCs w:val="36"/>
+          <w:lang w:eastAsia="pt-BR"/>
+          <w14:ligatures w14:val="none"/>
+        </w:rPr>
+      </w:pPr>
+      <w:r>
+        <w:rPr>
+          <w:rFonts w:ascii="Times New Roman" w:eastAsia="Times New Roman" w:hAnsi="Symbol" w:cs="Times New Roman"/>
+          <w:kern w:val="0"/>
+          <w:sz w:val="36"/>
+          <w:szCs w:val="36"/>
+          <w:lang w:eastAsia="pt-BR"/>
+          <w14:ligatures w14:val="none"/>
+        </w:rPr>
+        <w:lastRenderedPageBreak/>
+        <w:t></w:t>
+      </w:r>
+      <w:r>
+        <w:rPr>
+          <w:rFonts w:ascii="Times New Roman" w:eastAsia="Times New Roman" w:hAnsi="Times New Roman" w:cs="Times New Roman"/>
+          <w:kern w:val="0"/>
+          <w:sz w:val="36"/>
+          <w:szCs w:val="36"/>
+          <w:lang w:eastAsia="pt-BR"/>
+          <w14:ligatures w14:val="none"/>
+        </w:rPr>
+        <w:t xml:space="preserve">  AssinaAí - Refere ao ato de assinar </w:t>
+      </w:r>
+    </w:p>
+    <w:p>
+      <w:pPr>
+        <w:rPr>
+          <w:sz w:val="36"/>
+          <w:szCs w:val="36"/>
+        </w:rPr>
+      </w:pPr>
+      <w:r>
+        <w:rPr>
+          <w:rFonts w:ascii="Times New Roman" w:eastAsia="Times New Roman" w:hAnsi="Symbol" w:cs="Times New Roman"/>
+          <w:kern w:val="0"/>
+          <w:sz w:val="36"/>
+          <w:szCs w:val="36"/>
+          <w:lang w:eastAsia="pt-BR"/>
+          <w14:ligatures w14:val="none"/>
+        </w:rPr>
+        <w:t></w:t>
+      </w:r>
+      <w:r>
+        <w:rPr>
+          <w:rFonts w:ascii="Times New Roman" w:eastAsia="Times New Roman" w:hAnsi="Times New Roman" w:cs="Times New Roman"/>
+          <w:kern w:val="0"/>
+          <w:sz w:val="36"/>
+          <w:szCs w:val="36"/>
+          <w:lang w:eastAsia="pt-BR"/>
+          <w14:ligatures w14:val="none"/>
+        </w:rPr>
+        <w:t xml:space="preserve">  ContratosGO - Ágil, moderno</w:t>
+      </w:r>
     </w:p>
     <w:sectPr>
       <w:pgSz w:w="11906" w:h="16838"/>
@@ -13711,9 +12410,9 @@
       <w:lvlJc w:val="left"/>
       <w:pPr>
         <w:tabs>
-          <w:tab w:val="num" w:pos="643"/>
-        </w:tabs>
-        <w:ind w:left="643" w:hanging="360"/>
+          <w:tab w:val="num" w:pos="785"/>
+        </w:tabs>
+        <w:ind w:left="785" w:hanging="360"/>
       </w:pPr>
     </w:lvl>
     <w:lvl w:ilvl="1">
@@ -13723,9 +12422,9 @@
       <w:lvlJc w:val="left"/>
       <w:pPr>
         <w:tabs>
-          <w:tab w:val="num" w:pos="1363"/>
-        </w:tabs>
-        <w:ind w:left="1363" w:hanging="360"/>
+          <w:tab w:val="num" w:pos="1505"/>
+        </w:tabs>
+        <w:ind w:left="1505" w:hanging="360"/>
       </w:pPr>
       <w:rPr>
         <w:rFonts w:ascii="Courier New" w:hAnsi="Courier New" w:hint="default"/>
@@ -13739,9 +12438,9 @@
       <w:lvlJc w:val="left"/>
       <w:pPr>
         <w:tabs>
-          <w:tab w:val="num" w:pos="2083"/>
-        </w:tabs>
-        <w:ind w:left="2083" w:hanging="360"/>
+          <w:tab w:val="num" w:pos="2225"/>
+        </w:tabs>
+        <w:ind w:left="2225" w:hanging="360"/>
       </w:pPr>
       <w:rPr>
         <w:rFonts w:ascii="Wingdings" w:hAnsi="Wingdings" w:hint="default"/>
@@ -13755,9 +12454,9 @@
       <w:lvlJc w:val="left"/>
       <w:pPr>
         <w:tabs>
-          <w:tab w:val="num" w:pos="2803"/>
-        </w:tabs>
-        <w:ind w:left="2803" w:hanging="360"/>
+          <w:tab w:val="num" w:pos="2945"/>
+        </w:tabs>
+        <w:ind w:left="2945" w:hanging="360"/>
       </w:pPr>
     </w:lvl>
     <w:lvl w:ilvl="4" w:tentative="1">
@@ -13767,9 +12466,9 @@
       <w:lvlJc w:val="left"/>
       <w:pPr>
         <w:tabs>
-          <w:tab w:val="num" w:pos="3523"/>
-        </w:tabs>
-        <w:ind w:left="3523" w:hanging="360"/>
+          <w:tab w:val="num" w:pos="3665"/>
+        </w:tabs>
+        <w:ind w:left="3665" w:hanging="360"/>
       </w:pPr>
     </w:lvl>
     <w:lvl w:ilvl="5" w:tentative="1">
@@ -13779,9 +12478,9 @@
       <w:lvlJc w:val="left"/>
       <w:pPr>
         <w:tabs>
-          <w:tab w:val="num" w:pos="4243"/>
-        </w:tabs>
-        <w:ind w:left="4243" w:hanging="360"/>
+          <w:tab w:val="num" w:pos="4385"/>
+        </w:tabs>
+        <w:ind w:left="4385" w:hanging="360"/>
       </w:pPr>
     </w:lvl>
     <w:lvl w:ilvl="6" w:tentative="1">
@@ -13791,9 +12490,9 @@
       <w:lvlJc w:val="left"/>
       <w:pPr>
         <w:tabs>
-          <w:tab w:val="num" w:pos="4963"/>
-        </w:tabs>
-        <w:ind w:left="4963" w:hanging="360"/>
+          <w:tab w:val="num" w:pos="5105"/>
+        </w:tabs>
+        <w:ind w:left="5105" w:hanging="360"/>
       </w:pPr>
     </w:lvl>
     <w:lvl w:ilvl="7" w:tentative="1">
@@ -13803,9 +12502,9 @@
       <w:lvlJc w:val="left"/>
       <w:pPr>
         <w:tabs>
-          <w:tab w:val="num" w:pos="5683"/>
-        </w:tabs>
-        <w:ind w:left="5683" w:hanging="360"/>
+          <w:tab w:val="num" w:pos="5825"/>
+        </w:tabs>
+        <w:ind w:left="5825" w:hanging="360"/>
       </w:pPr>
     </w:lvl>
     <w:lvl w:ilvl="8" w:tentative="1">
@@ -13815,9 +12514,9 @@
       <w:lvlJc w:val="left"/>
       <w:pPr>
         <w:tabs>
-          <w:tab w:val="num" w:pos="6403"/>
-        </w:tabs>
-        <w:ind w:left="6403" w:hanging="360"/>
+          <w:tab w:val="num" w:pos="6545"/>
+        </w:tabs>
+        <w:ind w:left="6545" w:hanging="360"/>
       </w:pPr>
     </w:lvl>
   </w:abstractNum>

</xml_diff>